<commit_message>
Strengthen P5 report before-after evidence
</commit_message>
<xml_diff>
--- a/materials/p5-output/P5 Comprehensive MVP security analysis.docx
+++ b/materials/p5-output/P5 Comprehensive MVP security analysis.docx
@@ -1332,7 +1332,7 @@
           <w:i w:val="0"/>
           <w:sz w:val="28"/>
         </w:rPr>
-        <w:t>Фрагмент до исправления:</w:t>
+        <w:t>Фрагмент кода до исправления (P5-03):</w:t>
       </w:r>
     </w:p>
     <w:p>
@@ -1489,7 +1489,7 @@
           <w:i w:val="0"/>
           <w:sz w:val="28"/>
         </w:rPr>
-        <w:t>Фрагмент после исправления:</w:t>
+        <w:t>Фрагмент кода после исправления (P5-03):</w:t>
       </w:r>
     </w:p>
     <w:p>
@@ -4534,6 +4534,20 @@
     </w:p>
     <w:p>
       <w:pPr>
+        <w:spacing w:after="120" w:line="240" w:lineRule="auto"/>
+      </w:pPr>
+      <w:r>
+        <w:rPr>
+          <w:rFonts w:ascii="Times New Roman" w:hAnsi="Times New Roman" w:eastAsia="Times New Roman"/>
+          <w:b w:val="0"/>
+          <w:i w:val="0"/>
+          <w:sz w:val="28"/>
+        </w:rPr>
+        <w:t>Фрагмент кода до исправления (P5-01):</w:t>
+      </w:r>
+    </w:p>
+    <w:p>
+      <w:pPr>
         <w:spacing w:after="0"/>
         <w:ind w:left="283"/>
       </w:pPr>
@@ -4690,6 +4704,20 @@
     </w:p>
     <w:p>
       <w:pPr>
+        <w:spacing w:after="120" w:line="240" w:lineRule="auto"/>
+      </w:pPr>
+      <w:r>
+        <w:rPr>
+          <w:rFonts w:ascii="Times New Roman" w:hAnsi="Times New Roman" w:eastAsia="Times New Roman"/>
+          <w:b w:val="0"/>
+          <w:i w:val="0"/>
+          <w:sz w:val="28"/>
+        </w:rPr>
+        <w:t>Фрагмент кода после исправления (P5-01):</w:t>
+      </w:r>
+    </w:p>
+    <w:p>
+      <w:pPr>
         <w:spacing w:after="0"/>
         <w:ind w:left="283"/>
       </w:pPr>
@@ -5027,6 +5055,20 @@
     </w:p>
     <w:p>
       <w:pPr>
+        <w:spacing w:after="120" w:line="240" w:lineRule="auto"/>
+      </w:pPr>
+      <w:r>
+        <w:rPr>
+          <w:rFonts w:ascii="Times New Roman" w:hAnsi="Times New Roman" w:eastAsia="Times New Roman"/>
+          <w:b w:val="0"/>
+          <w:i w:val="0"/>
+          <w:sz w:val="28"/>
+        </w:rPr>
+        <w:t>Фрагмент кода до исправления (P5-02):</w:t>
+      </w:r>
+    </w:p>
+    <w:p>
+      <w:pPr>
         <w:spacing w:after="0"/>
         <w:ind w:left="283"/>
       </w:pPr>
@@ -5314,6 +5356,20 @@
     </w:p>
     <w:p>
       <w:pPr>
+        <w:spacing w:after="120" w:line="240" w:lineRule="auto"/>
+      </w:pPr>
+      <w:r>
+        <w:rPr>
+          <w:rFonts w:ascii="Times New Roman" w:hAnsi="Times New Roman" w:eastAsia="Times New Roman"/>
+          <w:b w:val="0"/>
+          <w:i w:val="0"/>
+          <w:sz w:val="28"/>
+        </w:rPr>
+        <w:t>Фрагмент кода после исправления (P5-02):</w:t>
+      </w:r>
+    </w:p>
+    <w:p>
+      <w:pPr>
         <w:spacing w:after="0"/>
         <w:ind w:left="283"/>
       </w:pPr>
@@ -5705,6 +5761,240 @@
     </w:p>
     <w:p>
       <w:pPr>
+        <w:spacing w:after="120" w:line="240" w:lineRule="auto"/>
+      </w:pPr>
+      <w:r>
+        <w:rPr>
+          <w:rFonts w:ascii="Times New Roman" w:hAnsi="Times New Roman" w:eastAsia="Times New Roman"/>
+          <w:b w:val="0"/>
+          <w:i w:val="0"/>
+          <w:sz w:val="28"/>
+        </w:rPr>
+        <w:t>Фрагмент кода до исправления (P5-04):</w:t>
+      </w:r>
+    </w:p>
+    <w:p>
+      <w:pPr>
+        <w:spacing w:after="0"/>
+        <w:ind w:left="283"/>
+      </w:pPr>
+      <w:r>
+        <w:rPr>
+          <w:rFonts w:ascii="Consolas" w:hAnsi="Consolas" w:eastAsia="Consolas"/>
+          <w:sz w:val="18"/>
+        </w:rPr>
+        <w:t># Задание 3 / Authentication risk: missing или inactive user возвращался без password verification.</w:t>
+      </w:r>
+    </w:p>
+    <w:p>
+      <w:pPr>
+        <w:spacing w:after="0"/>
+        <w:ind w:left="283"/>
+      </w:pPr>
+      <w:r>
+        <w:rPr>
+          <w:rFonts w:ascii="Consolas" w:hAnsi="Consolas" w:eastAsia="Consolas"/>
+          <w:sz w:val="18"/>
+        </w:rPr>
+        <w:t># Задание 4 / P5-04 / CWE-203 / CVSS 6.9 Medium.</w:t>
+      </w:r>
+    </w:p>
+    <w:p>
+      <w:pPr>
+        <w:spacing w:after="0"/>
+        <w:ind w:left="283"/>
+      </w:pPr>
+      <w:r>
+        <w:rPr>
+          <w:rFonts w:ascii="Consolas" w:hAnsi="Consolas" w:eastAsia="Consolas"/>
+          <w:sz w:val="18"/>
+        </w:rPr>
+        <w:t># Риск: ветки missing-user и real-user могли отличаться по времени выполнения.</w:t>
+      </w:r>
+    </w:p>
+    <w:p>
+      <w:pPr>
+        <w:spacing w:after="0"/>
+        <w:ind w:left="283"/>
+      </w:pPr>
+      <w:r>
+        <w:rPr>
+          <w:rFonts w:ascii="Consolas" w:hAnsi="Consolas" w:eastAsia="Consolas"/>
+          <w:sz w:val="18"/>
+        </w:rPr>
+        <w:t>def authenticate_user(session: Session, email: str, password: str) -&gt; User | None:</w:t>
+      </w:r>
+    </w:p>
+    <w:p>
+      <w:pPr>
+        <w:spacing w:after="0"/>
+        <w:ind w:left="283"/>
+      </w:pPr>
+      <w:r>
+        <w:rPr>
+          <w:rFonts w:ascii="Consolas" w:hAnsi="Consolas" w:eastAsia="Consolas"/>
+          <w:sz w:val="18"/>
+        </w:rPr>
+        <w:t xml:space="preserve">    # report table 7.2: authentication and login lockout</w:t>
+      </w:r>
+    </w:p>
+    <w:p>
+      <w:pPr>
+        <w:spacing w:after="0"/>
+        <w:ind w:left="283"/>
+      </w:pPr>
+      <w:r>
+        <w:rPr>
+          <w:rFonts w:ascii="Consolas" w:hAnsi="Consolas" w:eastAsia="Consolas"/>
+          <w:sz w:val="18"/>
+        </w:rPr>
+        <w:t xml:space="preserve">    # authentication: verify password and limit failed login attempts</w:t>
+      </w:r>
+    </w:p>
+    <w:p>
+      <w:pPr>
+        <w:spacing w:after="0"/>
+        <w:ind w:left="283"/>
+      </w:pPr>
+      <w:r>
+        <w:rPr>
+          <w:rFonts w:ascii="Consolas" w:hAnsi="Consolas" w:eastAsia="Consolas"/>
+          <w:sz w:val="18"/>
+        </w:rPr>
+        <w:t xml:space="preserve">    user = get_user_by_email(session, email)</w:t>
+      </w:r>
+    </w:p>
+    <w:p>
+      <w:pPr>
+        <w:spacing w:after="0"/>
+        <w:ind w:left="283"/>
+      </w:pPr>
+      <w:r>
+        <w:rPr>
+          <w:rFonts w:ascii="Consolas" w:hAnsi="Consolas" w:eastAsia="Consolas"/>
+          <w:sz w:val="18"/>
+        </w:rPr>
+        <w:t xml:space="preserve">    if user is None or not user.is_active:</w:t>
+      </w:r>
+    </w:p>
+    <w:p>
+      <w:pPr>
+        <w:spacing w:after="0"/>
+        <w:ind w:left="283"/>
+      </w:pPr>
+      <w:r>
+        <w:rPr>
+          <w:rFonts w:ascii="Consolas" w:hAnsi="Consolas" w:eastAsia="Consolas"/>
+          <w:sz w:val="18"/>
+        </w:rPr>
+        <w:t xml:space="preserve">        return None</w:t>
+      </w:r>
+    </w:p>
+    <w:p>
+      <w:pPr>
+        <w:spacing w:after="0"/>
+        <w:ind w:left="283"/>
+      </w:pPr>
+      <w:r>
+        <w:rPr>
+          <w:rFonts w:ascii="Consolas" w:hAnsi="Consolas" w:eastAsia="Consolas"/>
+          <w:sz w:val="18"/>
+        </w:rPr>
+      </w:r>
+    </w:p>
+    <w:p>
+      <w:pPr>
+        <w:spacing w:after="0"/>
+        <w:ind w:left="283"/>
+      </w:pPr>
+      <w:r>
+        <w:rPr>
+          <w:rFonts w:ascii="Consolas" w:hAnsi="Consolas" w:eastAsia="Consolas"/>
+          <w:sz w:val="18"/>
+        </w:rPr>
+        <w:t xml:space="preserve">    now = _utcnow()</w:t>
+      </w:r>
+    </w:p>
+    <w:p>
+      <w:pPr>
+        <w:spacing w:after="0"/>
+        <w:ind w:left="283"/>
+      </w:pPr>
+      <w:r>
+        <w:rPr>
+          <w:rFonts w:ascii="Consolas" w:hAnsi="Consolas" w:eastAsia="Consolas"/>
+          <w:sz w:val="18"/>
+        </w:rPr>
+        <w:t xml:space="preserve">    locked_until = _normalize_utc(user.locked_until)</w:t>
+      </w:r>
+    </w:p>
+    <w:p>
+      <w:pPr>
+        <w:spacing w:after="0"/>
+        <w:ind w:left="283"/>
+      </w:pPr>
+      <w:r>
+        <w:rPr>
+          <w:rFonts w:ascii="Consolas" w:hAnsi="Consolas" w:eastAsia="Consolas"/>
+          <w:sz w:val="18"/>
+        </w:rPr>
+        <w:t xml:space="preserve">    if locked_until is not None and locked_until &gt; now:</w:t>
+      </w:r>
+    </w:p>
+    <w:p>
+      <w:pPr>
+        <w:spacing w:after="0"/>
+        <w:ind w:left="283"/>
+      </w:pPr>
+      <w:r>
+        <w:rPr>
+          <w:rFonts w:ascii="Consolas" w:hAnsi="Consolas" w:eastAsia="Consolas"/>
+          <w:sz w:val="18"/>
+        </w:rPr>
+        <w:t xml:space="preserve">        return None</w:t>
+      </w:r>
+    </w:p>
+    <w:p>
+      <w:pPr>
+        <w:spacing w:after="0"/>
+        <w:ind w:left="283"/>
+      </w:pPr>
+      <w:r>
+        <w:rPr>
+          <w:rFonts w:ascii="Consolas" w:hAnsi="Consolas" w:eastAsia="Consolas"/>
+          <w:sz w:val="18"/>
+        </w:rPr>
+      </w:r>
+    </w:p>
+    <w:p>
+      <w:pPr>
+        <w:spacing w:after="0"/>
+        <w:ind w:left="283"/>
+      </w:pPr>
+      <w:r>
+        <w:rPr>
+          <w:rFonts w:ascii="Consolas" w:hAnsi="Consolas" w:eastAsia="Consolas"/>
+          <w:sz w:val="18"/>
+        </w:rPr>
+        <w:t xml:space="preserve">    is_valid, updated_hash = verify_password(password, user.password_hash)</w:t>
+      </w:r>
+    </w:p>
+    <w:p>
+      <w:pPr>
+        <w:spacing w:after="120" w:line="240" w:lineRule="auto"/>
+      </w:pPr>
+      <w:r>
+        <w:rPr>
+          <w:rFonts w:ascii="Times New Roman" w:hAnsi="Times New Roman" w:eastAsia="Times New Roman"/>
+          <w:b w:val="0"/>
+          <w:i w:val="0"/>
+          <w:sz w:val="28"/>
+        </w:rPr>
+        <w:t>Фрагмент кода после исправления (P5-04):</w:t>
+      </w:r>
+    </w:p>
+    <w:p>
+      <w:pPr>
         <w:spacing w:after="0"/>
         <w:ind w:left="283"/>
       </w:pPr>
@@ -5972,6 +6262,203 @@
           <w:sz w:val="28"/>
         </w:rPr>
         <w:t>P5-05. Production secret policy дополнена запретом DEBUG=true и placeholder bootstrap passwords.</w:t>
+      </w:r>
+    </w:p>
+    <w:p>
+      <w:pPr>
+        <w:spacing w:after="120" w:line="240" w:lineRule="auto"/>
+      </w:pPr>
+      <w:r>
+        <w:rPr>
+          <w:rFonts w:ascii="Times New Roman" w:hAnsi="Times New Roman" w:eastAsia="Times New Roman"/>
+          <w:b w:val="0"/>
+          <w:i w:val="0"/>
+          <w:sz w:val="28"/>
+        </w:rPr>
+        <w:t>Фрагмент кода до исправления (P5-05):</w:t>
+      </w:r>
+    </w:p>
+    <w:p>
+      <w:pPr>
+        <w:spacing w:after="0"/>
+        <w:ind w:left="283"/>
+      </w:pPr>
+      <w:r>
+        <w:rPr>
+          <w:rFonts w:ascii="Consolas" w:hAnsi="Consolas" w:eastAsia="Consolas"/>
+          <w:sz w:val="18"/>
+        </w:rPr>
+        <w:t># Задание 3 / Cryptography and secrets: проверялся SECRET_KEY, но не DEBUG и bootstrap passwords.</w:t>
+      </w:r>
+    </w:p>
+    <w:p>
+      <w:pPr>
+        <w:spacing w:after="0"/>
+        <w:ind w:left="283"/>
+      </w:pPr>
+      <w:r>
+        <w:rPr>
+          <w:rFonts w:ascii="Consolas" w:hAnsi="Consolas" w:eastAsia="Consolas"/>
+          <w:sz w:val="18"/>
+        </w:rPr>
+        <w:t># Задание 4 / P5-05 / CWE-798 / CVSS 9.2 Critical.</w:t>
+      </w:r>
+    </w:p>
+    <w:p>
+      <w:pPr>
+        <w:spacing w:after="0"/>
+        <w:ind w:left="283"/>
+      </w:pPr>
+      <w:r>
+        <w:rPr>
+          <w:rFonts w:ascii="Consolas" w:hAnsi="Consolas" w:eastAsia="Consolas"/>
+          <w:sz w:val="18"/>
+        </w:rPr>
+        <w:t># Риск: production мог стартовать с placeholder bootstrap credentials.</w:t>
+      </w:r>
+    </w:p>
+    <w:p>
+      <w:pPr>
+        <w:spacing w:after="0"/>
+        <w:ind w:left="283"/>
+      </w:pPr>
+      <w:r>
+        <w:rPr>
+          <w:rFonts w:ascii="Consolas" w:hAnsi="Consolas" w:eastAsia="Consolas"/>
+          <w:sz w:val="18"/>
+        </w:rPr>
+        <w:t xml:space="preserve">    @model_validator(mode="after")</w:t>
+      </w:r>
+    </w:p>
+    <w:p>
+      <w:pPr>
+        <w:spacing w:after="0"/>
+        <w:ind w:left="283"/>
+      </w:pPr>
+      <w:r>
+        <w:rPr>
+          <w:rFonts w:ascii="Consolas" w:hAnsi="Consolas" w:eastAsia="Consolas"/>
+          <w:sz w:val="18"/>
+        </w:rPr>
+        <w:t xml:space="preserve">    def validate_secrets(self) -&gt; Settings:</w:t>
+      </w:r>
+    </w:p>
+    <w:p>
+      <w:pPr>
+        <w:spacing w:after="0"/>
+        <w:ind w:left="283"/>
+      </w:pPr>
+      <w:r>
+        <w:rPr>
+          <w:rFonts w:ascii="Consolas" w:hAnsi="Consolas" w:eastAsia="Consolas"/>
+          <w:sz w:val="18"/>
+        </w:rPr>
+        <w:t xml:space="preserve">        placeholder_tokens = {"changeme", "replace-me", "set-me", "example", "placeholder"}</w:t>
+      </w:r>
+    </w:p>
+    <w:p>
+      <w:pPr>
+        <w:spacing w:after="0"/>
+        <w:ind w:left="283"/>
+      </w:pPr>
+      <w:r>
+        <w:rPr>
+          <w:rFonts w:ascii="Consolas" w:hAnsi="Consolas" w:eastAsia="Consolas"/>
+          <w:sz w:val="18"/>
+        </w:rPr>
+        <w:t xml:space="preserve">        lowered_secret = self.secret_key.lower()</w:t>
+      </w:r>
+    </w:p>
+    <w:p>
+      <w:pPr>
+        <w:spacing w:after="0"/>
+        <w:ind w:left="283"/>
+      </w:pPr>
+      <w:r>
+        <w:rPr>
+          <w:rFonts w:ascii="Consolas" w:hAnsi="Consolas" w:eastAsia="Consolas"/>
+          <w:sz w:val="18"/>
+        </w:rPr>
+        <w:t xml:space="preserve">        if any(token in lowered_secret for token in placeholder_tokens):</w:t>
+      </w:r>
+    </w:p>
+    <w:p>
+      <w:pPr>
+        <w:spacing w:after="0"/>
+        <w:ind w:left="283"/>
+      </w:pPr>
+      <w:r>
+        <w:rPr>
+          <w:rFonts w:ascii="Consolas" w:hAnsi="Consolas" w:eastAsia="Consolas"/>
+          <w:sz w:val="18"/>
+        </w:rPr>
+        <w:t xml:space="preserve">            msg = "SECRET_KEY must be set to a real environment value."</w:t>
+      </w:r>
+    </w:p>
+    <w:p>
+      <w:pPr>
+        <w:spacing w:after="0"/>
+        <w:ind w:left="283"/>
+      </w:pPr>
+      <w:r>
+        <w:rPr>
+          <w:rFonts w:ascii="Consolas" w:hAnsi="Consolas" w:eastAsia="Consolas"/>
+          <w:sz w:val="18"/>
+        </w:rPr>
+        <w:t xml:space="preserve">            if self.environment == "production":</w:t>
+      </w:r>
+    </w:p>
+    <w:p>
+      <w:pPr>
+        <w:spacing w:after="0"/>
+        <w:ind w:left="283"/>
+      </w:pPr>
+      <w:r>
+        <w:rPr>
+          <w:rFonts w:ascii="Consolas" w:hAnsi="Consolas" w:eastAsia="Consolas"/>
+          <w:sz w:val="18"/>
+        </w:rPr>
+        <w:t xml:space="preserve">                raise ValueError(msg)</w:t>
+      </w:r>
+    </w:p>
+    <w:p>
+      <w:pPr>
+        <w:spacing w:after="0"/>
+        <w:ind w:left="283"/>
+      </w:pPr>
+      <w:r>
+        <w:rPr>
+          <w:rFonts w:ascii="Consolas" w:hAnsi="Consolas" w:eastAsia="Consolas"/>
+          <w:sz w:val="18"/>
+        </w:rPr>
+        <w:t xml:space="preserve">            warnings.warn(msg, stacklevel=1)</w:t>
+      </w:r>
+    </w:p>
+    <w:p>
+      <w:pPr>
+        <w:spacing w:after="0"/>
+        <w:ind w:left="283"/>
+      </w:pPr>
+      <w:r>
+        <w:rPr>
+          <w:rFonts w:ascii="Consolas" w:hAnsi="Consolas" w:eastAsia="Consolas"/>
+          <w:sz w:val="18"/>
+        </w:rPr>
+        <w:t xml:space="preserve">        return self</w:t>
+      </w:r>
+    </w:p>
+    <w:p>
+      <w:pPr>
+        <w:spacing w:after="120" w:line="240" w:lineRule="auto"/>
+      </w:pPr>
+      <w:r>
+        <w:rPr>
+          <w:rFonts w:ascii="Times New Roman" w:hAnsi="Times New Roman" w:eastAsia="Times New Roman"/>
+          <w:b w:val="0"/>
+          <w:i w:val="0"/>
+          <w:sz w:val="28"/>
+        </w:rPr>
+        <w:t>Фрагмент кода после исправления (P5-05):</w:t>
       </w:r>
     </w:p>
     <w:p>

</xml_diff>

<commit_message>
Add P5 mermaid diagrams and improve frontend UX
</commit_message>
<xml_diff>
--- a/materials/p5-output/P5 Comprehensive MVP security analysis.docx
+++ b/materials/p5-output/P5 Comprehensive MVP security analysis.docx
@@ -125,7 +125,7 @@
           <w:i w:val="0"/>
           <w:sz w:val="28"/>
         </w:rPr>
-        <w:t>Инструкция для draw.io: структурная схема MVP.</w:t>
+        <w:t>Листинг 1. Mermaid-код структурной схемы MVP и trust boundaries.</w:t>
       </w:r>
     </w:p>
     <w:p>
@@ -139,13 +139,402 @@
           <w:i w:val="0"/>
           <w:sz w:val="28"/>
         </w:rPr>
-        <w:t>В этом месте отчета нужно вручную вставить структурную схему приложения. Ниже оставлена точная инструкция, чтобы схема соответствовала требованиям P5 и стилю отчета.</w:t>
+        <w:t>Код ниже может быть импортирован в draw.io через Insert -&gt; Advanced -&gt; Mermaid. Диаграмма показывает внешнюю недоверенную зону, границу доверия приложения и основные компоненты обработки данных.</w:t>
       </w:r>
     </w:p>
     <w:p>
       <w:pPr>
-        <w:pStyle w:val="ListBullet"/>
-        <w:spacing w:after="40"/>
+        <w:spacing w:after="0"/>
+        <w:ind w:left="283"/>
+      </w:pPr>
+      <w:r>
+        <w:rPr>
+          <w:rFonts w:ascii="Consolas" w:hAnsi="Consolas" w:eastAsia="Consolas"/>
+          <w:sz w:val="16"/>
+        </w:rPr>
+        <w:t>```mermaid</w:t>
+      </w:r>
+    </w:p>
+    <w:p>
+      <w:pPr>
+        <w:spacing w:after="0"/>
+        <w:ind w:left="283"/>
+      </w:pPr>
+      <w:r>
+        <w:rPr>
+          <w:rFonts w:ascii="Consolas" w:hAnsi="Consolas" w:eastAsia="Consolas"/>
+          <w:sz w:val="16"/>
+        </w:rPr>
+        <w:t>flowchart LR</w:t>
+      </w:r>
+    </w:p>
+    <w:p>
+      <w:pPr>
+        <w:spacing w:after="0"/>
+        <w:ind w:left="283"/>
+      </w:pPr>
+      <w:r>
+        <w:rPr>
+          <w:rFonts w:ascii="Consolas" w:hAnsi="Consolas" w:eastAsia="Consolas"/>
+          <w:sz w:val="16"/>
+        </w:rPr>
+        <w:t xml:space="preserve">    subgraph EXT["External / untrusted zone"]</w:t>
+      </w:r>
+    </w:p>
+    <w:p>
+      <w:pPr>
+        <w:spacing w:after="0"/>
+        <w:ind w:left="283"/>
+      </w:pPr>
+      <w:r>
+        <w:rPr>
+          <w:rFonts w:ascii="Consolas" w:hAnsi="Consolas" w:eastAsia="Consolas"/>
+          <w:sz w:val="16"/>
+        </w:rPr>
+        <w:t xml:space="preserve">        C["Browser / API client"]</w:t>
+      </w:r>
+    </w:p>
+    <w:p>
+      <w:pPr>
+        <w:spacing w:after="0"/>
+        <w:ind w:left="283"/>
+      </w:pPr>
+      <w:r>
+        <w:rPr>
+          <w:rFonts w:ascii="Consolas" w:hAnsi="Consolas" w:eastAsia="Consolas"/>
+          <w:sz w:val="16"/>
+        </w:rPr>
+        <w:t xml:space="preserve">        F["Static frontend /app"]</w:t>
+      </w:r>
+    </w:p>
+    <w:p>
+      <w:pPr>
+        <w:spacing w:after="0"/>
+        <w:ind w:left="283"/>
+      </w:pPr>
+      <w:r>
+        <w:rPr>
+          <w:rFonts w:ascii="Consolas" w:hAnsi="Consolas" w:eastAsia="Consolas"/>
+          <w:sz w:val="16"/>
+        </w:rPr>
+        <w:t xml:space="preserve">    end</w:t>
+      </w:r>
+    </w:p>
+    <w:p>
+      <w:pPr>
+        <w:spacing w:after="0"/>
+        <w:ind w:left="283"/>
+      </w:pPr>
+      <w:r>
+        <w:rPr>
+          <w:rFonts w:ascii="Consolas" w:hAnsi="Consolas" w:eastAsia="Consolas"/>
+          <w:sz w:val="16"/>
+        </w:rPr>
+        <w:t xml:space="preserve">    subgraph APP["Application trust boundary"]</w:t>
+      </w:r>
+    </w:p>
+    <w:p>
+      <w:pPr>
+        <w:spacing w:after="0"/>
+        <w:ind w:left="283"/>
+      </w:pPr>
+      <w:r>
+        <w:rPr>
+          <w:rFonts w:ascii="Consolas" w:hAnsi="Consolas" w:eastAsia="Consolas"/>
+          <w:sz w:val="16"/>
+        </w:rPr>
+        <w:t xml:space="preserve">        R["FastAPI routes"]</w:t>
+      </w:r>
+    </w:p>
+    <w:p>
+      <w:pPr>
+        <w:spacing w:after="0"/>
+        <w:ind w:left="283"/>
+      </w:pPr>
+      <w:r>
+        <w:rPr>
+          <w:rFonts w:ascii="Consolas" w:hAnsi="Consolas" w:eastAsia="Consolas"/>
+          <w:sz w:val="16"/>
+        </w:rPr>
+        <w:t xml:space="preserve">        D["Dependencies: current user and DB session"]</w:t>
+      </w:r>
+    </w:p>
+    <w:p>
+      <w:pPr>
+        <w:spacing w:after="0"/>
+        <w:ind w:left="283"/>
+      </w:pPr>
+      <w:r>
+        <w:rPr>
+          <w:rFonts w:ascii="Consolas" w:hAnsi="Consolas" w:eastAsia="Consolas"/>
+          <w:sz w:val="16"/>
+        </w:rPr>
+        <w:t xml:space="preserve">        V["Pydantic validation and bounded query params"]</w:t>
+      </w:r>
+    </w:p>
+    <w:p>
+      <w:pPr>
+        <w:spacing w:after="0"/>
+        <w:ind w:left="283"/>
+      </w:pPr>
+      <w:r>
+        <w:rPr>
+          <w:rFonts w:ascii="Consolas" w:hAnsi="Consolas" w:eastAsia="Consolas"/>
+          <w:sz w:val="16"/>
+        </w:rPr>
+        <w:t xml:space="preserve">        S["Services and business rules"]</w:t>
+      </w:r>
+    </w:p>
+    <w:p>
+      <w:pPr>
+        <w:spacing w:after="0"/>
+        <w:ind w:left="283"/>
+      </w:pPr>
+      <w:r>
+        <w:rPr>
+          <w:rFonts w:ascii="Consolas" w:hAnsi="Consolas" w:eastAsia="Consolas"/>
+          <w:sz w:val="16"/>
+        </w:rPr>
+        <w:t xml:space="preserve">        A["Authorization: role and object matrix"]</w:t>
+      </w:r>
+    </w:p>
+    <w:p>
+      <w:pPr>
+        <w:spacing w:after="0"/>
+        <w:ind w:left="283"/>
+      </w:pPr>
+      <w:r>
+        <w:rPr>
+          <w:rFonts w:ascii="Consolas" w:hAnsi="Consolas" w:eastAsia="Consolas"/>
+          <w:sz w:val="16"/>
+        </w:rPr>
+        <w:t xml:space="preserve">        L["Audit log helper"]</w:t>
+      </w:r>
+    </w:p>
+    <w:p>
+      <w:pPr>
+        <w:spacing w:after="0"/>
+        <w:ind w:left="283"/>
+      </w:pPr>
+      <w:r>
+        <w:rPr>
+          <w:rFonts w:ascii="Consolas" w:hAnsi="Consolas" w:eastAsia="Consolas"/>
+          <w:sz w:val="16"/>
+        </w:rPr>
+        <w:t xml:space="preserve">        O["SQLAlchemy ORM"]</w:t>
+      </w:r>
+    </w:p>
+    <w:p>
+      <w:pPr>
+        <w:spacing w:after="0"/>
+        <w:ind w:left="283"/>
+      </w:pPr>
+      <w:r>
+        <w:rPr>
+          <w:rFonts w:ascii="Consolas" w:hAnsi="Consolas" w:eastAsia="Consolas"/>
+          <w:sz w:val="16"/>
+        </w:rPr>
+        <w:t xml:space="preserve">        DB[("SQLite / production DB")]</w:t>
+      </w:r>
+    </w:p>
+    <w:p>
+      <w:pPr>
+        <w:spacing w:after="0"/>
+        <w:ind w:left="283"/>
+      </w:pPr>
+      <w:r>
+        <w:rPr>
+          <w:rFonts w:ascii="Consolas" w:hAnsi="Consolas" w:eastAsia="Consolas"/>
+          <w:sz w:val="16"/>
+        </w:rPr>
+        <w:t xml:space="preserve">        T[("Refresh token hash store")]</w:t>
+      </w:r>
+    </w:p>
+    <w:p>
+      <w:pPr>
+        <w:spacing w:after="0"/>
+        <w:ind w:left="283"/>
+      </w:pPr>
+      <w:r>
+        <w:rPr>
+          <w:rFonts w:ascii="Consolas" w:hAnsi="Consolas" w:eastAsia="Consolas"/>
+          <w:sz w:val="16"/>
+        </w:rPr>
+        <w:t xml:space="preserve">    end</w:t>
+      </w:r>
+    </w:p>
+    <w:p>
+      <w:pPr>
+        <w:spacing w:after="0"/>
+        <w:ind w:left="283"/>
+      </w:pPr>
+      <w:r>
+        <w:rPr>
+          <w:rFonts w:ascii="Consolas" w:hAnsi="Consolas" w:eastAsia="Consolas"/>
+          <w:sz w:val="16"/>
+        </w:rPr>
+        <w:t xml:space="preserve">    C --&gt;|"JSON, form data, query params, headers"| R</w:t>
+      </w:r>
+    </w:p>
+    <w:p>
+      <w:pPr>
+        <w:spacing w:after="0"/>
+        <w:ind w:left="283"/>
+      </w:pPr>
+      <w:r>
+        <w:rPr>
+          <w:rFonts w:ascii="Consolas" w:hAnsi="Consolas" w:eastAsia="Consolas"/>
+          <w:sz w:val="16"/>
+        </w:rPr>
+        <w:t xml:space="preserve">    F --&gt;|"same-origin fetch; textContent rendering"| R</w:t>
+      </w:r>
+    </w:p>
+    <w:p>
+      <w:pPr>
+        <w:spacing w:after="0"/>
+        <w:ind w:left="283"/>
+      </w:pPr>
+      <w:r>
+        <w:rPr>
+          <w:rFonts w:ascii="Consolas" w:hAnsi="Consolas" w:eastAsia="Consolas"/>
+          <w:sz w:val="16"/>
+        </w:rPr>
+        <w:t xml:space="preserve">    R --&gt; V</w:t>
+      </w:r>
+    </w:p>
+    <w:p>
+      <w:pPr>
+        <w:spacing w:after="0"/>
+        <w:ind w:left="283"/>
+      </w:pPr>
+      <w:r>
+        <w:rPr>
+          <w:rFonts w:ascii="Consolas" w:hAnsi="Consolas" w:eastAsia="Consolas"/>
+          <w:sz w:val="16"/>
+        </w:rPr>
+        <w:t xml:space="preserve">    R --&gt; D</w:t>
+      </w:r>
+    </w:p>
+    <w:p>
+      <w:pPr>
+        <w:spacing w:after="0"/>
+        <w:ind w:left="283"/>
+      </w:pPr>
+      <w:r>
+        <w:rPr>
+          <w:rFonts w:ascii="Consolas" w:hAnsi="Consolas" w:eastAsia="Consolas"/>
+          <w:sz w:val="16"/>
+        </w:rPr>
+        <w:t xml:space="preserve">    D --&gt; A</w:t>
+      </w:r>
+    </w:p>
+    <w:p>
+      <w:pPr>
+        <w:spacing w:after="0"/>
+        <w:ind w:left="283"/>
+      </w:pPr>
+      <w:r>
+        <w:rPr>
+          <w:rFonts w:ascii="Consolas" w:hAnsi="Consolas" w:eastAsia="Consolas"/>
+          <w:sz w:val="16"/>
+        </w:rPr>
+        <w:t xml:space="preserve">    V --&gt; S</w:t>
+      </w:r>
+    </w:p>
+    <w:p>
+      <w:pPr>
+        <w:spacing w:after="0"/>
+        <w:ind w:left="283"/>
+      </w:pPr>
+      <w:r>
+        <w:rPr>
+          <w:rFonts w:ascii="Consolas" w:hAnsi="Consolas" w:eastAsia="Consolas"/>
+          <w:sz w:val="16"/>
+        </w:rPr>
+        <w:t xml:space="preserve">    A --&gt; S</w:t>
+      </w:r>
+    </w:p>
+    <w:p>
+      <w:pPr>
+        <w:spacing w:after="0"/>
+        <w:ind w:left="283"/>
+      </w:pPr>
+      <w:r>
+        <w:rPr>
+          <w:rFonts w:ascii="Consolas" w:hAnsi="Consolas" w:eastAsia="Consolas"/>
+          <w:sz w:val="16"/>
+        </w:rPr>
+        <w:t xml:space="preserve">    S --&gt; O</w:t>
+      </w:r>
+    </w:p>
+    <w:p>
+      <w:pPr>
+        <w:spacing w:after="0"/>
+        <w:ind w:left="283"/>
+      </w:pPr>
+      <w:r>
+        <w:rPr>
+          <w:rFonts w:ascii="Consolas" w:hAnsi="Consolas" w:eastAsia="Consolas"/>
+          <w:sz w:val="16"/>
+        </w:rPr>
+        <w:t xml:space="preserve">    O --&gt; DB</w:t>
+      </w:r>
+    </w:p>
+    <w:p>
+      <w:pPr>
+        <w:spacing w:after="0"/>
+        <w:ind w:left="283"/>
+      </w:pPr>
+      <w:r>
+        <w:rPr>
+          <w:rFonts w:ascii="Consolas" w:hAnsi="Consolas" w:eastAsia="Consolas"/>
+          <w:sz w:val="16"/>
+        </w:rPr>
+        <w:t xml:space="preserve">    S --&gt; T</w:t>
+      </w:r>
+    </w:p>
+    <w:p>
+      <w:pPr>
+        <w:spacing w:after="0"/>
+        <w:ind w:left="283"/>
+      </w:pPr>
+      <w:r>
+        <w:rPr>
+          <w:rFonts w:ascii="Consolas" w:hAnsi="Consolas" w:eastAsia="Consolas"/>
+          <w:sz w:val="16"/>
+        </w:rPr>
+        <w:t xml:space="preserve">    S --&gt; L</w:t>
+      </w:r>
+    </w:p>
+    <w:p>
+      <w:pPr>
+        <w:spacing w:after="0"/>
+        <w:ind w:left="283"/>
+      </w:pPr>
+      <w:r>
+        <w:rPr>
+          <w:rFonts w:ascii="Consolas" w:hAnsi="Consolas" w:eastAsia="Consolas"/>
+          <w:sz w:val="16"/>
+        </w:rPr>
+        <w:t xml:space="preserve">    L --&gt; DB</w:t>
+      </w:r>
+    </w:p>
+    <w:p>
+      <w:pPr>
+        <w:spacing w:after="0"/>
+        <w:ind w:left="283"/>
+      </w:pPr>
+      <w:r>
+        <w:rPr>
+          <w:rFonts w:ascii="Consolas" w:hAnsi="Consolas" w:eastAsia="Consolas"/>
+          <w:sz w:val="16"/>
+        </w:rPr>
+        <w:t>```</w:t>
+      </w:r>
+    </w:p>
+    <w:p>
+      <w:pPr>
+        <w:spacing w:after="120" w:line="240" w:lineRule="auto"/>
       </w:pPr>
       <w:r>
         <w:rPr>
@@ -154,99 +543,934 @@
           <w:i w:val="0"/>
           <w:sz w:val="28"/>
         </w:rPr>
-        <w:t>Создать новый diagram в draw.io, ориентация Landscape. Заголовок сверху: P5 structural scheme: MVP runtime and trust boundaries.</w:t>
+        <w:t>Таблица потоков для данной диаграммы:</w:t>
       </w:r>
     </w:p>
-    <w:p>
-      <w:pPr>
-        <w:pStyle w:val="ListBullet"/>
-        <w:spacing w:after="40"/>
-      </w:pPr>
-      <w:r>
-        <w:rPr>
-          <w:rFonts w:ascii="Times New Roman" w:hAnsi="Times New Roman" w:eastAsia="Times New Roman"/>
-          <w:b w:val="0"/>
-          <w:i w:val="0"/>
-          <w:sz w:val="28"/>
-        </w:rPr>
-        <w:t>Нарисовать две вложенные рамки: внешняя External / untrusted zone, внутренняя Application trust boundary.</w:t>
-      </w:r>
-    </w:p>
-    <w:p>
-      <w:pPr>
-        <w:pStyle w:val="ListBullet"/>
-        <w:spacing w:after="40"/>
-      </w:pPr>
-      <w:r>
-        <w:rPr>
-          <w:rFonts w:ascii="Times New Roman" w:hAnsi="Times New Roman" w:eastAsia="Times New Roman"/>
-          <w:b w:val="0"/>
-          <w:i w:val="0"/>
-          <w:sz w:val="28"/>
-        </w:rPr>
-        <w:t>Слева разместить прямоугольник Browser / API client: JSON, form data, headers.</w:t>
-      </w:r>
-    </w:p>
-    <w:p>
-      <w:pPr>
-        <w:pStyle w:val="ListBullet"/>
-        <w:spacing w:after="40"/>
-      </w:pPr>
-      <w:r>
-        <w:rPr>
-          <w:rFonts w:ascii="Times New Roman" w:hAnsi="Times New Roman" w:eastAsia="Times New Roman"/>
-          <w:b w:val="0"/>
-          <w:i w:val="0"/>
-          <w:sz w:val="28"/>
-        </w:rPr>
-        <w:t>Внутри boundary разместить блоки FastAPI routes, Dependencies/current user/DB session, Services/business rules, Authorization role+object status matrix, SQLAlchemy ORM/DB tables/refresh hashes, Audit log JSON details/no secrets, Static frontend/textContent/API rendering.</w:t>
-      </w:r>
-    </w:p>
-    <w:p>
-      <w:pPr>
-        <w:pStyle w:val="ListBullet"/>
-        <w:spacing w:after="40"/>
-      </w:pPr>
-      <w:r>
-        <w:rPr>
-          <w:rFonts w:ascii="Times New Roman" w:hAnsi="Times New Roman" w:eastAsia="Times New Roman"/>
-          <w:b w:val="0"/>
-          <w:i w:val="0"/>
-          <w:sz w:val="28"/>
-        </w:rPr>
-        <w:t>Провести стрелки: Client -&gt; Routes, Client -&gt; Dependencies, Routes -&gt; Services, Dependencies -&gt; Authorization, Authorization -&gt; Services, Services -&gt; SQLAlchemy ORM, Authorization -&gt; Audit log, Frontend -&gt; Authorization.</w:t>
-      </w:r>
-    </w:p>
-    <w:p>
-      <w:pPr>
-        <w:pStyle w:val="ListBullet"/>
-        <w:spacing w:after="40"/>
-      </w:pPr>
-      <w:r>
-        <w:rPr>
-          <w:rFonts w:ascii="Times New Roman" w:hAnsi="Times New Roman" w:eastAsia="Times New Roman"/>
-          <w:b w:val="0"/>
-          <w:i w:val="0"/>
-          <w:sz w:val="28"/>
-        </w:rPr>
-        <w:t>Цвета: источники светло-синие, validation/dependencies светло-зеленые, business/authz светло-желтые, storage/audit светло-оранжевые, frontend светло-фиолетовый.</w:t>
-      </w:r>
-    </w:p>
-    <w:p>
-      <w:pPr>
-        <w:pStyle w:val="ListBullet"/>
-        <w:spacing w:after="40"/>
-      </w:pPr>
-      <w:r>
-        <w:rPr>
-          <w:rFonts w:ascii="Times New Roman" w:hAnsi="Times New Roman" w:eastAsia="Times New Roman"/>
-          <w:b w:val="0"/>
-          <w:i w:val="0"/>
-          <w:sz w:val="28"/>
-        </w:rPr>
-        <w:t>Экспортировать как PNG 1800x980 или SVG и вставить в отчет после этой инструкции как Рисунок 1.</w:t>
-      </w:r>
-    </w:p>
+    <w:tbl>
+      <w:tblPr>
+        <w:tblStyle w:val="TableGrid"/>
+        <w:tblW w:type="dxa" w:w="15363"/>
+        <w:tblLayout w:type="fixed"/>
+        <w:tblLook w:firstColumn="1" w:firstRow="1" w:lastColumn="0" w:lastRow="0" w:noHBand="0" w:noVBand="1" w:val="04A0"/>
+      </w:tblPr>
+      <w:tblGrid>
+        <w:gridCol w:w="1133"/>
+        <w:gridCol w:w="3004"/>
+        <w:gridCol w:w="3004"/>
+        <w:gridCol w:w="3798"/>
+        <w:gridCol w:w="4422"/>
+      </w:tblGrid>
+      <w:tr>
+        <w:tc>
+          <w:tcPr>
+            <w:tcW w:type="dxa" w:w="1133"/>
+            <w:vAlign w:val="center"/>
+            <w:tcMar>
+              <w:top w:w="90" w:type="dxa"/>
+              <w:start w:w="90" w:type="dxa"/>
+              <w:bottom w:w="90" w:type="dxa"/>
+              <w:end w:w="90" w:type="dxa"/>
+            </w:tcMar>
+          </w:tcPr>
+          <w:p>
+            <w:r>
+              <w:rPr>
+                <w:rFonts w:ascii="Times New Roman" w:hAnsi="Times New Roman" w:eastAsia="Times New Roman"/>
+                <w:b/>
+                <w:i w:val="0"/>
+                <w:sz w:val="16"/>
+              </w:rPr>
+              <w:t>Flow ID</w:t>
+            </w:r>
+          </w:p>
+        </w:tc>
+        <w:tc>
+          <w:tcPr>
+            <w:tcW w:type="dxa" w:w="3004"/>
+            <w:vAlign w:val="center"/>
+            <w:tcMar>
+              <w:top w:w="90" w:type="dxa"/>
+              <w:start w:w="90" w:type="dxa"/>
+              <w:bottom w:w="90" w:type="dxa"/>
+              <w:end w:w="90" w:type="dxa"/>
+            </w:tcMar>
+          </w:tcPr>
+          <w:p>
+            <w:r>
+              <w:rPr>
+                <w:rFonts w:ascii="Times New Roman" w:hAnsi="Times New Roman" w:eastAsia="Times New Roman"/>
+                <w:b/>
+                <w:i w:val="0"/>
+                <w:sz w:val="16"/>
+              </w:rPr>
+              <w:t>Source</w:t>
+            </w:r>
+          </w:p>
+        </w:tc>
+        <w:tc>
+          <w:tcPr>
+            <w:tcW w:type="dxa" w:w="3004"/>
+            <w:vAlign w:val="center"/>
+            <w:tcMar>
+              <w:top w:w="90" w:type="dxa"/>
+              <w:start w:w="90" w:type="dxa"/>
+              <w:bottom w:w="90" w:type="dxa"/>
+              <w:end w:w="90" w:type="dxa"/>
+            </w:tcMar>
+          </w:tcPr>
+          <w:p>
+            <w:r>
+              <w:rPr>
+                <w:rFonts w:ascii="Times New Roman" w:hAnsi="Times New Roman" w:eastAsia="Times New Roman"/>
+                <w:b/>
+                <w:i w:val="0"/>
+                <w:sz w:val="16"/>
+              </w:rPr>
+              <w:t>Target</w:t>
+            </w:r>
+          </w:p>
+        </w:tc>
+        <w:tc>
+          <w:tcPr>
+            <w:tcW w:type="dxa" w:w="3798"/>
+            <w:vAlign w:val="center"/>
+            <w:tcMar>
+              <w:top w:w="90" w:type="dxa"/>
+              <w:start w:w="90" w:type="dxa"/>
+              <w:bottom w:w="90" w:type="dxa"/>
+              <w:end w:w="90" w:type="dxa"/>
+            </w:tcMar>
+          </w:tcPr>
+          <w:p>
+            <w:r>
+              <w:rPr>
+                <w:rFonts w:ascii="Times New Roman" w:hAnsi="Times New Roman" w:eastAsia="Times New Roman"/>
+                <w:b/>
+                <w:i w:val="0"/>
+                <w:sz w:val="16"/>
+              </w:rPr>
+              <w:t>Data / Action</w:t>
+            </w:r>
+          </w:p>
+        </w:tc>
+        <w:tc>
+          <w:tcPr>
+            <w:tcW w:type="dxa" w:w="4422"/>
+            <w:vAlign w:val="center"/>
+            <w:tcMar>
+              <w:top w:w="90" w:type="dxa"/>
+              <w:start w:w="90" w:type="dxa"/>
+              <w:bottom w:w="90" w:type="dxa"/>
+              <w:end w:w="90" w:type="dxa"/>
+            </w:tcMar>
+          </w:tcPr>
+          <w:p>
+            <w:r>
+              <w:rPr>
+                <w:rFonts w:ascii="Times New Roman" w:hAnsi="Times New Roman" w:eastAsia="Times New Roman"/>
+                <w:b/>
+                <w:i w:val="0"/>
+                <w:sz w:val="16"/>
+              </w:rPr>
+              <w:t>Control / Protection</w:t>
+            </w:r>
+          </w:p>
+        </w:tc>
+      </w:tr>
+      <w:tr>
+        <w:tc>
+          <w:tcPr>
+            <w:tcW w:type="dxa" w:w="1133"/>
+            <w:vAlign w:val="center"/>
+            <w:tcMar>
+              <w:top w:w="90" w:type="dxa"/>
+              <w:start w:w="90" w:type="dxa"/>
+              <w:bottom w:w="90" w:type="dxa"/>
+              <w:end w:w="90" w:type="dxa"/>
+            </w:tcMar>
+          </w:tcPr>
+          <w:p>
+            <w:pPr>
+              <w:spacing w:after="0"/>
+            </w:pPr>
+            <w:r>
+              <w:rPr>
+                <w:rFonts w:ascii="Times New Roman" w:hAnsi="Times New Roman" w:eastAsia="Times New Roman"/>
+                <w:b w:val="0"/>
+                <w:i w:val="0"/>
+                <w:sz w:val="16"/>
+              </w:rPr>
+              <w:t>F1</w:t>
+            </w:r>
+          </w:p>
+        </w:tc>
+        <w:tc>
+          <w:tcPr>
+            <w:tcW w:type="dxa" w:w="3004"/>
+            <w:vAlign w:val="center"/>
+            <w:tcMar>
+              <w:top w:w="90" w:type="dxa"/>
+              <w:start w:w="90" w:type="dxa"/>
+              <w:bottom w:w="90" w:type="dxa"/>
+              <w:end w:w="90" w:type="dxa"/>
+            </w:tcMar>
+          </w:tcPr>
+          <w:p>
+            <w:pPr>
+              <w:spacing w:after="0"/>
+            </w:pPr>
+            <w:r>
+              <w:rPr>
+                <w:rFonts w:ascii="Times New Roman" w:hAnsi="Times New Roman" w:eastAsia="Times New Roman"/>
+                <w:b w:val="0"/>
+                <w:i w:val="0"/>
+                <w:sz w:val="16"/>
+              </w:rPr>
+              <w:t>Browser/API client</w:t>
+            </w:r>
+          </w:p>
+        </w:tc>
+        <w:tc>
+          <w:tcPr>
+            <w:tcW w:type="dxa" w:w="3004"/>
+            <w:vAlign w:val="center"/>
+            <w:tcMar>
+              <w:top w:w="90" w:type="dxa"/>
+              <w:start w:w="90" w:type="dxa"/>
+              <w:bottom w:w="90" w:type="dxa"/>
+              <w:end w:w="90" w:type="dxa"/>
+            </w:tcMar>
+          </w:tcPr>
+          <w:p>
+            <w:pPr>
+              <w:spacing w:after="0"/>
+            </w:pPr>
+            <w:r>
+              <w:rPr>
+                <w:rFonts w:ascii="Times New Roman" w:hAnsi="Times New Roman" w:eastAsia="Times New Roman"/>
+                <w:b w:val="0"/>
+                <w:i w:val="0"/>
+                <w:sz w:val="16"/>
+              </w:rPr>
+              <w:t>FastAPI routes</w:t>
+            </w:r>
+          </w:p>
+        </w:tc>
+        <w:tc>
+          <w:tcPr>
+            <w:tcW w:type="dxa" w:w="3798"/>
+            <w:vAlign w:val="center"/>
+            <w:tcMar>
+              <w:top w:w="90" w:type="dxa"/>
+              <w:start w:w="90" w:type="dxa"/>
+              <w:bottom w:w="90" w:type="dxa"/>
+              <w:end w:w="90" w:type="dxa"/>
+            </w:tcMar>
+          </w:tcPr>
+          <w:p>
+            <w:pPr>
+              <w:spacing w:after="0"/>
+            </w:pPr>
+            <w:r>
+              <w:rPr>
+                <w:rFonts w:ascii="Times New Roman" w:hAnsi="Times New Roman" w:eastAsia="Times New Roman"/>
+                <w:b w:val="0"/>
+                <w:i w:val="0"/>
+                <w:sz w:val="16"/>
+              </w:rPr>
+              <w:t>JSON, form data, query params, headers</w:t>
+            </w:r>
+          </w:p>
+        </w:tc>
+        <w:tc>
+          <w:tcPr>
+            <w:tcW w:type="dxa" w:w="4422"/>
+            <w:vAlign w:val="center"/>
+            <w:tcMar>
+              <w:top w:w="90" w:type="dxa"/>
+              <w:start w:w="90" w:type="dxa"/>
+              <w:bottom w:w="90" w:type="dxa"/>
+              <w:end w:w="90" w:type="dxa"/>
+            </w:tcMar>
+          </w:tcPr>
+          <w:p>
+            <w:pPr>
+              <w:spacing w:after="0"/>
+            </w:pPr>
+            <w:r>
+              <w:rPr>
+                <w:rFonts w:ascii="Times New Roman" w:hAnsi="Times New Roman" w:eastAsia="Times New Roman"/>
+                <w:b w:val="0"/>
+                <w:i w:val="0"/>
+                <w:sz w:val="16"/>
+              </w:rPr>
+              <w:t>Request size limit, Pydantic validation, neutral errors.</w:t>
+            </w:r>
+          </w:p>
+        </w:tc>
+      </w:tr>
+      <w:tr>
+        <w:tc>
+          <w:tcPr>
+            <w:tcW w:type="dxa" w:w="1133"/>
+            <w:vAlign w:val="center"/>
+            <w:tcMar>
+              <w:top w:w="90" w:type="dxa"/>
+              <w:start w:w="90" w:type="dxa"/>
+              <w:bottom w:w="90" w:type="dxa"/>
+              <w:end w:w="90" w:type="dxa"/>
+            </w:tcMar>
+          </w:tcPr>
+          <w:p>
+            <w:pPr>
+              <w:spacing w:after="0"/>
+            </w:pPr>
+            <w:r>
+              <w:rPr>
+                <w:rFonts w:ascii="Times New Roman" w:hAnsi="Times New Roman" w:eastAsia="Times New Roman"/>
+                <w:b w:val="0"/>
+                <w:i w:val="0"/>
+                <w:sz w:val="16"/>
+              </w:rPr>
+              <w:t>F2</w:t>
+            </w:r>
+          </w:p>
+        </w:tc>
+        <w:tc>
+          <w:tcPr>
+            <w:tcW w:type="dxa" w:w="3004"/>
+            <w:vAlign w:val="center"/>
+            <w:tcMar>
+              <w:top w:w="90" w:type="dxa"/>
+              <w:start w:w="90" w:type="dxa"/>
+              <w:bottom w:w="90" w:type="dxa"/>
+              <w:end w:w="90" w:type="dxa"/>
+            </w:tcMar>
+          </w:tcPr>
+          <w:p>
+            <w:pPr>
+              <w:spacing w:after="0"/>
+            </w:pPr>
+            <w:r>
+              <w:rPr>
+                <w:rFonts w:ascii="Times New Roman" w:hAnsi="Times New Roman" w:eastAsia="Times New Roman"/>
+                <w:b w:val="0"/>
+                <w:i w:val="0"/>
+                <w:sz w:val="16"/>
+              </w:rPr>
+              <w:t>Static frontend /app</w:t>
+            </w:r>
+          </w:p>
+        </w:tc>
+        <w:tc>
+          <w:tcPr>
+            <w:tcW w:type="dxa" w:w="3004"/>
+            <w:vAlign w:val="center"/>
+            <w:tcMar>
+              <w:top w:w="90" w:type="dxa"/>
+              <w:start w:w="90" w:type="dxa"/>
+              <w:bottom w:w="90" w:type="dxa"/>
+              <w:end w:w="90" w:type="dxa"/>
+            </w:tcMar>
+          </w:tcPr>
+          <w:p>
+            <w:pPr>
+              <w:spacing w:after="0"/>
+            </w:pPr>
+            <w:r>
+              <w:rPr>
+                <w:rFonts w:ascii="Times New Roman" w:hAnsi="Times New Roman" w:eastAsia="Times New Roman"/>
+                <w:b w:val="0"/>
+                <w:i w:val="0"/>
+                <w:sz w:val="16"/>
+              </w:rPr>
+              <w:t>FastAPI routes</w:t>
+            </w:r>
+          </w:p>
+        </w:tc>
+        <w:tc>
+          <w:tcPr>
+            <w:tcW w:type="dxa" w:w="3798"/>
+            <w:vAlign w:val="center"/>
+            <w:tcMar>
+              <w:top w:w="90" w:type="dxa"/>
+              <w:start w:w="90" w:type="dxa"/>
+              <w:bottom w:w="90" w:type="dxa"/>
+              <w:end w:w="90" w:type="dxa"/>
+            </w:tcMar>
+          </w:tcPr>
+          <w:p>
+            <w:pPr>
+              <w:spacing w:after="0"/>
+            </w:pPr>
+            <w:r>
+              <w:rPr>
+                <w:rFonts w:ascii="Times New Roman" w:hAnsi="Times New Roman" w:eastAsia="Times New Roman"/>
+                <w:b w:val="0"/>
+                <w:i w:val="0"/>
+                <w:sz w:val="16"/>
+              </w:rPr>
+              <w:t>same-origin API calls</w:t>
+            </w:r>
+          </w:p>
+        </w:tc>
+        <w:tc>
+          <w:tcPr>
+            <w:tcW w:type="dxa" w:w="4422"/>
+            <w:vAlign w:val="center"/>
+            <w:tcMar>
+              <w:top w:w="90" w:type="dxa"/>
+              <w:start w:w="90" w:type="dxa"/>
+              <w:bottom w:w="90" w:type="dxa"/>
+              <w:end w:w="90" w:type="dxa"/>
+            </w:tcMar>
+          </w:tcPr>
+          <w:p>
+            <w:pPr>
+              <w:spacing w:after="0"/>
+            </w:pPr>
+            <w:r>
+              <w:rPr>
+                <w:rFonts w:ascii="Times New Roman" w:hAnsi="Times New Roman" w:eastAsia="Times New Roman"/>
+                <w:b w:val="0"/>
+                <w:i w:val="0"/>
+                <w:sz w:val="16"/>
+              </w:rPr>
+              <w:t>No token persistence; API data rendered with textContent.</w:t>
+            </w:r>
+          </w:p>
+        </w:tc>
+      </w:tr>
+      <w:tr>
+        <w:tc>
+          <w:tcPr>
+            <w:tcW w:type="dxa" w:w="1133"/>
+            <w:vAlign w:val="center"/>
+            <w:tcMar>
+              <w:top w:w="90" w:type="dxa"/>
+              <w:start w:w="90" w:type="dxa"/>
+              <w:bottom w:w="90" w:type="dxa"/>
+              <w:end w:w="90" w:type="dxa"/>
+            </w:tcMar>
+          </w:tcPr>
+          <w:p>
+            <w:pPr>
+              <w:spacing w:after="0"/>
+            </w:pPr>
+            <w:r>
+              <w:rPr>
+                <w:rFonts w:ascii="Times New Roman" w:hAnsi="Times New Roman" w:eastAsia="Times New Roman"/>
+                <w:b w:val="0"/>
+                <w:i w:val="0"/>
+                <w:sz w:val="16"/>
+              </w:rPr>
+              <w:t>F3</w:t>
+            </w:r>
+          </w:p>
+        </w:tc>
+        <w:tc>
+          <w:tcPr>
+            <w:tcW w:type="dxa" w:w="3004"/>
+            <w:vAlign w:val="center"/>
+            <w:tcMar>
+              <w:top w:w="90" w:type="dxa"/>
+              <w:start w:w="90" w:type="dxa"/>
+              <w:bottom w:w="90" w:type="dxa"/>
+              <w:end w:w="90" w:type="dxa"/>
+            </w:tcMar>
+          </w:tcPr>
+          <w:p>
+            <w:pPr>
+              <w:spacing w:after="0"/>
+            </w:pPr>
+            <w:r>
+              <w:rPr>
+                <w:rFonts w:ascii="Times New Roman" w:hAnsi="Times New Roman" w:eastAsia="Times New Roman"/>
+                <w:b w:val="0"/>
+                <w:i w:val="0"/>
+                <w:sz w:val="16"/>
+              </w:rPr>
+              <w:t>FastAPI routes</w:t>
+            </w:r>
+          </w:p>
+        </w:tc>
+        <w:tc>
+          <w:tcPr>
+            <w:tcW w:type="dxa" w:w="3004"/>
+            <w:vAlign w:val="center"/>
+            <w:tcMar>
+              <w:top w:w="90" w:type="dxa"/>
+              <w:start w:w="90" w:type="dxa"/>
+              <w:bottom w:w="90" w:type="dxa"/>
+              <w:end w:w="90" w:type="dxa"/>
+            </w:tcMar>
+          </w:tcPr>
+          <w:p>
+            <w:pPr>
+              <w:spacing w:after="0"/>
+            </w:pPr>
+            <w:r>
+              <w:rPr>
+                <w:rFonts w:ascii="Times New Roman" w:hAnsi="Times New Roman" w:eastAsia="Times New Roman"/>
+                <w:b w:val="0"/>
+                <w:i w:val="0"/>
+                <w:sz w:val="16"/>
+              </w:rPr>
+              <w:t>Dependencies</w:t>
+            </w:r>
+          </w:p>
+        </w:tc>
+        <w:tc>
+          <w:tcPr>
+            <w:tcW w:type="dxa" w:w="3798"/>
+            <w:vAlign w:val="center"/>
+            <w:tcMar>
+              <w:top w:w="90" w:type="dxa"/>
+              <w:start w:w="90" w:type="dxa"/>
+              <w:bottom w:w="90" w:type="dxa"/>
+              <w:end w:w="90" w:type="dxa"/>
+            </w:tcMar>
+          </w:tcPr>
+          <w:p>
+            <w:pPr>
+              <w:spacing w:after="0"/>
+            </w:pPr>
+            <w:r>
+              <w:rPr>
+                <w:rFonts w:ascii="Times New Roman" w:hAnsi="Times New Roman" w:eastAsia="Times New Roman"/>
+                <w:b w:val="0"/>
+                <w:i w:val="0"/>
+                <w:sz w:val="16"/>
+              </w:rPr>
+              <w:t>Bearer token and DB session</w:t>
+            </w:r>
+          </w:p>
+        </w:tc>
+        <w:tc>
+          <w:tcPr>
+            <w:tcW w:type="dxa" w:w="4422"/>
+            <w:vAlign w:val="center"/>
+            <w:tcMar>
+              <w:top w:w="90" w:type="dxa"/>
+              <w:start w:w="90" w:type="dxa"/>
+              <w:bottom w:w="90" w:type="dxa"/>
+              <w:end w:w="90" w:type="dxa"/>
+            </w:tcMar>
+          </w:tcPr>
+          <w:p>
+            <w:pPr>
+              <w:spacing w:after="0"/>
+            </w:pPr>
+            <w:r>
+              <w:rPr>
+                <w:rFonts w:ascii="Times New Roman" w:hAnsi="Times New Roman" w:eastAsia="Times New Roman"/>
+                <w:b w:val="0"/>
+                <w:i w:val="0"/>
+                <w:sz w:val="16"/>
+              </w:rPr>
+              <w:t>JWT validation, active user check, session lifecycle in dependency.</w:t>
+            </w:r>
+          </w:p>
+        </w:tc>
+      </w:tr>
+      <w:tr>
+        <w:tc>
+          <w:tcPr>
+            <w:tcW w:type="dxa" w:w="1133"/>
+            <w:vAlign w:val="center"/>
+            <w:tcMar>
+              <w:top w:w="90" w:type="dxa"/>
+              <w:start w:w="90" w:type="dxa"/>
+              <w:bottom w:w="90" w:type="dxa"/>
+              <w:end w:w="90" w:type="dxa"/>
+            </w:tcMar>
+          </w:tcPr>
+          <w:p>
+            <w:pPr>
+              <w:spacing w:after="0"/>
+            </w:pPr>
+            <w:r>
+              <w:rPr>
+                <w:rFonts w:ascii="Times New Roman" w:hAnsi="Times New Roman" w:eastAsia="Times New Roman"/>
+                <w:b w:val="0"/>
+                <w:i w:val="0"/>
+                <w:sz w:val="16"/>
+              </w:rPr>
+              <w:t>F4</w:t>
+            </w:r>
+          </w:p>
+        </w:tc>
+        <w:tc>
+          <w:tcPr>
+            <w:tcW w:type="dxa" w:w="3004"/>
+            <w:vAlign w:val="center"/>
+            <w:tcMar>
+              <w:top w:w="90" w:type="dxa"/>
+              <w:start w:w="90" w:type="dxa"/>
+              <w:bottom w:w="90" w:type="dxa"/>
+              <w:end w:w="90" w:type="dxa"/>
+            </w:tcMar>
+          </w:tcPr>
+          <w:p>
+            <w:pPr>
+              <w:spacing w:after="0"/>
+            </w:pPr>
+            <w:r>
+              <w:rPr>
+                <w:rFonts w:ascii="Times New Roman" w:hAnsi="Times New Roman" w:eastAsia="Times New Roman"/>
+                <w:b w:val="0"/>
+                <w:i w:val="0"/>
+                <w:sz w:val="16"/>
+              </w:rPr>
+              <w:t>Dependencies</w:t>
+            </w:r>
+          </w:p>
+        </w:tc>
+        <w:tc>
+          <w:tcPr>
+            <w:tcW w:type="dxa" w:w="3004"/>
+            <w:vAlign w:val="center"/>
+            <w:tcMar>
+              <w:top w:w="90" w:type="dxa"/>
+              <w:start w:w="90" w:type="dxa"/>
+              <w:bottom w:w="90" w:type="dxa"/>
+              <w:end w:w="90" w:type="dxa"/>
+            </w:tcMar>
+          </w:tcPr>
+          <w:p>
+            <w:pPr>
+              <w:spacing w:after="0"/>
+            </w:pPr>
+            <w:r>
+              <w:rPr>
+                <w:rFonts w:ascii="Times New Roman" w:hAnsi="Times New Roman" w:eastAsia="Times New Roman"/>
+                <w:b w:val="0"/>
+                <w:i w:val="0"/>
+                <w:sz w:val="16"/>
+              </w:rPr>
+              <w:t>Authorization matrix</w:t>
+            </w:r>
+          </w:p>
+        </w:tc>
+        <w:tc>
+          <w:tcPr>
+            <w:tcW w:type="dxa" w:w="3798"/>
+            <w:vAlign w:val="center"/>
+            <w:tcMar>
+              <w:top w:w="90" w:type="dxa"/>
+              <w:start w:w="90" w:type="dxa"/>
+              <w:bottom w:w="90" w:type="dxa"/>
+              <w:end w:w="90" w:type="dxa"/>
+            </w:tcMar>
+          </w:tcPr>
+          <w:p>
+            <w:pPr>
+              <w:spacing w:after="0"/>
+            </w:pPr>
+            <w:r>
+              <w:rPr>
+                <w:rFonts w:ascii="Times New Roman" w:hAnsi="Times New Roman" w:eastAsia="Times New Roman"/>
+                <w:b w:val="0"/>
+                <w:i w:val="0"/>
+                <w:sz w:val="16"/>
+              </w:rPr>
+              <w:t>current user role and object relation</w:t>
+            </w:r>
+          </w:p>
+        </w:tc>
+        <w:tc>
+          <w:tcPr>
+            <w:tcW w:type="dxa" w:w="4422"/>
+            <w:vAlign w:val="center"/>
+            <w:tcMar>
+              <w:top w:w="90" w:type="dxa"/>
+              <w:start w:w="90" w:type="dxa"/>
+              <w:bottom w:w="90" w:type="dxa"/>
+              <w:end w:w="90" w:type="dxa"/>
+            </w:tcMar>
+          </w:tcPr>
+          <w:p>
+            <w:pPr>
+              <w:spacing w:after="0"/>
+            </w:pPr>
+            <w:r>
+              <w:rPr>
+                <w:rFonts w:ascii="Times New Roman" w:hAnsi="Times New Roman" w:eastAsia="Times New Roman"/>
+                <w:b w:val="0"/>
+                <w:i w:val="0"/>
+                <w:sz w:val="16"/>
+              </w:rPr>
+              <w:t>Role checks plus object-level status transition checks.</w:t>
+            </w:r>
+          </w:p>
+        </w:tc>
+      </w:tr>
+      <w:tr>
+        <w:tc>
+          <w:tcPr>
+            <w:tcW w:type="dxa" w:w="1133"/>
+            <w:vAlign w:val="center"/>
+            <w:tcMar>
+              <w:top w:w="90" w:type="dxa"/>
+              <w:start w:w="90" w:type="dxa"/>
+              <w:bottom w:w="90" w:type="dxa"/>
+              <w:end w:w="90" w:type="dxa"/>
+            </w:tcMar>
+          </w:tcPr>
+          <w:p>
+            <w:pPr>
+              <w:spacing w:after="0"/>
+            </w:pPr>
+            <w:r>
+              <w:rPr>
+                <w:rFonts w:ascii="Times New Roman" w:hAnsi="Times New Roman" w:eastAsia="Times New Roman"/>
+                <w:b w:val="0"/>
+                <w:i w:val="0"/>
+                <w:sz w:val="16"/>
+              </w:rPr>
+              <w:t>F5</w:t>
+            </w:r>
+          </w:p>
+        </w:tc>
+        <w:tc>
+          <w:tcPr>
+            <w:tcW w:type="dxa" w:w="3004"/>
+            <w:vAlign w:val="center"/>
+            <w:tcMar>
+              <w:top w:w="90" w:type="dxa"/>
+              <w:start w:w="90" w:type="dxa"/>
+              <w:bottom w:w="90" w:type="dxa"/>
+              <w:end w:w="90" w:type="dxa"/>
+            </w:tcMar>
+          </w:tcPr>
+          <w:p>
+            <w:pPr>
+              <w:spacing w:after="0"/>
+            </w:pPr>
+            <w:r>
+              <w:rPr>
+                <w:rFonts w:ascii="Times New Roman" w:hAnsi="Times New Roman" w:eastAsia="Times New Roman"/>
+                <w:b w:val="0"/>
+                <w:i w:val="0"/>
+                <w:sz w:val="16"/>
+              </w:rPr>
+              <w:t>Services</w:t>
+            </w:r>
+          </w:p>
+        </w:tc>
+        <w:tc>
+          <w:tcPr>
+            <w:tcW w:type="dxa" w:w="3004"/>
+            <w:vAlign w:val="center"/>
+            <w:tcMar>
+              <w:top w:w="90" w:type="dxa"/>
+              <w:start w:w="90" w:type="dxa"/>
+              <w:bottom w:w="90" w:type="dxa"/>
+              <w:end w:w="90" w:type="dxa"/>
+            </w:tcMar>
+          </w:tcPr>
+          <w:p>
+            <w:pPr>
+              <w:spacing w:after="0"/>
+            </w:pPr>
+            <w:r>
+              <w:rPr>
+                <w:rFonts w:ascii="Times New Roman" w:hAnsi="Times New Roman" w:eastAsia="Times New Roman"/>
+                <w:b w:val="0"/>
+                <w:i w:val="0"/>
+                <w:sz w:val="16"/>
+              </w:rPr>
+              <w:t>SQLAlchemy ORM / DB</w:t>
+            </w:r>
+          </w:p>
+        </w:tc>
+        <w:tc>
+          <w:tcPr>
+            <w:tcW w:type="dxa" w:w="3798"/>
+            <w:vAlign w:val="center"/>
+            <w:tcMar>
+              <w:top w:w="90" w:type="dxa"/>
+              <w:start w:w="90" w:type="dxa"/>
+              <w:bottom w:w="90" w:type="dxa"/>
+              <w:end w:w="90" w:type="dxa"/>
+            </w:tcMar>
+          </w:tcPr>
+          <w:p>
+            <w:pPr>
+              <w:spacing w:after="0"/>
+            </w:pPr>
+            <w:r>
+              <w:rPr>
+                <w:rFonts w:ascii="Times New Roman" w:hAnsi="Times New Roman" w:eastAsia="Times New Roman"/>
+                <w:b w:val="0"/>
+                <w:i w:val="0"/>
+                <w:sz w:val="16"/>
+              </w:rPr>
+              <w:t>validated business objects</w:t>
+            </w:r>
+          </w:p>
+        </w:tc>
+        <w:tc>
+          <w:tcPr>
+            <w:tcW w:type="dxa" w:w="4422"/>
+            <w:vAlign w:val="center"/>
+            <w:tcMar>
+              <w:top w:w="90" w:type="dxa"/>
+              <w:start w:w="90" w:type="dxa"/>
+              <w:bottom w:w="90" w:type="dxa"/>
+              <w:end w:w="90" w:type="dxa"/>
+            </w:tcMar>
+          </w:tcPr>
+          <w:p>
+            <w:pPr>
+              <w:spacing w:after="0"/>
+            </w:pPr>
+            <w:r>
+              <w:rPr>
+                <w:rFonts w:ascii="Times New Roman" w:hAnsi="Times New Roman" w:eastAsia="Times New Roman"/>
+                <w:b w:val="0"/>
+                <w:i w:val="0"/>
+                <w:sz w:val="16"/>
+              </w:rPr>
+              <w:t>Expression API, bounded pagination, no raw SQL string construction.</w:t>
+            </w:r>
+          </w:p>
+        </w:tc>
+      </w:tr>
+      <w:tr>
+        <w:tc>
+          <w:tcPr>
+            <w:tcW w:type="dxa" w:w="1133"/>
+            <w:vAlign w:val="center"/>
+            <w:tcMar>
+              <w:top w:w="90" w:type="dxa"/>
+              <w:start w:w="90" w:type="dxa"/>
+              <w:bottom w:w="90" w:type="dxa"/>
+              <w:end w:w="90" w:type="dxa"/>
+            </w:tcMar>
+          </w:tcPr>
+          <w:p>
+            <w:pPr>
+              <w:spacing w:after="0"/>
+            </w:pPr>
+            <w:r>
+              <w:rPr>
+                <w:rFonts w:ascii="Times New Roman" w:hAnsi="Times New Roman" w:eastAsia="Times New Roman"/>
+                <w:b w:val="0"/>
+                <w:i w:val="0"/>
+                <w:sz w:val="16"/>
+              </w:rPr>
+              <w:t>F6</w:t>
+            </w:r>
+          </w:p>
+        </w:tc>
+        <w:tc>
+          <w:tcPr>
+            <w:tcW w:type="dxa" w:w="3004"/>
+            <w:vAlign w:val="center"/>
+            <w:tcMar>
+              <w:top w:w="90" w:type="dxa"/>
+              <w:start w:w="90" w:type="dxa"/>
+              <w:bottom w:w="90" w:type="dxa"/>
+              <w:end w:w="90" w:type="dxa"/>
+            </w:tcMar>
+          </w:tcPr>
+          <w:p>
+            <w:pPr>
+              <w:spacing w:after="0"/>
+            </w:pPr>
+            <w:r>
+              <w:rPr>
+                <w:rFonts w:ascii="Times New Roman" w:hAnsi="Times New Roman" w:eastAsia="Times New Roman"/>
+                <w:b w:val="0"/>
+                <w:i w:val="0"/>
+                <w:sz w:val="16"/>
+              </w:rPr>
+              <w:t>Services</w:t>
+            </w:r>
+          </w:p>
+        </w:tc>
+        <w:tc>
+          <w:tcPr>
+            <w:tcW w:type="dxa" w:w="3004"/>
+            <w:vAlign w:val="center"/>
+            <w:tcMar>
+              <w:top w:w="90" w:type="dxa"/>
+              <w:start w:w="90" w:type="dxa"/>
+              <w:bottom w:w="90" w:type="dxa"/>
+              <w:end w:w="90" w:type="dxa"/>
+            </w:tcMar>
+          </w:tcPr>
+          <w:p>
+            <w:pPr>
+              <w:spacing w:after="0"/>
+            </w:pPr>
+            <w:r>
+              <w:rPr>
+                <w:rFonts w:ascii="Times New Roman" w:hAnsi="Times New Roman" w:eastAsia="Times New Roman"/>
+                <w:b w:val="0"/>
+                <w:i w:val="0"/>
+                <w:sz w:val="16"/>
+              </w:rPr>
+              <w:t>Audit log helper</w:t>
+            </w:r>
+          </w:p>
+        </w:tc>
+        <w:tc>
+          <w:tcPr>
+            <w:tcW w:type="dxa" w:w="3798"/>
+            <w:vAlign w:val="center"/>
+            <w:tcMar>
+              <w:top w:w="90" w:type="dxa"/>
+              <w:start w:w="90" w:type="dxa"/>
+              <w:bottom w:w="90" w:type="dxa"/>
+              <w:end w:w="90" w:type="dxa"/>
+            </w:tcMar>
+          </w:tcPr>
+          <w:p>
+            <w:pPr>
+              <w:spacing w:after="0"/>
+            </w:pPr>
+            <w:r>
+              <w:rPr>
+                <w:rFonts w:ascii="Times New Roman" w:hAnsi="Times New Roman" w:eastAsia="Times New Roman"/>
+                <w:b w:val="0"/>
+                <w:i w:val="0"/>
+                <w:sz w:val="16"/>
+              </w:rPr>
+              <w:t>structured event details</w:t>
+            </w:r>
+          </w:p>
+        </w:tc>
+        <w:tc>
+          <w:tcPr>
+            <w:tcW w:type="dxa" w:w="4422"/>
+            <w:vAlign w:val="center"/>
+            <w:tcMar>
+              <w:top w:w="90" w:type="dxa"/>
+              <w:start w:w="90" w:type="dxa"/>
+              <w:bottom w:w="90" w:type="dxa"/>
+              <w:end w:w="90" w:type="dxa"/>
+            </w:tcMar>
+          </w:tcPr>
+          <w:p>
+            <w:pPr>
+              <w:spacing w:after="0"/>
+            </w:pPr>
+            <w:r>
+              <w:rPr>
+                <w:rFonts w:ascii="Times New Roman" w:hAnsi="Times New Roman" w:eastAsia="Times New Roman"/>
+                <w:b w:val="0"/>
+                <w:i w:val="0"/>
+                <w:sz w:val="16"/>
+              </w:rPr>
+              <w:t>No password/token logging; controlled action names.</w:t>
+            </w:r>
+          </w:p>
+        </w:tc>
+      </w:tr>
+    </w:tbl>
+    <w:p/>
     <w:p>
       <w:pPr>
         <w:spacing w:before="200" w:after="120"/>
@@ -499,7 +1723,7 @@
                 <w:i w:val="0"/>
                 <w:sz w:val="18"/>
               </w:rPr>
-              <w:t>Схема trust boundaries, таблица sink и подтверждение защит в коде.</w:t>
+              <w:t>Mermaid-код trust boundaries, таблица потоков, таблица sink и подтверждение защит в коде.</w:t>
             </w:r>
           </w:p>
         </w:tc>
@@ -713,7 +1937,7 @@
                 <w:i w:val="0"/>
                 <w:sz w:val="18"/>
               </w:rPr>
-              <w:t>Все перечисленные элементы включены в отчет; вместо ручных скриншотов приложены воспроизводимые command logs.</w:t>
+              <w:t>Все перечисленные элементы включены в отчет; диаграммы представлены Mermaid-кодом для draw.io и таблицами потоков.</w:t>
             </w:r>
           </w:p>
         </w:tc>
@@ -1688,7 +2912,7 @@
           <w:i w:val="0"/>
           <w:sz w:val="28"/>
         </w:rPr>
-        <w:t>Инструкция для draw.io: trust boundaries и dangerous sinks.</w:t>
+        <w:t>Листинг 2. Mermaid-код source -&gt; propagation -&gt; sink -&gt; protection.</w:t>
       </w:r>
     </w:p>
     <w:p>
@@ -1702,13 +2926,532 @@
           <w:i w:val="0"/>
           <w:sz w:val="28"/>
         </w:rPr>
-        <w:t>Вместо автоматической картинки здесь оставлена инструкция для ручной схемы source -&gt; propagation -&gt; sink -&gt; protection.</w:t>
+        <w:t>Код предназначен для импорта в draw.io и фиксирует основные точки входа пользовательских данных, распространение внутри MVP, dangerous sinks и меры защиты.</w:t>
       </w:r>
     </w:p>
     <w:p>
       <w:pPr>
-        <w:pStyle w:val="ListBullet"/>
-        <w:spacing w:after="40"/>
+        <w:spacing w:after="0"/>
+        <w:ind w:left="283"/>
+      </w:pPr>
+      <w:r>
+        <w:rPr>
+          <w:rFonts w:ascii="Consolas" w:hAnsi="Consolas" w:eastAsia="Consolas"/>
+          <w:sz w:val="16"/>
+        </w:rPr>
+        <w:t>```mermaid</w:t>
+      </w:r>
+    </w:p>
+    <w:p>
+      <w:pPr>
+        <w:spacing w:after="0"/>
+        <w:ind w:left="283"/>
+      </w:pPr>
+      <w:r>
+        <w:rPr>
+          <w:rFonts w:ascii="Consolas" w:hAnsi="Consolas" w:eastAsia="Consolas"/>
+          <w:sz w:val="16"/>
+        </w:rPr>
+        <w:t>flowchart LR</w:t>
+      </w:r>
+    </w:p>
+    <w:p>
+      <w:pPr>
+        <w:spacing w:after="0"/>
+        <w:ind w:left="283"/>
+      </w:pPr>
+      <w:r>
+        <w:rPr>
+          <w:rFonts w:ascii="Consolas" w:hAnsi="Consolas" w:eastAsia="Consolas"/>
+          <w:sz w:val="16"/>
+        </w:rPr>
+        <w:t xml:space="preserve">    subgraph SRC["Sources"]</w:t>
+      </w:r>
+    </w:p>
+    <w:p>
+      <w:pPr>
+        <w:spacing w:after="0"/>
+        <w:ind w:left="283"/>
+      </w:pPr>
+      <w:r>
+        <w:rPr>
+          <w:rFonts w:ascii="Consolas" w:hAnsi="Consolas" w:eastAsia="Consolas"/>
+          <w:sz w:val="16"/>
+        </w:rPr>
+        <w:t xml:space="preserve">        S1["Login form: email/password"]</w:t>
+      </w:r>
+    </w:p>
+    <w:p>
+      <w:pPr>
+        <w:spacing w:after="0"/>
+        <w:ind w:left="283"/>
+      </w:pPr>
+      <w:r>
+        <w:rPr>
+          <w:rFonts w:ascii="Consolas" w:hAnsi="Consolas" w:eastAsia="Consolas"/>
+          <w:sz w:val="16"/>
+        </w:rPr>
+        <w:t xml:space="preserve">        S2["Bearer token"]</w:t>
+      </w:r>
+    </w:p>
+    <w:p>
+      <w:pPr>
+        <w:spacing w:after="0"/>
+        <w:ind w:left="283"/>
+      </w:pPr>
+      <w:r>
+        <w:rPr>
+          <w:rFonts w:ascii="Consolas" w:hAnsi="Consolas" w:eastAsia="Consolas"/>
+          <w:sz w:val="16"/>
+        </w:rPr>
+        <w:t xml:space="preserve">        S3["Path and query params"]</w:t>
+      </w:r>
+    </w:p>
+    <w:p>
+      <w:pPr>
+        <w:spacing w:after="0"/>
+        <w:ind w:left="283"/>
+      </w:pPr>
+      <w:r>
+        <w:rPr>
+          <w:rFonts w:ascii="Consolas" w:hAnsi="Consolas" w:eastAsia="Consolas"/>
+          <w:sz w:val="16"/>
+        </w:rPr>
+        <w:t xml:space="preserve">        S4["JSON request body"]</w:t>
+      </w:r>
+    </w:p>
+    <w:p>
+      <w:pPr>
+        <w:spacing w:after="0"/>
+        <w:ind w:left="283"/>
+      </w:pPr>
+      <w:r>
+        <w:rPr>
+          <w:rFonts w:ascii="Consolas" w:hAnsi="Consolas" w:eastAsia="Consolas"/>
+          <w:sz w:val="16"/>
+        </w:rPr>
+        <w:t xml:space="preserve">        S5["Report filters"]</w:t>
+      </w:r>
+    </w:p>
+    <w:p>
+      <w:pPr>
+        <w:spacing w:after="0"/>
+        <w:ind w:left="283"/>
+      </w:pPr>
+      <w:r>
+        <w:rPr>
+          <w:rFonts w:ascii="Consolas" w:hAnsi="Consolas" w:eastAsia="Consolas"/>
+          <w:sz w:val="16"/>
+        </w:rPr>
+        <w:t xml:space="preserve">    end</w:t>
+      </w:r>
+    </w:p>
+    <w:p>
+      <w:pPr>
+        <w:spacing w:after="0"/>
+        <w:ind w:left="283"/>
+      </w:pPr>
+      <w:r>
+        <w:rPr>
+          <w:rFonts w:ascii="Consolas" w:hAnsi="Consolas" w:eastAsia="Consolas"/>
+          <w:sz w:val="16"/>
+        </w:rPr>
+        <w:t xml:space="preserve">    subgraph PROP["Propagation"]</w:t>
+      </w:r>
+    </w:p>
+    <w:p>
+      <w:pPr>
+        <w:spacing w:after="0"/>
+        <w:ind w:left="283"/>
+      </w:pPr>
+      <w:r>
+        <w:rPr>
+          <w:rFonts w:ascii="Consolas" w:hAnsi="Consolas" w:eastAsia="Consolas"/>
+          <w:sz w:val="16"/>
+        </w:rPr>
+        <w:t xml:space="preserve">        P1["FastAPI routes"]</w:t>
+      </w:r>
+    </w:p>
+    <w:p>
+      <w:pPr>
+        <w:spacing w:after="0"/>
+        <w:ind w:left="283"/>
+      </w:pPr>
+      <w:r>
+        <w:rPr>
+          <w:rFonts w:ascii="Consolas" w:hAnsi="Consolas" w:eastAsia="Consolas"/>
+          <w:sz w:val="16"/>
+        </w:rPr>
+        <w:t xml:space="preserve">        P2["Pydantic schemas"]</w:t>
+      </w:r>
+    </w:p>
+    <w:p>
+      <w:pPr>
+        <w:spacing w:after="0"/>
+        <w:ind w:left="283"/>
+      </w:pPr>
+      <w:r>
+        <w:rPr>
+          <w:rFonts w:ascii="Consolas" w:hAnsi="Consolas" w:eastAsia="Consolas"/>
+          <w:sz w:val="16"/>
+        </w:rPr>
+        <w:t xml:space="preserve">        P3["Dependencies"]</w:t>
+      </w:r>
+    </w:p>
+    <w:p>
+      <w:pPr>
+        <w:spacing w:after="0"/>
+        <w:ind w:left="283"/>
+      </w:pPr>
+      <w:r>
+        <w:rPr>
+          <w:rFonts w:ascii="Consolas" w:hAnsi="Consolas" w:eastAsia="Consolas"/>
+          <w:sz w:val="16"/>
+        </w:rPr>
+        <w:t xml:space="preserve">        P4["Service layer"]</w:t>
+      </w:r>
+    </w:p>
+    <w:p>
+      <w:pPr>
+        <w:spacing w:after="0"/>
+        <w:ind w:left="283"/>
+      </w:pPr>
+      <w:r>
+        <w:rPr>
+          <w:rFonts w:ascii="Consolas" w:hAnsi="Consolas" w:eastAsia="Consolas"/>
+          <w:sz w:val="16"/>
+        </w:rPr>
+        <w:t xml:space="preserve">        P5["Authorization checks"]</w:t>
+      </w:r>
+    </w:p>
+    <w:p>
+      <w:pPr>
+        <w:spacing w:after="0"/>
+        <w:ind w:left="283"/>
+      </w:pPr>
+      <w:r>
+        <w:rPr>
+          <w:rFonts w:ascii="Consolas" w:hAnsi="Consolas" w:eastAsia="Consolas"/>
+          <w:sz w:val="16"/>
+        </w:rPr>
+        <w:t xml:space="preserve">    end</w:t>
+      </w:r>
+    </w:p>
+    <w:p>
+      <w:pPr>
+        <w:spacing w:after="0"/>
+        <w:ind w:left="283"/>
+      </w:pPr>
+      <w:r>
+        <w:rPr>
+          <w:rFonts w:ascii="Consolas" w:hAnsi="Consolas" w:eastAsia="Consolas"/>
+          <w:sz w:val="16"/>
+        </w:rPr>
+        <w:t xml:space="preserve">    subgraph SINK["Dangerous sinks"]</w:t>
+      </w:r>
+    </w:p>
+    <w:p>
+      <w:pPr>
+        <w:spacing w:after="0"/>
+        <w:ind w:left="283"/>
+      </w:pPr>
+      <w:r>
+        <w:rPr>
+          <w:rFonts w:ascii="Consolas" w:hAnsi="Consolas" w:eastAsia="Consolas"/>
+          <w:sz w:val="16"/>
+        </w:rPr>
+        <w:t xml:space="preserve">        K1["Password verification and token issuance"]</w:t>
+      </w:r>
+    </w:p>
+    <w:p>
+      <w:pPr>
+        <w:spacing w:after="0"/>
+        <w:ind w:left="283"/>
+      </w:pPr>
+      <w:r>
+        <w:rPr>
+          <w:rFonts w:ascii="Consolas" w:hAnsi="Consolas" w:eastAsia="Consolas"/>
+          <w:sz w:val="16"/>
+        </w:rPr>
+        <w:t xml:space="preserve">        K2["SQLAlchemy DB queries"]</w:t>
+      </w:r>
+    </w:p>
+    <w:p>
+      <w:pPr>
+        <w:spacing w:after="0"/>
+        <w:ind w:left="283"/>
+      </w:pPr>
+      <w:r>
+        <w:rPr>
+          <w:rFonts w:ascii="Consolas" w:hAnsi="Consolas" w:eastAsia="Consolas"/>
+          <w:sz w:val="16"/>
+        </w:rPr>
+        <w:t xml:space="preserve">        K3["Maintenance status update"]</w:t>
+      </w:r>
+    </w:p>
+    <w:p>
+      <w:pPr>
+        <w:spacing w:after="0"/>
+        <w:ind w:left="283"/>
+      </w:pPr>
+      <w:r>
+        <w:rPr>
+          <w:rFonts w:ascii="Consolas" w:hAnsi="Consolas" w:eastAsia="Consolas"/>
+          <w:sz w:val="16"/>
+        </w:rPr>
+        <w:t xml:space="preserve">        K4["Audit JSON details"]</w:t>
+      </w:r>
+    </w:p>
+    <w:p>
+      <w:pPr>
+        <w:spacing w:after="0"/>
+        <w:ind w:left="283"/>
+      </w:pPr>
+      <w:r>
+        <w:rPr>
+          <w:rFonts w:ascii="Consolas" w:hAnsi="Consolas" w:eastAsia="Consolas"/>
+          <w:sz w:val="16"/>
+        </w:rPr>
+        <w:t xml:space="preserve">        K5["Report JSON response"]</w:t>
+      </w:r>
+    </w:p>
+    <w:p>
+      <w:pPr>
+        <w:spacing w:after="0"/>
+        <w:ind w:left="283"/>
+      </w:pPr>
+      <w:r>
+        <w:rPr>
+          <w:rFonts w:ascii="Consolas" w:hAnsi="Consolas" w:eastAsia="Consolas"/>
+          <w:sz w:val="16"/>
+        </w:rPr>
+        <w:t xml:space="preserve">        K6["Frontend DOM"]</w:t>
+      </w:r>
+    </w:p>
+    <w:p>
+      <w:pPr>
+        <w:spacing w:after="0"/>
+        <w:ind w:left="283"/>
+      </w:pPr>
+      <w:r>
+        <w:rPr>
+          <w:rFonts w:ascii="Consolas" w:hAnsi="Consolas" w:eastAsia="Consolas"/>
+          <w:sz w:val="16"/>
+        </w:rPr>
+        <w:t xml:space="preserve">    end</w:t>
+      </w:r>
+    </w:p>
+    <w:p>
+      <w:pPr>
+        <w:spacing w:after="0"/>
+        <w:ind w:left="283"/>
+      </w:pPr>
+      <w:r>
+        <w:rPr>
+          <w:rFonts w:ascii="Consolas" w:hAnsi="Consolas" w:eastAsia="Consolas"/>
+          <w:sz w:val="16"/>
+        </w:rPr>
+        <w:t xml:space="preserve">    subgraph CTRL["Protections"]</w:t>
+      </w:r>
+    </w:p>
+    <w:p>
+      <w:pPr>
+        <w:spacing w:after="0"/>
+        <w:ind w:left="283"/>
+      </w:pPr>
+      <w:r>
+        <w:rPr>
+          <w:rFonts w:ascii="Consolas" w:hAnsi="Consolas" w:eastAsia="Consolas"/>
+          <w:sz w:val="16"/>
+        </w:rPr>
+        <w:t xml:space="preserve">        C1["Argon2 and dummy hash"]</w:t>
+      </w:r>
+    </w:p>
+    <w:p>
+      <w:pPr>
+        <w:spacing w:after="0"/>
+        <w:ind w:left="283"/>
+      </w:pPr>
+      <w:r>
+        <w:rPr>
+          <w:rFonts w:ascii="Consolas" w:hAnsi="Consolas" w:eastAsia="Consolas"/>
+          <w:sz w:val="16"/>
+        </w:rPr>
+        <w:t xml:space="preserve">        C2["ORM expressions and bounded pagination"]</w:t>
+      </w:r>
+    </w:p>
+    <w:p>
+      <w:pPr>
+        <w:spacing w:after="0"/>
+        <w:ind w:left="283"/>
+      </w:pPr>
+      <w:r>
+        <w:rPr>
+          <w:rFonts w:ascii="Consolas" w:hAnsi="Consolas" w:eastAsia="Consolas"/>
+          <w:sz w:val="16"/>
+        </w:rPr>
+        <w:t xml:space="preserve">        C3["Role plus object matrix"]</w:t>
+      </w:r>
+    </w:p>
+    <w:p>
+      <w:pPr>
+        <w:spacing w:after="0"/>
+        <w:ind w:left="283"/>
+      </w:pPr>
+      <w:r>
+        <w:rPr>
+          <w:rFonts w:ascii="Consolas" w:hAnsi="Consolas" w:eastAsia="Consolas"/>
+          <w:sz w:val="16"/>
+        </w:rPr>
+        <w:t xml:space="preserve">        C4["No secret logging"]</w:t>
+      </w:r>
+    </w:p>
+    <w:p>
+      <w:pPr>
+        <w:spacing w:after="0"/>
+        <w:ind w:left="283"/>
+      </w:pPr>
+      <w:r>
+        <w:rPr>
+          <w:rFonts w:ascii="Consolas" w:hAnsi="Consolas" w:eastAsia="Consolas"/>
+          <w:sz w:val="16"/>
+        </w:rPr>
+        <w:t xml:space="preserve">        C5["Pydantic response models"]</w:t>
+      </w:r>
+    </w:p>
+    <w:p>
+      <w:pPr>
+        <w:spacing w:after="0"/>
+        <w:ind w:left="283"/>
+      </w:pPr>
+      <w:r>
+        <w:rPr>
+          <w:rFonts w:ascii="Consolas" w:hAnsi="Consolas" w:eastAsia="Consolas"/>
+          <w:sz w:val="16"/>
+        </w:rPr>
+        <w:t xml:space="preserve">        C6["textContent rendering"]</w:t>
+      </w:r>
+    </w:p>
+    <w:p>
+      <w:pPr>
+        <w:spacing w:after="0"/>
+        <w:ind w:left="283"/>
+      </w:pPr>
+      <w:r>
+        <w:rPr>
+          <w:rFonts w:ascii="Consolas" w:hAnsi="Consolas" w:eastAsia="Consolas"/>
+          <w:sz w:val="16"/>
+        </w:rPr>
+        <w:t xml:space="preserve">    end</w:t>
+      </w:r>
+    </w:p>
+    <w:p>
+      <w:pPr>
+        <w:spacing w:after="0"/>
+        <w:ind w:left="283"/>
+      </w:pPr>
+      <w:r>
+        <w:rPr>
+          <w:rFonts w:ascii="Consolas" w:hAnsi="Consolas" w:eastAsia="Consolas"/>
+          <w:sz w:val="16"/>
+        </w:rPr>
+        <w:t xml:space="preserve">    S1 --&gt; P1 --&gt; K1 --&gt; C1</w:t>
+      </w:r>
+    </w:p>
+    <w:p>
+      <w:pPr>
+        <w:spacing w:after="0"/>
+        <w:ind w:left="283"/>
+      </w:pPr>
+      <w:r>
+        <w:rPr>
+          <w:rFonts w:ascii="Consolas" w:hAnsi="Consolas" w:eastAsia="Consolas"/>
+          <w:sz w:val="16"/>
+        </w:rPr>
+        <w:t xml:space="preserve">    S2 --&gt; P3 --&gt; P5 --&gt; K3 --&gt; C3</w:t>
+      </w:r>
+    </w:p>
+    <w:p>
+      <w:pPr>
+        <w:spacing w:after="0"/>
+        <w:ind w:left="283"/>
+      </w:pPr>
+      <w:r>
+        <w:rPr>
+          <w:rFonts w:ascii="Consolas" w:hAnsi="Consolas" w:eastAsia="Consolas"/>
+          <w:sz w:val="16"/>
+        </w:rPr>
+        <w:t xml:space="preserve">    S3 --&gt; P2 --&gt; P4 --&gt; K2 --&gt; C2</w:t>
+      </w:r>
+    </w:p>
+    <w:p>
+      <w:pPr>
+        <w:spacing w:after="0"/>
+        <w:ind w:left="283"/>
+      </w:pPr>
+      <w:r>
+        <w:rPr>
+          <w:rFonts w:ascii="Consolas" w:hAnsi="Consolas" w:eastAsia="Consolas"/>
+          <w:sz w:val="16"/>
+        </w:rPr>
+        <w:t xml:space="preserve">    S4 --&gt; P2 --&gt; P4 --&gt; K3</w:t>
+      </w:r>
+    </w:p>
+    <w:p>
+      <w:pPr>
+        <w:spacing w:after="0"/>
+        <w:ind w:left="283"/>
+      </w:pPr>
+      <w:r>
+        <w:rPr>
+          <w:rFonts w:ascii="Consolas" w:hAnsi="Consolas" w:eastAsia="Consolas"/>
+          <w:sz w:val="16"/>
+        </w:rPr>
+        <w:t xml:space="preserve">    S5 --&gt; P1 --&gt; P4 --&gt; K5 --&gt; C5</w:t>
+      </w:r>
+    </w:p>
+    <w:p>
+      <w:pPr>
+        <w:spacing w:after="0"/>
+        <w:ind w:left="283"/>
+      </w:pPr>
+      <w:r>
+        <w:rPr>
+          <w:rFonts w:ascii="Consolas" w:hAnsi="Consolas" w:eastAsia="Consolas"/>
+          <w:sz w:val="16"/>
+        </w:rPr>
+        <w:t xml:space="preserve">    K4 --&gt; C4</w:t>
+      </w:r>
+    </w:p>
+    <w:p>
+      <w:pPr>
+        <w:spacing w:after="0"/>
+        <w:ind w:left="283"/>
+      </w:pPr>
+      <w:r>
+        <w:rPr>
+          <w:rFonts w:ascii="Consolas" w:hAnsi="Consolas" w:eastAsia="Consolas"/>
+          <w:sz w:val="16"/>
+        </w:rPr>
+        <w:t xml:space="preserve">    K5 --&gt; K6 --&gt; C6</w:t>
+      </w:r>
+    </w:p>
+    <w:p>
+      <w:pPr>
+        <w:spacing w:after="0"/>
+        <w:ind w:left="283"/>
+      </w:pPr>
+      <w:r>
+        <w:rPr>
+          <w:rFonts w:ascii="Consolas" w:hAnsi="Consolas" w:eastAsia="Consolas"/>
+          <w:sz w:val="16"/>
+        </w:rPr>
+        <w:t>```</w:t>
+      </w:r>
+    </w:p>
+    <w:p>
+      <w:pPr>
+        <w:spacing w:after="120" w:line="240" w:lineRule="auto"/>
       </w:pPr>
       <w:r>
         <w:rPr>
@@ -1717,99 +3460,934 @@
           <w:i w:val="0"/>
           <w:sz w:val="28"/>
         </w:rPr>
-        <w:t>Создать 4 вертикальные колонки: Sources, Propagation, Sinks, Protections.</w:t>
+        <w:t>Таблица потоков для данной диаграммы:</w:t>
       </w:r>
     </w:p>
-    <w:p>
-      <w:pPr>
-        <w:pStyle w:val="ListBullet"/>
-        <w:spacing w:after="40"/>
-      </w:pPr>
-      <w:r>
-        <w:rPr>
-          <w:rFonts w:ascii="Times New Roman" w:hAnsi="Times New Roman" w:eastAsia="Times New Roman"/>
-          <w:b w:val="0"/>
-          <w:i w:val="0"/>
-          <w:sz w:val="28"/>
-        </w:rPr>
-        <w:t>В колонке Sources указать: Login form, Path/query params, JSON request body, Bearer token, Headers.</w:t>
-      </w:r>
-    </w:p>
-    <w:p>
-      <w:pPr>
-        <w:pStyle w:val="ListBullet"/>
-        <w:spacing w:after="40"/>
-      </w:pPr>
-      <w:r>
-        <w:rPr>
-          <w:rFonts w:ascii="Times New Roman" w:hAnsi="Times New Roman" w:eastAsia="Times New Roman"/>
-          <w:b w:val="0"/>
-          <w:i w:val="0"/>
-          <w:sz w:val="28"/>
-        </w:rPr>
-        <w:t>В колонке Propagation указать: Pydantic validation, FastAPI dependencies, Service functions, RBAC/object checks, Audit helper.</w:t>
-      </w:r>
-    </w:p>
-    <w:p>
-      <w:pPr>
-        <w:pStyle w:val="ListBullet"/>
-        <w:spacing w:after="40"/>
-      </w:pPr>
-      <w:r>
-        <w:rPr>
-          <w:rFonts w:ascii="Times New Roman" w:hAnsi="Times New Roman" w:eastAsia="Times New Roman"/>
-          <w:b w:val="0"/>
-          <w:i w:val="0"/>
-          <w:sz w:val="28"/>
-        </w:rPr>
-        <w:t>В колонке Sinks указать: SQLAlchemy DB, Refresh token store, Audit JSON, Report JSON, Frontend DOM.</w:t>
-      </w:r>
-    </w:p>
-    <w:p>
-      <w:pPr>
-        <w:pStyle w:val="ListBullet"/>
-        <w:spacing w:after="40"/>
-      </w:pPr>
-      <w:r>
-        <w:rPr>
-          <w:rFonts w:ascii="Times New Roman" w:hAnsi="Times New Roman" w:eastAsia="Times New Roman"/>
-          <w:b w:val="0"/>
-          <w:i w:val="0"/>
-          <w:sz w:val="28"/>
-        </w:rPr>
-        <w:t>В колонке Protections указать: Parameterized ORM, Argon2/hash only, No secret logging, Offset/limit bounds, textContent rendering.</w:t>
-      </w:r>
-    </w:p>
-    <w:p>
-      <w:pPr>
-        <w:pStyle w:val="ListBullet"/>
-        <w:spacing w:after="40"/>
-      </w:pPr>
-      <w:r>
-        <w:rPr>
-          <w:rFonts w:ascii="Times New Roman" w:hAnsi="Times New Roman" w:eastAsia="Times New Roman"/>
-          <w:b w:val="0"/>
-          <w:i w:val="0"/>
-          <w:sz w:val="28"/>
-        </w:rPr>
-        <w:t>Провести основные стрелки слева направо. Особо выделить цепочки: Query params -&gt; Service functions -&gt; SQLAlchemy DB -&gt; Offset/limit bounds; Login form -&gt; password verification -&gt; Argon2/hash only; Report filters -&gt; Report JSON -&gt; response_model.</w:t>
-      </w:r>
-    </w:p>
-    <w:p>
-      <w:pPr>
-        <w:pStyle w:val="ListBullet"/>
-        <w:spacing w:after="40"/>
-      </w:pPr>
-      <w:r>
-        <w:rPr>
-          <w:rFonts w:ascii="Times New Roman" w:hAnsi="Times New Roman" w:eastAsia="Times New Roman"/>
-          <w:b w:val="0"/>
-          <w:i w:val="0"/>
-          <w:sz w:val="28"/>
-        </w:rPr>
-        <w:t>Цвета: Sources - голубой, Propagation - зеленый, Sinks - оранжевый, Protections - желтый. Экспортировать и вставить как Рисунок 2.</w:t>
-      </w:r>
-    </w:p>
+    <w:tbl>
+      <w:tblPr>
+        <w:tblStyle w:val="TableGrid"/>
+        <w:tblW w:type="dxa" w:w="15363"/>
+        <w:tblLayout w:type="fixed"/>
+        <w:tblLook w:firstColumn="1" w:firstRow="1" w:lastColumn="0" w:lastRow="0" w:noHBand="0" w:noVBand="1" w:val="04A0"/>
+      </w:tblPr>
+      <w:tblGrid>
+        <w:gridCol w:w="1133"/>
+        <w:gridCol w:w="3004"/>
+        <w:gridCol w:w="3004"/>
+        <w:gridCol w:w="3798"/>
+        <w:gridCol w:w="4422"/>
+      </w:tblGrid>
+      <w:tr>
+        <w:tc>
+          <w:tcPr>
+            <w:tcW w:type="dxa" w:w="1133"/>
+            <w:vAlign w:val="center"/>
+            <w:tcMar>
+              <w:top w:w="90" w:type="dxa"/>
+              <w:start w:w="90" w:type="dxa"/>
+              <w:bottom w:w="90" w:type="dxa"/>
+              <w:end w:w="90" w:type="dxa"/>
+            </w:tcMar>
+          </w:tcPr>
+          <w:p>
+            <w:r>
+              <w:rPr>
+                <w:rFonts w:ascii="Times New Roman" w:hAnsi="Times New Roman" w:eastAsia="Times New Roman"/>
+                <w:b/>
+                <w:i w:val="0"/>
+                <w:sz w:val="16"/>
+              </w:rPr>
+              <w:t>Flow ID</w:t>
+            </w:r>
+          </w:p>
+        </w:tc>
+        <w:tc>
+          <w:tcPr>
+            <w:tcW w:type="dxa" w:w="3004"/>
+            <w:vAlign w:val="center"/>
+            <w:tcMar>
+              <w:top w:w="90" w:type="dxa"/>
+              <w:start w:w="90" w:type="dxa"/>
+              <w:bottom w:w="90" w:type="dxa"/>
+              <w:end w:w="90" w:type="dxa"/>
+            </w:tcMar>
+          </w:tcPr>
+          <w:p>
+            <w:r>
+              <w:rPr>
+                <w:rFonts w:ascii="Times New Roman" w:hAnsi="Times New Roman" w:eastAsia="Times New Roman"/>
+                <w:b/>
+                <w:i w:val="0"/>
+                <w:sz w:val="16"/>
+              </w:rPr>
+              <w:t>Source</w:t>
+            </w:r>
+          </w:p>
+        </w:tc>
+        <w:tc>
+          <w:tcPr>
+            <w:tcW w:type="dxa" w:w="3004"/>
+            <w:vAlign w:val="center"/>
+            <w:tcMar>
+              <w:top w:w="90" w:type="dxa"/>
+              <w:start w:w="90" w:type="dxa"/>
+              <w:bottom w:w="90" w:type="dxa"/>
+              <w:end w:w="90" w:type="dxa"/>
+            </w:tcMar>
+          </w:tcPr>
+          <w:p>
+            <w:r>
+              <w:rPr>
+                <w:rFonts w:ascii="Times New Roman" w:hAnsi="Times New Roman" w:eastAsia="Times New Roman"/>
+                <w:b/>
+                <w:i w:val="0"/>
+                <w:sz w:val="16"/>
+              </w:rPr>
+              <w:t>Target</w:t>
+            </w:r>
+          </w:p>
+        </w:tc>
+        <w:tc>
+          <w:tcPr>
+            <w:tcW w:type="dxa" w:w="3798"/>
+            <w:vAlign w:val="center"/>
+            <w:tcMar>
+              <w:top w:w="90" w:type="dxa"/>
+              <w:start w:w="90" w:type="dxa"/>
+              <w:bottom w:w="90" w:type="dxa"/>
+              <w:end w:w="90" w:type="dxa"/>
+            </w:tcMar>
+          </w:tcPr>
+          <w:p>
+            <w:r>
+              <w:rPr>
+                <w:rFonts w:ascii="Times New Roman" w:hAnsi="Times New Roman" w:eastAsia="Times New Roman"/>
+                <w:b/>
+                <w:i w:val="0"/>
+                <w:sz w:val="16"/>
+              </w:rPr>
+              <w:t>Data / Action</w:t>
+            </w:r>
+          </w:p>
+        </w:tc>
+        <w:tc>
+          <w:tcPr>
+            <w:tcW w:type="dxa" w:w="4422"/>
+            <w:vAlign w:val="center"/>
+            <w:tcMar>
+              <w:top w:w="90" w:type="dxa"/>
+              <w:start w:w="90" w:type="dxa"/>
+              <w:bottom w:w="90" w:type="dxa"/>
+              <w:end w:w="90" w:type="dxa"/>
+            </w:tcMar>
+          </w:tcPr>
+          <w:p>
+            <w:r>
+              <w:rPr>
+                <w:rFonts w:ascii="Times New Roman" w:hAnsi="Times New Roman" w:eastAsia="Times New Roman"/>
+                <w:b/>
+                <w:i w:val="0"/>
+                <w:sz w:val="16"/>
+              </w:rPr>
+              <w:t>Control / Protection</w:t>
+            </w:r>
+          </w:p>
+        </w:tc>
+      </w:tr>
+      <w:tr>
+        <w:tc>
+          <w:tcPr>
+            <w:tcW w:type="dxa" w:w="1133"/>
+            <w:vAlign w:val="center"/>
+            <w:tcMar>
+              <w:top w:w="90" w:type="dxa"/>
+              <w:start w:w="90" w:type="dxa"/>
+              <w:bottom w:w="90" w:type="dxa"/>
+              <w:end w:w="90" w:type="dxa"/>
+            </w:tcMar>
+          </w:tcPr>
+          <w:p>
+            <w:pPr>
+              <w:spacing w:after="0"/>
+            </w:pPr>
+            <w:r>
+              <w:rPr>
+                <w:rFonts w:ascii="Times New Roman" w:hAnsi="Times New Roman" w:eastAsia="Times New Roman"/>
+                <w:b w:val="0"/>
+                <w:i w:val="0"/>
+                <w:sz w:val="16"/>
+              </w:rPr>
+              <w:t>F1</w:t>
+            </w:r>
+          </w:p>
+        </w:tc>
+        <w:tc>
+          <w:tcPr>
+            <w:tcW w:type="dxa" w:w="3004"/>
+            <w:vAlign w:val="center"/>
+            <w:tcMar>
+              <w:top w:w="90" w:type="dxa"/>
+              <w:start w:w="90" w:type="dxa"/>
+              <w:bottom w:w="90" w:type="dxa"/>
+              <w:end w:w="90" w:type="dxa"/>
+            </w:tcMar>
+          </w:tcPr>
+          <w:p>
+            <w:pPr>
+              <w:spacing w:after="0"/>
+            </w:pPr>
+            <w:r>
+              <w:rPr>
+                <w:rFonts w:ascii="Times New Roman" w:hAnsi="Times New Roman" w:eastAsia="Times New Roman"/>
+                <w:b w:val="0"/>
+                <w:i w:val="0"/>
+                <w:sz w:val="16"/>
+              </w:rPr>
+              <w:t>Login form</w:t>
+            </w:r>
+          </w:p>
+        </w:tc>
+        <w:tc>
+          <w:tcPr>
+            <w:tcW w:type="dxa" w:w="3004"/>
+            <w:vAlign w:val="center"/>
+            <w:tcMar>
+              <w:top w:w="90" w:type="dxa"/>
+              <w:start w:w="90" w:type="dxa"/>
+              <w:bottom w:w="90" w:type="dxa"/>
+              <w:end w:w="90" w:type="dxa"/>
+            </w:tcMar>
+          </w:tcPr>
+          <w:p>
+            <w:pPr>
+              <w:spacing w:after="0"/>
+            </w:pPr>
+            <w:r>
+              <w:rPr>
+                <w:rFonts w:ascii="Times New Roman" w:hAnsi="Times New Roman" w:eastAsia="Times New Roman"/>
+                <w:b w:val="0"/>
+                <w:i w:val="0"/>
+                <w:sz w:val="16"/>
+              </w:rPr>
+              <w:t>Password verification/token sink</w:t>
+            </w:r>
+          </w:p>
+        </w:tc>
+        <w:tc>
+          <w:tcPr>
+            <w:tcW w:type="dxa" w:w="3798"/>
+            <w:vAlign w:val="center"/>
+            <w:tcMar>
+              <w:top w:w="90" w:type="dxa"/>
+              <w:start w:w="90" w:type="dxa"/>
+              <w:bottom w:w="90" w:type="dxa"/>
+              <w:end w:w="90" w:type="dxa"/>
+            </w:tcMar>
+          </w:tcPr>
+          <w:p>
+            <w:pPr>
+              <w:spacing w:after="0"/>
+            </w:pPr>
+            <w:r>
+              <w:rPr>
+                <w:rFonts w:ascii="Times New Roman" w:hAnsi="Times New Roman" w:eastAsia="Times New Roman"/>
+                <w:b w:val="0"/>
+                <w:i w:val="0"/>
+                <w:sz w:val="16"/>
+              </w:rPr>
+              <w:t>email and password</w:t>
+            </w:r>
+          </w:p>
+        </w:tc>
+        <w:tc>
+          <w:tcPr>
+            <w:tcW w:type="dxa" w:w="4422"/>
+            <w:vAlign w:val="center"/>
+            <w:tcMar>
+              <w:top w:w="90" w:type="dxa"/>
+              <w:start w:w="90" w:type="dxa"/>
+              <w:bottom w:w="90" w:type="dxa"/>
+              <w:end w:w="90" w:type="dxa"/>
+            </w:tcMar>
+          </w:tcPr>
+          <w:p>
+            <w:pPr>
+              <w:spacing w:after="0"/>
+            </w:pPr>
+            <w:r>
+              <w:rPr>
+                <w:rFonts w:ascii="Times New Roman" w:hAnsi="Times New Roman" w:eastAsia="Times New Roman"/>
+                <w:b w:val="0"/>
+                <w:i w:val="0"/>
+                <w:sz w:val="16"/>
+              </w:rPr>
+              <w:t>Argon2 verification, dummy hash for absent/inactive/locked user, neutral error.</w:t>
+            </w:r>
+          </w:p>
+        </w:tc>
+      </w:tr>
+      <w:tr>
+        <w:tc>
+          <w:tcPr>
+            <w:tcW w:type="dxa" w:w="1133"/>
+            <w:vAlign w:val="center"/>
+            <w:tcMar>
+              <w:top w:w="90" w:type="dxa"/>
+              <w:start w:w="90" w:type="dxa"/>
+              <w:bottom w:w="90" w:type="dxa"/>
+              <w:end w:w="90" w:type="dxa"/>
+            </w:tcMar>
+          </w:tcPr>
+          <w:p>
+            <w:pPr>
+              <w:spacing w:after="0"/>
+            </w:pPr>
+            <w:r>
+              <w:rPr>
+                <w:rFonts w:ascii="Times New Roman" w:hAnsi="Times New Roman" w:eastAsia="Times New Roman"/>
+                <w:b w:val="0"/>
+                <w:i w:val="0"/>
+                <w:sz w:val="16"/>
+              </w:rPr>
+              <w:t>F2</w:t>
+            </w:r>
+          </w:p>
+        </w:tc>
+        <w:tc>
+          <w:tcPr>
+            <w:tcW w:type="dxa" w:w="3004"/>
+            <w:vAlign w:val="center"/>
+            <w:tcMar>
+              <w:top w:w="90" w:type="dxa"/>
+              <w:start w:w="90" w:type="dxa"/>
+              <w:bottom w:w="90" w:type="dxa"/>
+              <w:end w:w="90" w:type="dxa"/>
+            </w:tcMar>
+          </w:tcPr>
+          <w:p>
+            <w:pPr>
+              <w:spacing w:after="0"/>
+            </w:pPr>
+            <w:r>
+              <w:rPr>
+                <w:rFonts w:ascii="Times New Roman" w:hAnsi="Times New Roman" w:eastAsia="Times New Roman"/>
+                <w:b w:val="0"/>
+                <w:i w:val="0"/>
+                <w:sz w:val="16"/>
+              </w:rPr>
+              <w:t>Bearer token</w:t>
+            </w:r>
+          </w:p>
+        </w:tc>
+        <w:tc>
+          <w:tcPr>
+            <w:tcW w:type="dxa" w:w="3004"/>
+            <w:vAlign w:val="center"/>
+            <w:tcMar>
+              <w:top w:w="90" w:type="dxa"/>
+              <w:start w:w="90" w:type="dxa"/>
+              <w:bottom w:w="90" w:type="dxa"/>
+              <w:end w:w="90" w:type="dxa"/>
+            </w:tcMar>
+          </w:tcPr>
+          <w:p>
+            <w:pPr>
+              <w:spacing w:after="0"/>
+            </w:pPr>
+            <w:r>
+              <w:rPr>
+                <w:rFonts w:ascii="Times New Roman" w:hAnsi="Times New Roman" w:eastAsia="Times New Roman"/>
+                <w:b w:val="0"/>
+                <w:i w:val="0"/>
+                <w:sz w:val="16"/>
+              </w:rPr>
+              <w:t>Authorization decision</w:t>
+            </w:r>
+          </w:p>
+        </w:tc>
+        <w:tc>
+          <w:tcPr>
+            <w:tcW w:type="dxa" w:w="3798"/>
+            <w:vAlign w:val="center"/>
+            <w:tcMar>
+              <w:top w:w="90" w:type="dxa"/>
+              <w:start w:w="90" w:type="dxa"/>
+              <w:bottom w:w="90" w:type="dxa"/>
+              <w:end w:w="90" w:type="dxa"/>
+            </w:tcMar>
+          </w:tcPr>
+          <w:p>
+            <w:pPr>
+              <w:spacing w:after="0"/>
+            </w:pPr>
+            <w:r>
+              <w:rPr>
+                <w:rFonts w:ascii="Times New Roman" w:hAnsi="Times New Roman" w:eastAsia="Times New Roman"/>
+                <w:b w:val="0"/>
+                <w:i w:val="0"/>
+                <w:sz w:val="16"/>
+              </w:rPr>
+              <w:t>JWT claims and current user</w:t>
+            </w:r>
+          </w:p>
+        </w:tc>
+        <w:tc>
+          <w:tcPr>
+            <w:tcW w:type="dxa" w:w="4422"/>
+            <w:vAlign w:val="center"/>
+            <w:tcMar>
+              <w:top w:w="90" w:type="dxa"/>
+              <w:start w:w="90" w:type="dxa"/>
+              <w:bottom w:w="90" w:type="dxa"/>
+              <w:end w:w="90" w:type="dxa"/>
+            </w:tcMar>
+          </w:tcPr>
+          <w:p>
+            <w:pPr>
+              <w:spacing w:after="0"/>
+            </w:pPr>
+            <w:r>
+              <w:rPr>
+                <w:rFonts w:ascii="Times New Roman" w:hAnsi="Times New Roman" w:eastAsia="Times New Roman"/>
+                <w:b w:val="0"/>
+                <w:i w:val="0"/>
+                <w:sz w:val="16"/>
+              </w:rPr>
+              <w:t>JWT validation, active user lookup, role/object matrix.</w:t>
+            </w:r>
+          </w:p>
+        </w:tc>
+      </w:tr>
+      <w:tr>
+        <w:tc>
+          <w:tcPr>
+            <w:tcW w:type="dxa" w:w="1133"/>
+            <w:vAlign w:val="center"/>
+            <w:tcMar>
+              <w:top w:w="90" w:type="dxa"/>
+              <w:start w:w="90" w:type="dxa"/>
+              <w:bottom w:w="90" w:type="dxa"/>
+              <w:end w:w="90" w:type="dxa"/>
+            </w:tcMar>
+          </w:tcPr>
+          <w:p>
+            <w:pPr>
+              <w:spacing w:after="0"/>
+            </w:pPr>
+            <w:r>
+              <w:rPr>
+                <w:rFonts w:ascii="Times New Roman" w:hAnsi="Times New Roman" w:eastAsia="Times New Roman"/>
+                <w:b w:val="0"/>
+                <w:i w:val="0"/>
+                <w:sz w:val="16"/>
+              </w:rPr>
+              <w:t>F3</w:t>
+            </w:r>
+          </w:p>
+        </w:tc>
+        <w:tc>
+          <w:tcPr>
+            <w:tcW w:type="dxa" w:w="3004"/>
+            <w:vAlign w:val="center"/>
+            <w:tcMar>
+              <w:top w:w="90" w:type="dxa"/>
+              <w:start w:w="90" w:type="dxa"/>
+              <w:bottom w:w="90" w:type="dxa"/>
+              <w:end w:w="90" w:type="dxa"/>
+            </w:tcMar>
+          </w:tcPr>
+          <w:p>
+            <w:pPr>
+              <w:spacing w:after="0"/>
+            </w:pPr>
+            <w:r>
+              <w:rPr>
+                <w:rFonts w:ascii="Times New Roman" w:hAnsi="Times New Roman" w:eastAsia="Times New Roman"/>
+                <w:b w:val="0"/>
+                <w:i w:val="0"/>
+                <w:sz w:val="16"/>
+              </w:rPr>
+              <w:t>Query params</w:t>
+            </w:r>
+          </w:p>
+        </w:tc>
+        <w:tc>
+          <w:tcPr>
+            <w:tcW w:type="dxa" w:w="3004"/>
+            <w:vAlign w:val="center"/>
+            <w:tcMar>
+              <w:top w:w="90" w:type="dxa"/>
+              <w:start w:w="90" w:type="dxa"/>
+              <w:bottom w:w="90" w:type="dxa"/>
+              <w:end w:w="90" w:type="dxa"/>
+            </w:tcMar>
+          </w:tcPr>
+          <w:p>
+            <w:pPr>
+              <w:spacing w:after="0"/>
+            </w:pPr>
+            <w:r>
+              <w:rPr>
+                <w:rFonts w:ascii="Times New Roman" w:hAnsi="Times New Roman" w:eastAsia="Times New Roman"/>
+                <w:b w:val="0"/>
+                <w:i w:val="0"/>
+                <w:sz w:val="16"/>
+              </w:rPr>
+              <w:t>SQLAlchemy DB query</w:t>
+            </w:r>
+          </w:p>
+        </w:tc>
+        <w:tc>
+          <w:tcPr>
+            <w:tcW w:type="dxa" w:w="3798"/>
+            <w:vAlign w:val="center"/>
+            <w:tcMar>
+              <w:top w:w="90" w:type="dxa"/>
+              <w:start w:w="90" w:type="dxa"/>
+              <w:bottom w:w="90" w:type="dxa"/>
+              <w:end w:w="90" w:type="dxa"/>
+            </w:tcMar>
+          </w:tcPr>
+          <w:p>
+            <w:pPr>
+              <w:spacing w:after="0"/>
+            </w:pPr>
+            <w:r>
+              <w:rPr>
+                <w:rFonts w:ascii="Times New Roman" w:hAnsi="Times New Roman" w:eastAsia="Times New Roman"/>
+                <w:b w:val="0"/>
+                <w:i w:val="0"/>
+                <w:sz w:val="16"/>
+              </w:rPr>
+              <w:t>limit, offset, role/status filters</w:t>
+            </w:r>
+          </w:p>
+        </w:tc>
+        <w:tc>
+          <w:tcPr>
+            <w:tcW w:type="dxa" w:w="4422"/>
+            <w:vAlign w:val="center"/>
+            <w:tcMar>
+              <w:top w:w="90" w:type="dxa"/>
+              <w:start w:w="90" w:type="dxa"/>
+              <w:bottom w:w="90" w:type="dxa"/>
+              <w:end w:w="90" w:type="dxa"/>
+            </w:tcMar>
+          </w:tcPr>
+          <w:p>
+            <w:pPr>
+              <w:spacing w:after="0"/>
+            </w:pPr>
+            <w:r>
+              <w:rPr>
+                <w:rFonts w:ascii="Times New Roman" w:hAnsi="Times New Roman" w:eastAsia="Times New Roman"/>
+                <w:b w:val="0"/>
+                <w:i w:val="0"/>
+                <w:sz w:val="16"/>
+              </w:rPr>
+              <w:t>Typed enums, ge/le bounds, ORM expression API.</w:t>
+            </w:r>
+          </w:p>
+        </w:tc>
+      </w:tr>
+      <w:tr>
+        <w:tc>
+          <w:tcPr>
+            <w:tcW w:type="dxa" w:w="1133"/>
+            <w:vAlign w:val="center"/>
+            <w:tcMar>
+              <w:top w:w="90" w:type="dxa"/>
+              <w:start w:w="90" w:type="dxa"/>
+              <w:bottom w:w="90" w:type="dxa"/>
+              <w:end w:w="90" w:type="dxa"/>
+            </w:tcMar>
+          </w:tcPr>
+          <w:p>
+            <w:pPr>
+              <w:spacing w:after="0"/>
+            </w:pPr>
+            <w:r>
+              <w:rPr>
+                <w:rFonts w:ascii="Times New Roman" w:hAnsi="Times New Roman" w:eastAsia="Times New Roman"/>
+                <w:b w:val="0"/>
+                <w:i w:val="0"/>
+                <w:sz w:val="16"/>
+              </w:rPr>
+              <w:t>F4</w:t>
+            </w:r>
+          </w:p>
+        </w:tc>
+        <w:tc>
+          <w:tcPr>
+            <w:tcW w:type="dxa" w:w="3004"/>
+            <w:vAlign w:val="center"/>
+            <w:tcMar>
+              <w:top w:w="90" w:type="dxa"/>
+              <w:start w:w="90" w:type="dxa"/>
+              <w:bottom w:w="90" w:type="dxa"/>
+              <w:end w:w="90" w:type="dxa"/>
+            </w:tcMar>
+          </w:tcPr>
+          <w:p>
+            <w:pPr>
+              <w:spacing w:after="0"/>
+            </w:pPr>
+            <w:r>
+              <w:rPr>
+                <w:rFonts w:ascii="Times New Roman" w:hAnsi="Times New Roman" w:eastAsia="Times New Roman"/>
+                <w:b w:val="0"/>
+                <w:i w:val="0"/>
+                <w:sz w:val="16"/>
+              </w:rPr>
+              <w:t>JSON request body</w:t>
+            </w:r>
+          </w:p>
+        </w:tc>
+        <w:tc>
+          <w:tcPr>
+            <w:tcW w:type="dxa" w:w="3004"/>
+            <w:vAlign w:val="center"/>
+            <w:tcMar>
+              <w:top w:w="90" w:type="dxa"/>
+              <w:start w:w="90" w:type="dxa"/>
+              <w:bottom w:w="90" w:type="dxa"/>
+              <w:end w:w="90" w:type="dxa"/>
+            </w:tcMar>
+          </w:tcPr>
+          <w:p>
+            <w:pPr>
+              <w:spacing w:after="0"/>
+            </w:pPr>
+            <w:r>
+              <w:rPr>
+                <w:rFonts w:ascii="Times New Roman" w:hAnsi="Times New Roman" w:eastAsia="Times New Roman"/>
+                <w:b w:val="0"/>
+                <w:i w:val="0"/>
+                <w:sz w:val="16"/>
+              </w:rPr>
+              <w:t>Maintenance status update</w:t>
+            </w:r>
+          </w:p>
+        </w:tc>
+        <w:tc>
+          <w:tcPr>
+            <w:tcW w:type="dxa" w:w="3798"/>
+            <w:vAlign w:val="center"/>
+            <w:tcMar>
+              <w:top w:w="90" w:type="dxa"/>
+              <w:start w:w="90" w:type="dxa"/>
+              <w:bottom w:w="90" w:type="dxa"/>
+              <w:end w:w="90" w:type="dxa"/>
+            </w:tcMar>
+          </w:tcPr>
+          <w:p>
+            <w:pPr>
+              <w:spacing w:after="0"/>
+            </w:pPr>
+            <w:r>
+              <w:rPr>
+                <w:rFonts w:ascii="Times New Roman" w:hAnsi="Times New Roman" w:eastAsia="Times New Roman"/>
+                <w:b w:val="0"/>
+                <w:i w:val="0"/>
+                <w:sz w:val="16"/>
+              </w:rPr>
+              <w:t>status, assigned_engineer_id, internal_notes</w:t>
+            </w:r>
+          </w:p>
+        </w:tc>
+        <w:tc>
+          <w:tcPr>
+            <w:tcW w:type="dxa" w:w="4422"/>
+            <w:vAlign w:val="center"/>
+            <w:tcMar>
+              <w:top w:w="90" w:type="dxa"/>
+              <w:start w:w="90" w:type="dxa"/>
+              <w:bottom w:w="90" w:type="dxa"/>
+              <w:end w:w="90" w:type="dxa"/>
+            </w:tcMar>
+          </w:tcPr>
+          <w:p>
+            <w:pPr>
+              <w:spacing w:after="0"/>
+            </w:pPr>
+            <w:r>
+              <w:rPr>
+                <w:rFonts w:ascii="Times New Roman" w:hAnsi="Times New Roman" w:eastAsia="Times New Roman"/>
+                <w:b w:val="0"/>
+                <w:i w:val="0"/>
+                <w:sz w:val="16"/>
+              </w:rPr>
+              <w:t>Pydantic validator and backend authorization check.</w:t>
+            </w:r>
+          </w:p>
+        </w:tc>
+      </w:tr>
+      <w:tr>
+        <w:tc>
+          <w:tcPr>
+            <w:tcW w:type="dxa" w:w="1133"/>
+            <w:vAlign w:val="center"/>
+            <w:tcMar>
+              <w:top w:w="90" w:type="dxa"/>
+              <w:start w:w="90" w:type="dxa"/>
+              <w:bottom w:w="90" w:type="dxa"/>
+              <w:end w:w="90" w:type="dxa"/>
+            </w:tcMar>
+          </w:tcPr>
+          <w:p>
+            <w:pPr>
+              <w:spacing w:after="0"/>
+            </w:pPr>
+            <w:r>
+              <w:rPr>
+                <w:rFonts w:ascii="Times New Roman" w:hAnsi="Times New Roman" w:eastAsia="Times New Roman"/>
+                <w:b w:val="0"/>
+                <w:i w:val="0"/>
+                <w:sz w:val="16"/>
+              </w:rPr>
+              <w:t>F5</w:t>
+            </w:r>
+          </w:p>
+        </w:tc>
+        <w:tc>
+          <w:tcPr>
+            <w:tcW w:type="dxa" w:w="3004"/>
+            <w:vAlign w:val="center"/>
+            <w:tcMar>
+              <w:top w:w="90" w:type="dxa"/>
+              <w:start w:w="90" w:type="dxa"/>
+              <w:bottom w:w="90" w:type="dxa"/>
+              <w:end w:w="90" w:type="dxa"/>
+            </w:tcMar>
+          </w:tcPr>
+          <w:p>
+            <w:pPr>
+              <w:spacing w:after="0"/>
+            </w:pPr>
+            <w:r>
+              <w:rPr>
+                <w:rFonts w:ascii="Times New Roman" w:hAnsi="Times New Roman" w:eastAsia="Times New Roman"/>
+                <w:b w:val="0"/>
+                <w:i w:val="0"/>
+                <w:sz w:val="16"/>
+              </w:rPr>
+              <w:t>Request context</w:t>
+            </w:r>
+          </w:p>
+        </w:tc>
+        <w:tc>
+          <w:tcPr>
+            <w:tcW w:type="dxa" w:w="3004"/>
+            <w:vAlign w:val="center"/>
+            <w:tcMar>
+              <w:top w:w="90" w:type="dxa"/>
+              <w:start w:w="90" w:type="dxa"/>
+              <w:bottom w:w="90" w:type="dxa"/>
+              <w:end w:w="90" w:type="dxa"/>
+            </w:tcMar>
+          </w:tcPr>
+          <w:p>
+            <w:pPr>
+              <w:spacing w:after="0"/>
+            </w:pPr>
+            <w:r>
+              <w:rPr>
+                <w:rFonts w:ascii="Times New Roman" w:hAnsi="Times New Roman" w:eastAsia="Times New Roman"/>
+                <w:b w:val="0"/>
+                <w:i w:val="0"/>
+                <w:sz w:val="16"/>
+              </w:rPr>
+              <w:t>Audit JSON details</w:t>
+            </w:r>
+          </w:p>
+        </w:tc>
+        <w:tc>
+          <w:tcPr>
+            <w:tcW w:type="dxa" w:w="3798"/>
+            <w:vAlign w:val="center"/>
+            <w:tcMar>
+              <w:top w:w="90" w:type="dxa"/>
+              <w:start w:w="90" w:type="dxa"/>
+              <w:bottom w:w="90" w:type="dxa"/>
+              <w:end w:w="90" w:type="dxa"/>
+            </w:tcMar>
+          </w:tcPr>
+          <w:p>
+            <w:pPr>
+              <w:spacing w:after="0"/>
+            </w:pPr>
+            <w:r>
+              <w:rPr>
+                <w:rFonts w:ascii="Times New Roman" w:hAnsi="Times New Roman" w:eastAsia="Times New Roman"/>
+                <w:b w:val="0"/>
+                <w:i w:val="0"/>
+                <w:sz w:val="16"/>
+              </w:rPr>
+              <w:t>actor, action, entity, outcome</w:t>
+            </w:r>
+          </w:p>
+        </w:tc>
+        <w:tc>
+          <w:tcPr>
+            <w:tcW w:type="dxa" w:w="4422"/>
+            <w:vAlign w:val="center"/>
+            <w:tcMar>
+              <w:top w:w="90" w:type="dxa"/>
+              <w:start w:w="90" w:type="dxa"/>
+              <w:bottom w:w="90" w:type="dxa"/>
+              <w:end w:w="90" w:type="dxa"/>
+            </w:tcMar>
+          </w:tcPr>
+          <w:p>
+            <w:pPr>
+              <w:spacing w:after="0"/>
+            </w:pPr>
+            <w:r>
+              <w:rPr>
+                <w:rFonts w:ascii="Times New Roman" w:hAnsi="Times New Roman" w:eastAsia="Times New Roman"/>
+                <w:b w:val="0"/>
+                <w:i w:val="0"/>
+                <w:sz w:val="16"/>
+              </w:rPr>
+              <w:t>Structured details without raw passwords or tokens.</w:t>
+            </w:r>
+          </w:p>
+        </w:tc>
+      </w:tr>
+      <w:tr>
+        <w:tc>
+          <w:tcPr>
+            <w:tcW w:type="dxa" w:w="1133"/>
+            <w:vAlign w:val="center"/>
+            <w:tcMar>
+              <w:top w:w="90" w:type="dxa"/>
+              <w:start w:w="90" w:type="dxa"/>
+              <w:bottom w:w="90" w:type="dxa"/>
+              <w:end w:w="90" w:type="dxa"/>
+            </w:tcMar>
+          </w:tcPr>
+          <w:p>
+            <w:pPr>
+              <w:spacing w:after="0"/>
+            </w:pPr>
+            <w:r>
+              <w:rPr>
+                <w:rFonts w:ascii="Times New Roman" w:hAnsi="Times New Roman" w:eastAsia="Times New Roman"/>
+                <w:b w:val="0"/>
+                <w:i w:val="0"/>
+                <w:sz w:val="16"/>
+              </w:rPr>
+              <w:t>F6</w:t>
+            </w:r>
+          </w:p>
+        </w:tc>
+        <w:tc>
+          <w:tcPr>
+            <w:tcW w:type="dxa" w:w="3004"/>
+            <w:vAlign w:val="center"/>
+            <w:tcMar>
+              <w:top w:w="90" w:type="dxa"/>
+              <w:start w:w="90" w:type="dxa"/>
+              <w:bottom w:w="90" w:type="dxa"/>
+              <w:end w:w="90" w:type="dxa"/>
+            </w:tcMar>
+          </w:tcPr>
+          <w:p>
+            <w:pPr>
+              <w:spacing w:after="0"/>
+            </w:pPr>
+            <w:r>
+              <w:rPr>
+                <w:rFonts w:ascii="Times New Roman" w:hAnsi="Times New Roman" w:eastAsia="Times New Roman"/>
+                <w:b w:val="0"/>
+                <w:i w:val="0"/>
+                <w:sz w:val="16"/>
+              </w:rPr>
+              <w:t>Report filters</w:t>
+            </w:r>
+          </w:p>
+        </w:tc>
+        <w:tc>
+          <w:tcPr>
+            <w:tcW w:type="dxa" w:w="3004"/>
+            <w:vAlign w:val="center"/>
+            <w:tcMar>
+              <w:top w:w="90" w:type="dxa"/>
+              <w:start w:w="90" w:type="dxa"/>
+              <w:bottom w:w="90" w:type="dxa"/>
+              <w:end w:w="90" w:type="dxa"/>
+            </w:tcMar>
+          </w:tcPr>
+          <w:p>
+            <w:pPr>
+              <w:spacing w:after="0"/>
+            </w:pPr>
+            <w:r>
+              <w:rPr>
+                <w:rFonts w:ascii="Times New Roman" w:hAnsi="Times New Roman" w:eastAsia="Times New Roman"/>
+                <w:b w:val="0"/>
+                <w:i w:val="0"/>
+                <w:sz w:val="16"/>
+              </w:rPr>
+              <w:t>Report JSON and frontend DOM</w:t>
+            </w:r>
+          </w:p>
+        </w:tc>
+        <w:tc>
+          <w:tcPr>
+            <w:tcW w:type="dxa" w:w="3798"/>
+            <w:vAlign w:val="center"/>
+            <w:tcMar>
+              <w:top w:w="90" w:type="dxa"/>
+              <w:start w:w="90" w:type="dxa"/>
+              <w:bottom w:w="90" w:type="dxa"/>
+              <w:end w:w="90" w:type="dxa"/>
+            </w:tcMar>
+          </w:tcPr>
+          <w:p>
+            <w:pPr>
+              <w:spacing w:after="0"/>
+            </w:pPr>
+            <w:r>
+              <w:rPr>
+                <w:rFonts w:ascii="Times New Roman" w:hAnsi="Times New Roman" w:eastAsia="Times New Roman"/>
+                <w:b w:val="0"/>
+                <w:i w:val="0"/>
+                <w:sz w:val="16"/>
+              </w:rPr>
+              <w:t>summary rows and status counts</w:t>
+            </w:r>
+          </w:p>
+        </w:tc>
+        <w:tc>
+          <w:tcPr>
+            <w:tcW w:type="dxa" w:w="4422"/>
+            <w:vAlign w:val="center"/>
+            <w:tcMar>
+              <w:top w:w="90" w:type="dxa"/>
+              <w:start w:w="90" w:type="dxa"/>
+              <w:bottom w:w="90" w:type="dxa"/>
+              <w:end w:w="90" w:type="dxa"/>
+            </w:tcMar>
+          </w:tcPr>
+          <w:p>
+            <w:pPr>
+              <w:spacing w:after="0"/>
+            </w:pPr>
+            <w:r>
+              <w:rPr>
+                <w:rFonts w:ascii="Times New Roman" w:hAnsi="Times New Roman" w:eastAsia="Times New Roman"/>
+                <w:b w:val="0"/>
+                <w:i w:val="0"/>
+                <w:sz w:val="16"/>
+              </w:rPr>
+              <w:t>Role-protected report endpoint, response_model, textContent rendering.</w:t>
+            </w:r>
+          </w:p>
+        </w:tc>
+      </w:tr>
+    </w:tbl>
+    <w:p/>
     <w:tbl>
       <w:tblPr>
         <w:tblStyle w:val="TableGrid"/>
@@ -3222,7 +5800,7 @@
           <w:i w:val="0"/>
           <w:sz w:val="28"/>
         </w:rPr>
-        <w:t>Инструкция для draw.io: flowchart принятия решения о доступе.</w:t>
+        <w:t>Листинг 3. Mermaid-код блок-схемы authorization decision.</w:t>
       </w:r>
     </w:p>
     <w:p>
@@ -3236,13 +5814,220 @@
           <w:i w:val="0"/>
           <w:sz w:val="28"/>
         </w:rPr>
-        <w:t>Эта схема нужна для P5 Task 3: показать легитимный и запрещенный сценарии authorization decision.</w:t>
+        <w:t>Код ниже отражает два сценария из задания 3: легитимное выполнение работ назначенным engineer и запрещенную попытку supervisor выполнить работу вместо engineer.</w:t>
       </w:r>
     </w:p>
     <w:p>
       <w:pPr>
-        <w:pStyle w:val="ListBullet"/>
-        <w:spacing w:after="40"/>
+        <w:spacing w:after="0"/>
+        <w:ind w:left="283"/>
+      </w:pPr>
+      <w:r>
+        <w:rPr>
+          <w:rFonts w:ascii="Consolas" w:hAnsi="Consolas" w:eastAsia="Consolas"/>
+          <w:sz w:val="16"/>
+        </w:rPr>
+        <w:t>```mermaid</w:t>
+      </w:r>
+    </w:p>
+    <w:p>
+      <w:pPr>
+        <w:spacing w:after="0"/>
+        <w:ind w:left="283"/>
+      </w:pPr>
+      <w:r>
+        <w:rPr>
+          <w:rFonts w:ascii="Consolas" w:hAnsi="Consolas" w:eastAsia="Consolas"/>
+          <w:sz w:val="16"/>
+        </w:rPr>
+        <w:t>flowchart TD</w:t>
+      </w:r>
+    </w:p>
+    <w:p>
+      <w:pPr>
+        <w:spacing w:after="0"/>
+        <w:ind w:left="283"/>
+      </w:pPr>
+      <w:r>
+        <w:rPr>
+          <w:rFonts w:ascii="Consolas" w:hAnsi="Consolas" w:eastAsia="Consolas"/>
+          <w:sz w:val="16"/>
+        </w:rPr>
+        <w:t xml:space="preserve">    L["1. Login request"] --&gt; AU["2. Authentication: active user and password hash"]</w:t>
+      </w:r>
+    </w:p>
+    <w:p>
+      <w:pPr>
+        <w:spacing w:after="0"/>
+        <w:ind w:left="283"/>
+      </w:pPr>
+      <w:r>
+        <w:rPr>
+          <w:rFonts w:ascii="Consolas" w:hAnsi="Consolas" w:eastAsia="Consolas"/>
+          <w:sz w:val="16"/>
+        </w:rPr>
+        <w:t xml:space="preserve">    AU --&gt; TOK["3. Access token issued"]</w:t>
+      </w:r>
+    </w:p>
+    <w:p>
+      <w:pPr>
+        <w:spacing w:after="0"/>
+        <w:ind w:left="283"/>
+      </w:pPr>
+      <w:r>
+        <w:rPr>
+          <w:rFonts w:ascii="Consolas" w:hAnsi="Consolas" w:eastAsia="Consolas"/>
+          <w:sz w:val="16"/>
+        </w:rPr>
+        <w:t xml:space="preserve">    TOK --&gt; LOAD["4. Load current user and request object"]</w:t>
+      </w:r>
+    </w:p>
+    <w:p>
+      <w:pPr>
+        <w:spacing w:after="0"/>
+        <w:ind w:left="283"/>
+      </w:pPr>
+      <w:r>
+        <w:rPr>
+          <w:rFonts w:ascii="Consolas" w:hAnsi="Consolas" w:eastAsia="Consolas"/>
+          <w:sz w:val="16"/>
+        </w:rPr>
+        <w:t xml:space="preserve">    LOAD --&gt; ASSIGN["5. Supervisor assigns engineer"]</w:t>
+      </w:r>
+    </w:p>
+    <w:p>
+      <w:pPr>
+        <w:spacing w:after="0"/>
+        <w:ind w:left="283"/>
+      </w:pPr>
+      <w:r>
+        <w:rPr>
+          <w:rFonts w:ascii="Consolas" w:hAnsi="Consolas" w:eastAsia="Consolas"/>
+          <w:sz w:val="16"/>
+        </w:rPr>
+        <w:t xml:space="preserve">    ASSIGN --&gt; ECHK{"6. Actor is assigned engineer?"}</w:t>
+      </w:r>
+    </w:p>
+    <w:p>
+      <w:pPr>
+        <w:spacing w:after="0"/>
+        <w:ind w:left="283"/>
+      </w:pPr>
+      <w:r>
+        <w:rPr>
+          <w:rFonts w:ascii="Consolas" w:hAnsi="Consolas" w:eastAsia="Consolas"/>
+          <w:sz w:val="16"/>
+        </w:rPr>
+        <w:t xml:space="preserve">    ECHK --&gt;|"yes"| START["7. Move assigned request to in_progress"]</w:t>
+      </w:r>
+    </w:p>
+    <w:p>
+      <w:pPr>
+        <w:spacing w:after="0"/>
+        <w:ind w:left="283"/>
+      </w:pPr>
+      <w:r>
+        <w:rPr>
+          <w:rFonts w:ascii="Consolas" w:hAnsi="Consolas" w:eastAsia="Consolas"/>
+          <w:sz w:val="16"/>
+        </w:rPr>
+        <w:t xml:space="preserve">    START --&gt; DONE["8. Move assigned request to completed"]</w:t>
+      </w:r>
+    </w:p>
+    <w:p>
+      <w:pPr>
+        <w:spacing w:after="0"/>
+        <w:ind w:left="283"/>
+      </w:pPr>
+      <w:r>
+        <w:rPr>
+          <w:rFonts w:ascii="Consolas" w:hAnsi="Consolas" w:eastAsia="Consolas"/>
+          <w:sz w:val="16"/>
+        </w:rPr>
+        <w:t xml:space="preserve">    DONE --&gt; AUDIT["9. Audit event and report data"]</w:t>
+      </w:r>
+    </w:p>
+    <w:p>
+      <w:pPr>
+        <w:spacing w:after="0"/>
+        <w:ind w:left="283"/>
+      </w:pPr>
+      <w:r>
+        <w:rPr>
+          <w:rFonts w:ascii="Consolas" w:hAnsi="Consolas" w:eastAsia="Consolas"/>
+          <w:sz w:val="16"/>
+        </w:rPr>
+        <w:t xml:space="preserve">    ECHK --&gt;|"no; supervisor/admin attempts start or complete"| DENY["403 Forbidden"]</w:t>
+      </w:r>
+    </w:p>
+    <w:p>
+      <w:pPr>
+        <w:spacing w:after="0"/>
+        <w:ind w:left="283"/>
+      </w:pPr>
+      <w:r>
+        <w:rPr>
+          <w:rFonts w:ascii="Consolas" w:hAnsi="Consolas" w:eastAsia="Consolas"/>
+          <w:sz w:val="16"/>
+        </w:rPr>
+        <w:t xml:space="preserve">    LOAD --&gt; DIR{"Directory access requested?"}</w:t>
+      </w:r>
+    </w:p>
+    <w:p>
+      <w:pPr>
+        <w:spacing w:after="0"/>
+        <w:ind w:left="283"/>
+      </w:pPr>
+      <w:r>
+        <w:rPr>
+          <w:rFonts w:ascii="Consolas" w:hAnsi="Consolas" w:eastAsia="Consolas"/>
+          <w:sz w:val="16"/>
+        </w:rPr>
+        <w:t xml:space="preserve">    DIR --&gt;|"supervisor"| ENG["Engineer-only directory"]</w:t>
+      </w:r>
+    </w:p>
+    <w:p>
+      <w:pPr>
+        <w:spacing w:after="0"/>
+        <w:ind w:left="283"/>
+      </w:pPr>
+      <w:r>
+        <w:rPr>
+          <w:rFonts w:ascii="Consolas" w:hAnsi="Consolas" w:eastAsia="Consolas"/>
+          <w:sz w:val="16"/>
+        </w:rPr>
+        <w:t xml:space="preserve">    DIR --&gt;|"technical_admin"| ALL["Full role directory"]</w:t>
+      </w:r>
+    </w:p>
+    <w:p>
+      <w:pPr>
+        <w:spacing w:after="0"/>
+        <w:ind w:left="283"/>
+      </w:pPr>
+      <w:r>
+        <w:rPr>
+          <w:rFonts w:ascii="Consolas" w:hAnsi="Consolas" w:eastAsia="Consolas"/>
+          <w:sz w:val="16"/>
+        </w:rPr>
+        <w:t xml:space="preserve">    DENY --&gt; AUDIT</w:t>
+      </w:r>
+    </w:p>
+    <w:p>
+      <w:pPr>
+        <w:spacing w:after="0"/>
+        <w:ind w:left="283"/>
+      </w:pPr>
+      <w:r>
+        <w:rPr>
+          <w:rFonts w:ascii="Consolas" w:hAnsi="Consolas" w:eastAsia="Consolas"/>
+          <w:sz w:val="16"/>
+        </w:rPr>
+        <w:t>```</w:t>
+      </w:r>
+    </w:p>
+    <w:p>
+      <w:pPr>
+        <w:spacing w:after="120" w:line="240" w:lineRule="auto"/>
       </w:pPr>
       <w:r>
         <w:rPr>
@@ -3251,84 +6036,934 @@
           <w:i w:val="0"/>
           <w:sz w:val="28"/>
         </w:rPr>
-        <w:t>Создать flowchart слева направо с блоками: 1 Login -&gt; 2 Access token and active user -&gt; 3 Create/list assets and requests -&gt; 4 Supervisor assigns engineer.</w:t>
+        <w:t>Таблица потоков для данной диаграммы:</w:t>
       </w:r>
     </w:p>
-    <w:p>
-      <w:pPr>
-        <w:pStyle w:val="ListBullet"/>
-        <w:spacing w:after="40"/>
-      </w:pPr>
-      <w:r>
-        <w:rPr>
-          <w:rFonts w:ascii="Times New Roman" w:hAnsi="Times New Roman" w:eastAsia="Times New Roman"/>
-          <w:b w:val="0"/>
-          <w:i w:val="0"/>
-          <w:sz w:val="28"/>
-        </w:rPr>
-        <w:t>От блока 4 сделать синюю ветку вниз/влево к 5 Assigned engineer starts work -&gt; 6 Assigned engineer completes work -&gt; 7 Audit + report.</w:t>
-      </w:r>
-    </w:p>
-    <w:p>
-      <w:pPr>
-        <w:pStyle w:val="ListBullet"/>
-        <w:spacing w:after="40"/>
-      </w:pPr>
-      <w:r>
-        <w:rPr>
-          <w:rFonts w:ascii="Times New Roman" w:hAnsi="Times New Roman" w:eastAsia="Times New Roman"/>
-          <w:b w:val="0"/>
-          <w:i w:val="0"/>
-          <w:sz w:val="28"/>
-        </w:rPr>
-        <w:t>От блока 4 сделать красную запрещенную ветку вниз к Forbidden path: supervisor start/complete -&gt; 403.</w:t>
-      </w:r>
-    </w:p>
-    <w:p>
-      <w:pPr>
-        <w:pStyle w:val="ListBullet"/>
-        <w:spacing w:after="40"/>
-      </w:pPr>
-      <w:r>
-        <w:rPr>
-          <w:rFonts w:ascii="Times New Roman" w:hAnsi="Times New Roman" w:eastAsia="Times New Roman"/>
-          <w:b w:val="0"/>
-          <w:i w:val="0"/>
-          <w:sz w:val="28"/>
-        </w:rPr>
-        <w:t>В каждом синем блоке написать контроль: neutral auth error, role loaded, bounded offset, object-level check, no secret audit.</w:t>
-      </w:r>
-    </w:p>
-    <w:p>
-      <w:pPr>
-        <w:pStyle w:val="ListBullet"/>
-        <w:spacing w:after="40"/>
-      </w:pPr>
-      <w:r>
-        <w:rPr>
-          <w:rFonts w:ascii="Times New Roman" w:hAnsi="Times New Roman" w:eastAsia="Times New Roman"/>
-          <w:b w:val="0"/>
-          <w:i w:val="0"/>
-          <w:sz w:val="28"/>
-        </w:rPr>
-        <w:t>Рядом с запрещенной веткой добавить подпись: P5-01 / CWE-863 / supervisor is authenticated but not authorized for assigned engineer work.</w:t>
-      </w:r>
-    </w:p>
-    <w:p>
-      <w:pPr>
-        <w:pStyle w:val="ListBullet"/>
-        <w:spacing w:after="40"/>
-      </w:pPr>
-      <w:r>
-        <w:rPr>
-          <w:rFonts w:ascii="Times New Roman" w:hAnsi="Times New Roman" w:eastAsia="Times New Roman"/>
-          <w:b w:val="0"/>
-          <w:i w:val="0"/>
-          <w:sz w:val="28"/>
-        </w:rPr>
-        <w:t>Экспортировать как PNG/SVG и вставить в отчет как Рисунок 3 перед role/access matrix.</w:t>
-      </w:r>
-    </w:p>
+    <w:tbl>
+      <w:tblPr>
+        <w:tblStyle w:val="TableGrid"/>
+        <w:tblW w:type="dxa" w:w="15363"/>
+        <w:tblLayout w:type="fixed"/>
+        <w:tblLook w:firstColumn="1" w:firstRow="1" w:lastColumn="0" w:lastRow="0" w:noHBand="0" w:noVBand="1" w:val="04A0"/>
+      </w:tblPr>
+      <w:tblGrid>
+        <w:gridCol w:w="1133"/>
+        <w:gridCol w:w="3004"/>
+        <w:gridCol w:w="3004"/>
+        <w:gridCol w:w="3798"/>
+        <w:gridCol w:w="4422"/>
+      </w:tblGrid>
+      <w:tr>
+        <w:tc>
+          <w:tcPr>
+            <w:tcW w:type="dxa" w:w="1133"/>
+            <w:vAlign w:val="center"/>
+            <w:tcMar>
+              <w:top w:w="90" w:type="dxa"/>
+              <w:start w:w="90" w:type="dxa"/>
+              <w:bottom w:w="90" w:type="dxa"/>
+              <w:end w:w="90" w:type="dxa"/>
+            </w:tcMar>
+          </w:tcPr>
+          <w:p>
+            <w:r>
+              <w:rPr>
+                <w:rFonts w:ascii="Times New Roman" w:hAnsi="Times New Roman" w:eastAsia="Times New Roman"/>
+                <w:b/>
+                <w:i w:val="0"/>
+                <w:sz w:val="16"/>
+              </w:rPr>
+              <w:t>Flow ID</w:t>
+            </w:r>
+          </w:p>
+        </w:tc>
+        <w:tc>
+          <w:tcPr>
+            <w:tcW w:type="dxa" w:w="3004"/>
+            <w:vAlign w:val="center"/>
+            <w:tcMar>
+              <w:top w:w="90" w:type="dxa"/>
+              <w:start w:w="90" w:type="dxa"/>
+              <w:bottom w:w="90" w:type="dxa"/>
+              <w:end w:w="90" w:type="dxa"/>
+            </w:tcMar>
+          </w:tcPr>
+          <w:p>
+            <w:r>
+              <w:rPr>
+                <w:rFonts w:ascii="Times New Roman" w:hAnsi="Times New Roman" w:eastAsia="Times New Roman"/>
+                <w:b/>
+                <w:i w:val="0"/>
+                <w:sz w:val="16"/>
+              </w:rPr>
+              <w:t>Source</w:t>
+            </w:r>
+          </w:p>
+        </w:tc>
+        <w:tc>
+          <w:tcPr>
+            <w:tcW w:type="dxa" w:w="3004"/>
+            <w:vAlign w:val="center"/>
+            <w:tcMar>
+              <w:top w:w="90" w:type="dxa"/>
+              <w:start w:w="90" w:type="dxa"/>
+              <w:bottom w:w="90" w:type="dxa"/>
+              <w:end w:w="90" w:type="dxa"/>
+            </w:tcMar>
+          </w:tcPr>
+          <w:p>
+            <w:r>
+              <w:rPr>
+                <w:rFonts w:ascii="Times New Roman" w:hAnsi="Times New Roman" w:eastAsia="Times New Roman"/>
+                <w:b/>
+                <w:i w:val="0"/>
+                <w:sz w:val="16"/>
+              </w:rPr>
+              <w:t>Target</w:t>
+            </w:r>
+          </w:p>
+        </w:tc>
+        <w:tc>
+          <w:tcPr>
+            <w:tcW w:type="dxa" w:w="3798"/>
+            <w:vAlign w:val="center"/>
+            <w:tcMar>
+              <w:top w:w="90" w:type="dxa"/>
+              <w:start w:w="90" w:type="dxa"/>
+              <w:bottom w:w="90" w:type="dxa"/>
+              <w:end w:w="90" w:type="dxa"/>
+            </w:tcMar>
+          </w:tcPr>
+          <w:p>
+            <w:r>
+              <w:rPr>
+                <w:rFonts w:ascii="Times New Roman" w:hAnsi="Times New Roman" w:eastAsia="Times New Roman"/>
+                <w:b/>
+                <w:i w:val="0"/>
+                <w:sz w:val="16"/>
+              </w:rPr>
+              <w:t>Data / Action</w:t>
+            </w:r>
+          </w:p>
+        </w:tc>
+        <w:tc>
+          <w:tcPr>
+            <w:tcW w:type="dxa" w:w="4422"/>
+            <w:vAlign w:val="center"/>
+            <w:tcMar>
+              <w:top w:w="90" w:type="dxa"/>
+              <w:start w:w="90" w:type="dxa"/>
+              <w:bottom w:w="90" w:type="dxa"/>
+              <w:end w:w="90" w:type="dxa"/>
+            </w:tcMar>
+          </w:tcPr>
+          <w:p>
+            <w:r>
+              <w:rPr>
+                <w:rFonts w:ascii="Times New Roman" w:hAnsi="Times New Roman" w:eastAsia="Times New Roman"/>
+                <w:b/>
+                <w:i w:val="0"/>
+                <w:sz w:val="16"/>
+              </w:rPr>
+              <w:t>Control / Protection</w:t>
+            </w:r>
+          </w:p>
+        </w:tc>
+      </w:tr>
+      <w:tr>
+        <w:tc>
+          <w:tcPr>
+            <w:tcW w:type="dxa" w:w="1133"/>
+            <w:vAlign w:val="center"/>
+            <w:tcMar>
+              <w:top w:w="90" w:type="dxa"/>
+              <w:start w:w="90" w:type="dxa"/>
+              <w:bottom w:w="90" w:type="dxa"/>
+              <w:end w:w="90" w:type="dxa"/>
+            </w:tcMar>
+          </w:tcPr>
+          <w:p>
+            <w:pPr>
+              <w:spacing w:after="0"/>
+            </w:pPr>
+            <w:r>
+              <w:rPr>
+                <w:rFonts w:ascii="Times New Roman" w:hAnsi="Times New Roman" w:eastAsia="Times New Roman"/>
+                <w:b w:val="0"/>
+                <w:i w:val="0"/>
+                <w:sz w:val="16"/>
+              </w:rPr>
+              <w:t>F1</w:t>
+            </w:r>
+          </w:p>
+        </w:tc>
+        <w:tc>
+          <w:tcPr>
+            <w:tcW w:type="dxa" w:w="3004"/>
+            <w:vAlign w:val="center"/>
+            <w:tcMar>
+              <w:top w:w="90" w:type="dxa"/>
+              <w:start w:w="90" w:type="dxa"/>
+              <w:bottom w:w="90" w:type="dxa"/>
+              <w:end w:w="90" w:type="dxa"/>
+            </w:tcMar>
+          </w:tcPr>
+          <w:p>
+            <w:pPr>
+              <w:spacing w:after="0"/>
+            </w:pPr>
+            <w:r>
+              <w:rPr>
+                <w:rFonts w:ascii="Times New Roman" w:hAnsi="Times New Roman" w:eastAsia="Times New Roman"/>
+                <w:b w:val="0"/>
+                <w:i w:val="0"/>
+                <w:sz w:val="16"/>
+              </w:rPr>
+              <w:t>Login request</w:t>
+            </w:r>
+          </w:p>
+        </w:tc>
+        <w:tc>
+          <w:tcPr>
+            <w:tcW w:type="dxa" w:w="3004"/>
+            <w:vAlign w:val="center"/>
+            <w:tcMar>
+              <w:top w:w="90" w:type="dxa"/>
+              <w:start w:w="90" w:type="dxa"/>
+              <w:bottom w:w="90" w:type="dxa"/>
+              <w:end w:w="90" w:type="dxa"/>
+            </w:tcMar>
+          </w:tcPr>
+          <w:p>
+            <w:pPr>
+              <w:spacing w:after="0"/>
+            </w:pPr>
+            <w:r>
+              <w:rPr>
+                <w:rFonts w:ascii="Times New Roman" w:hAnsi="Times New Roman" w:eastAsia="Times New Roman"/>
+                <w:b w:val="0"/>
+                <w:i w:val="0"/>
+                <w:sz w:val="16"/>
+              </w:rPr>
+              <w:t>Authentication service</w:t>
+            </w:r>
+          </w:p>
+        </w:tc>
+        <w:tc>
+          <w:tcPr>
+            <w:tcW w:type="dxa" w:w="3798"/>
+            <w:vAlign w:val="center"/>
+            <w:tcMar>
+              <w:top w:w="90" w:type="dxa"/>
+              <w:start w:w="90" w:type="dxa"/>
+              <w:bottom w:w="90" w:type="dxa"/>
+              <w:end w:w="90" w:type="dxa"/>
+            </w:tcMar>
+          </w:tcPr>
+          <w:p>
+            <w:pPr>
+              <w:spacing w:after="0"/>
+            </w:pPr>
+            <w:r>
+              <w:rPr>
+                <w:rFonts w:ascii="Times New Roman" w:hAnsi="Times New Roman" w:eastAsia="Times New Roman"/>
+                <w:b w:val="0"/>
+                <w:i w:val="0"/>
+                <w:sz w:val="16"/>
+              </w:rPr>
+              <w:t>email and password</w:t>
+            </w:r>
+          </w:p>
+        </w:tc>
+        <w:tc>
+          <w:tcPr>
+            <w:tcW w:type="dxa" w:w="4422"/>
+            <w:vAlign w:val="center"/>
+            <w:tcMar>
+              <w:top w:w="90" w:type="dxa"/>
+              <w:start w:w="90" w:type="dxa"/>
+              <w:bottom w:w="90" w:type="dxa"/>
+              <w:end w:w="90" w:type="dxa"/>
+            </w:tcMar>
+          </w:tcPr>
+          <w:p>
+            <w:pPr>
+              <w:spacing w:after="0"/>
+            </w:pPr>
+            <w:r>
+              <w:rPr>
+                <w:rFonts w:ascii="Times New Roman" w:hAnsi="Times New Roman" w:eastAsia="Times New Roman"/>
+                <w:b w:val="0"/>
+                <w:i w:val="0"/>
+                <w:sz w:val="16"/>
+              </w:rPr>
+              <w:t>Password hash verification, dummy hash path, neutral error.</w:t>
+            </w:r>
+          </w:p>
+        </w:tc>
+      </w:tr>
+      <w:tr>
+        <w:tc>
+          <w:tcPr>
+            <w:tcW w:type="dxa" w:w="1133"/>
+            <w:vAlign w:val="center"/>
+            <w:tcMar>
+              <w:top w:w="90" w:type="dxa"/>
+              <w:start w:w="90" w:type="dxa"/>
+              <w:bottom w:w="90" w:type="dxa"/>
+              <w:end w:w="90" w:type="dxa"/>
+            </w:tcMar>
+          </w:tcPr>
+          <w:p>
+            <w:pPr>
+              <w:spacing w:after="0"/>
+            </w:pPr>
+            <w:r>
+              <w:rPr>
+                <w:rFonts w:ascii="Times New Roman" w:hAnsi="Times New Roman" w:eastAsia="Times New Roman"/>
+                <w:b w:val="0"/>
+                <w:i w:val="0"/>
+                <w:sz w:val="16"/>
+              </w:rPr>
+              <w:t>F2</w:t>
+            </w:r>
+          </w:p>
+        </w:tc>
+        <w:tc>
+          <w:tcPr>
+            <w:tcW w:type="dxa" w:w="3004"/>
+            <w:vAlign w:val="center"/>
+            <w:tcMar>
+              <w:top w:w="90" w:type="dxa"/>
+              <w:start w:w="90" w:type="dxa"/>
+              <w:bottom w:w="90" w:type="dxa"/>
+              <w:end w:w="90" w:type="dxa"/>
+            </w:tcMar>
+          </w:tcPr>
+          <w:p>
+            <w:pPr>
+              <w:spacing w:after="0"/>
+            </w:pPr>
+            <w:r>
+              <w:rPr>
+                <w:rFonts w:ascii="Times New Roman" w:hAnsi="Times New Roman" w:eastAsia="Times New Roman"/>
+                <w:b w:val="0"/>
+                <w:i w:val="0"/>
+                <w:sz w:val="16"/>
+              </w:rPr>
+              <w:t>Access token</w:t>
+            </w:r>
+          </w:p>
+        </w:tc>
+        <w:tc>
+          <w:tcPr>
+            <w:tcW w:type="dxa" w:w="3004"/>
+            <w:vAlign w:val="center"/>
+            <w:tcMar>
+              <w:top w:w="90" w:type="dxa"/>
+              <w:start w:w="90" w:type="dxa"/>
+              <w:bottom w:w="90" w:type="dxa"/>
+              <w:end w:w="90" w:type="dxa"/>
+            </w:tcMar>
+          </w:tcPr>
+          <w:p>
+            <w:pPr>
+              <w:spacing w:after="0"/>
+            </w:pPr>
+            <w:r>
+              <w:rPr>
+                <w:rFonts w:ascii="Times New Roman" w:hAnsi="Times New Roman" w:eastAsia="Times New Roman"/>
+                <w:b w:val="0"/>
+                <w:i w:val="0"/>
+                <w:sz w:val="16"/>
+              </w:rPr>
+              <w:t>Current user dependency</w:t>
+            </w:r>
+          </w:p>
+        </w:tc>
+        <w:tc>
+          <w:tcPr>
+            <w:tcW w:type="dxa" w:w="3798"/>
+            <w:vAlign w:val="center"/>
+            <w:tcMar>
+              <w:top w:w="90" w:type="dxa"/>
+              <w:start w:w="90" w:type="dxa"/>
+              <w:bottom w:w="90" w:type="dxa"/>
+              <w:end w:w="90" w:type="dxa"/>
+            </w:tcMar>
+          </w:tcPr>
+          <w:p>
+            <w:pPr>
+              <w:spacing w:after="0"/>
+            </w:pPr>
+            <w:r>
+              <w:rPr>
+                <w:rFonts w:ascii="Times New Roman" w:hAnsi="Times New Roman" w:eastAsia="Times New Roman"/>
+                <w:b w:val="0"/>
+                <w:i w:val="0"/>
+                <w:sz w:val="16"/>
+              </w:rPr>
+              <w:t>Bearer token</w:t>
+            </w:r>
+          </w:p>
+        </w:tc>
+        <w:tc>
+          <w:tcPr>
+            <w:tcW w:type="dxa" w:w="4422"/>
+            <w:vAlign w:val="center"/>
+            <w:tcMar>
+              <w:top w:w="90" w:type="dxa"/>
+              <w:start w:w="90" w:type="dxa"/>
+              <w:bottom w:w="90" w:type="dxa"/>
+              <w:end w:w="90" w:type="dxa"/>
+            </w:tcMar>
+          </w:tcPr>
+          <w:p>
+            <w:pPr>
+              <w:spacing w:after="0"/>
+            </w:pPr>
+            <w:r>
+              <w:rPr>
+                <w:rFonts w:ascii="Times New Roman" w:hAnsi="Times New Roman" w:eastAsia="Times New Roman"/>
+                <w:b w:val="0"/>
+                <w:i w:val="0"/>
+                <w:sz w:val="16"/>
+              </w:rPr>
+              <w:t>JWT validation and active user lookup.</w:t>
+            </w:r>
+          </w:p>
+        </w:tc>
+      </w:tr>
+      <w:tr>
+        <w:tc>
+          <w:tcPr>
+            <w:tcW w:type="dxa" w:w="1133"/>
+            <w:vAlign w:val="center"/>
+            <w:tcMar>
+              <w:top w:w="90" w:type="dxa"/>
+              <w:start w:w="90" w:type="dxa"/>
+              <w:bottom w:w="90" w:type="dxa"/>
+              <w:end w:w="90" w:type="dxa"/>
+            </w:tcMar>
+          </w:tcPr>
+          <w:p>
+            <w:pPr>
+              <w:spacing w:after="0"/>
+            </w:pPr>
+            <w:r>
+              <w:rPr>
+                <w:rFonts w:ascii="Times New Roman" w:hAnsi="Times New Roman" w:eastAsia="Times New Roman"/>
+                <w:b w:val="0"/>
+                <w:i w:val="0"/>
+                <w:sz w:val="16"/>
+              </w:rPr>
+              <w:t>F3</w:t>
+            </w:r>
+          </w:p>
+        </w:tc>
+        <w:tc>
+          <w:tcPr>
+            <w:tcW w:type="dxa" w:w="3004"/>
+            <w:vAlign w:val="center"/>
+            <w:tcMar>
+              <w:top w:w="90" w:type="dxa"/>
+              <w:start w:w="90" w:type="dxa"/>
+              <w:bottom w:w="90" w:type="dxa"/>
+              <w:end w:w="90" w:type="dxa"/>
+            </w:tcMar>
+          </w:tcPr>
+          <w:p>
+            <w:pPr>
+              <w:spacing w:after="0"/>
+            </w:pPr>
+            <w:r>
+              <w:rPr>
+                <w:rFonts w:ascii="Times New Roman" w:hAnsi="Times New Roman" w:eastAsia="Times New Roman"/>
+                <w:b w:val="0"/>
+                <w:i w:val="0"/>
+                <w:sz w:val="16"/>
+              </w:rPr>
+              <w:t>Supervisor</w:t>
+            </w:r>
+          </w:p>
+        </w:tc>
+        <w:tc>
+          <w:tcPr>
+            <w:tcW w:type="dxa" w:w="3004"/>
+            <w:vAlign w:val="center"/>
+            <w:tcMar>
+              <w:top w:w="90" w:type="dxa"/>
+              <w:start w:w="90" w:type="dxa"/>
+              <w:bottom w:w="90" w:type="dxa"/>
+              <w:end w:w="90" w:type="dxa"/>
+            </w:tcMar>
+          </w:tcPr>
+          <w:p>
+            <w:pPr>
+              <w:spacing w:after="0"/>
+            </w:pPr>
+            <w:r>
+              <w:rPr>
+                <w:rFonts w:ascii="Times New Roman" w:hAnsi="Times New Roman" w:eastAsia="Times New Roman"/>
+                <w:b w:val="0"/>
+                <w:i w:val="0"/>
+                <w:sz w:val="16"/>
+              </w:rPr>
+              <w:t>Assigned request</w:t>
+            </w:r>
+          </w:p>
+        </w:tc>
+        <w:tc>
+          <w:tcPr>
+            <w:tcW w:type="dxa" w:w="3798"/>
+            <w:vAlign w:val="center"/>
+            <w:tcMar>
+              <w:top w:w="90" w:type="dxa"/>
+              <w:start w:w="90" w:type="dxa"/>
+              <w:bottom w:w="90" w:type="dxa"/>
+              <w:end w:w="90" w:type="dxa"/>
+            </w:tcMar>
+          </w:tcPr>
+          <w:p>
+            <w:pPr>
+              <w:spacing w:after="0"/>
+            </w:pPr>
+            <w:r>
+              <w:rPr>
+                <w:rFonts w:ascii="Times New Roman" w:hAnsi="Times New Roman" w:eastAsia="Times New Roman"/>
+                <w:b w:val="0"/>
+                <w:i w:val="0"/>
+                <w:sz w:val="16"/>
+              </w:rPr>
+              <w:t>assign engineer action</w:t>
+            </w:r>
+          </w:p>
+        </w:tc>
+        <w:tc>
+          <w:tcPr>
+            <w:tcW w:type="dxa" w:w="4422"/>
+            <w:vAlign w:val="center"/>
+            <w:tcMar>
+              <w:top w:w="90" w:type="dxa"/>
+              <w:start w:w="90" w:type="dxa"/>
+              <w:bottom w:w="90" w:type="dxa"/>
+              <w:end w:w="90" w:type="dxa"/>
+            </w:tcMar>
+          </w:tcPr>
+          <w:p>
+            <w:pPr>
+              <w:spacing w:after="0"/>
+            </w:pPr>
+            <w:r>
+              <w:rPr>
+                <w:rFonts w:ascii="Times New Roman" w:hAnsi="Times New Roman" w:eastAsia="Times New Roman"/>
+                <w:b w:val="0"/>
+                <w:i w:val="0"/>
+                <w:sz w:val="16"/>
+              </w:rPr>
+              <w:t>Privileged assign/cancel allowed by role check.</w:t>
+            </w:r>
+          </w:p>
+        </w:tc>
+      </w:tr>
+      <w:tr>
+        <w:tc>
+          <w:tcPr>
+            <w:tcW w:type="dxa" w:w="1133"/>
+            <w:vAlign w:val="center"/>
+            <w:tcMar>
+              <w:top w:w="90" w:type="dxa"/>
+              <w:start w:w="90" w:type="dxa"/>
+              <w:bottom w:w="90" w:type="dxa"/>
+              <w:end w:w="90" w:type="dxa"/>
+            </w:tcMar>
+          </w:tcPr>
+          <w:p>
+            <w:pPr>
+              <w:spacing w:after="0"/>
+            </w:pPr>
+            <w:r>
+              <w:rPr>
+                <w:rFonts w:ascii="Times New Roman" w:hAnsi="Times New Roman" w:eastAsia="Times New Roman"/>
+                <w:b w:val="0"/>
+                <w:i w:val="0"/>
+                <w:sz w:val="16"/>
+              </w:rPr>
+              <w:t>F4</w:t>
+            </w:r>
+          </w:p>
+        </w:tc>
+        <w:tc>
+          <w:tcPr>
+            <w:tcW w:type="dxa" w:w="3004"/>
+            <w:vAlign w:val="center"/>
+            <w:tcMar>
+              <w:top w:w="90" w:type="dxa"/>
+              <w:start w:w="90" w:type="dxa"/>
+              <w:bottom w:w="90" w:type="dxa"/>
+              <w:end w:w="90" w:type="dxa"/>
+            </w:tcMar>
+          </w:tcPr>
+          <w:p>
+            <w:pPr>
+              <w:spacing w:after="0"/>
+            </w:pPr>
+            <w:r>
+              <w:rPr>
+                <w:rFonts w:ascii="Times New Roman" w:hAnsi="Times New Roman" w:eastAsia="Times New Roman"/>
+                <w:b w:val="0"/>
+                <w:i w:val="0"/>
+                <w:sz w:val="16"/>
+              </w:rPr>
+              <w:t>Assigned engineer</w:t>
+            </w:r>
+          </w:p>
+        </w:tc>
+        <w:tc>
+          <w:tcPr>
+            <w:tcW w:type="dxa" w:w="3004"/>
+            <w:vAlign w:val="center"/>
+            <w:tcMar>
+              <w:top w:w="90" w:type="dxa"/>
+              <w:start w:w="90" w:type="dxa"/>
+              <w:bottom w:w="90" w:type="dxa"/>
+              <w:end w:w="90" w:type="dxa"/>
+            </w:tcMar>
+          </w:tcPr>
+          <w:p>
+            <w:pPr>
+              <w:spacing w:after="0"/>
+            </w:pPr>
+            <w:r>
+              <w:rPr>
+                <w:rFonts w:ascii="Times New Roman" w:hAnsi="Times New Roman" w:eastAsia="Times New Roman"/>
+                <w:b w:val="0"/>
+                <w:i w:val="0"/>
+                <w:sz w:val="16"/>
+              </w:rPr>
+              <w:t>Status transition</w:t>
+            </w:r>
+          </w:p>
+        </w:tc>
+        <w:tc>
+          <w:tcPr>
+            <w:tcW w:type="dxa" w:w="3798"/>
+            <w:vAlign w:val="center"/>
+            <w:tcMar>
+              <w:top w:w="90" w:type="dxa"/>
+              <w:start w:w="90" w:type="dxa"/>
+              <w:bottom w:w="90" w:type="dxa"/>
+              <w:end w:w="90" w:type="dxa"/>
+            </w:tcMar>
+          </w:tcPr>
+          <w:p>
+            <w:pPr>
+              <w:spacing w:after="0"/>
+            </w:pPr>
+            <w:r>
+              <w:rPr>
+                <w:rFonts w:ascii="Times New Roman" w:hAnsi="Times New Roman" w:eastAsia="Times New Roman"/>
+                <w:b w:val="0"/>
+                <w:i w:val="0"/>
+                <w:sz w:val="16"/>
+              </w:rPr>
+              <w:t>in_progress and completed</w:t>
+            </w:r>
+          </w:p>
+        </w:tc>
+        <w:tc>
+          <w:tcPr>
+            <w:tcW w:type="dxa" w:w="4422"/>
+            <w:vAlign w:val="center"/>
+            <w:tcMar>
+              <w:top w:w="90" w:type="dxa"/>
+              <w:start w:w="90" w:type="dxa"/>
+              <w:bottom w:w="90" w:type="dxa"/>
+              <w:end w:w="90" w:type="dxa"/>
+            </w:tcMar>
+          </w:tcPr>
+          <w:p>
+            <w:pPr>
+              <w:spacing w:after="0"/>
+            </w:pPr>
+            <w:r>
+              <w:rPr>
+                <w:rFonts w:ascii="Times New Roman" w:hAnsi="Times New Roman" w:eastAsia="Times New Roman"/>
+                <w:b w:val="0"/>
+                <w:i w:val="0"/>
+                <w:sz w:val="16"/>
+              </w:rPr>
+              <w:t>Object-level check: actor id equals assigned_engineer_id.</w:t>
+            </w:r>
+          </w:p>
+        </w:tc>
+      </w:tr>
+      <w:tr>
+        <w:tc>
+          <w:tcPr>
+            <w:tcW w:type="dxa" w:w="1133"/>
+            <w:vAlign w:val="center"/>
+            <w:tcMar>
+              <w:top w:w="90" w:type="dxa"/>
+              <w:start w:w="90" w:type="dxa"/>
+              <w:bottom w:w="90" w:type="dxa"/>
+              <w:end w:w="90" w:type="dxa"/>
+            </w:tcMar>
+          </w:tcPr>
+          <w:p>
+            <w:pPr>
+              <w:spacing w:after="0"/>
+            </w:pPr>
+            <w:r>
+              <w:rPr>
+                <w:rFonts w:ascii="Times New Roman" w:hAnsi="Times New Roman" w:eastAsia="Times New Roman"/>
+                <w:b w:val="0"/>
+                <w:i w:val="0"/>
+                <w:sz w:val="16"/>
+              </w:rPr>
+              <w:t>F5</w:t>
+            </w:r>
+          </w:p>
+        </w:tc>
+        <w:tc>
+          <w:tcPr>
+            <w:tcW w:type="dxa" w:w="3004"/>
+            <w:vAlign w:val="center"/>
+            <w:tcMar>
+              <w:top w:w="90" w:type="dxa"/>
+              <w:start w:w="90" w:type="dxa"/>
+              <w:bottom w:w="90" w:type="dxa"/>
+              <w:end w:w="90" w:type="dxa"/>
+            </w:tcMar>
+          </w:tcPr>
+          <w:p>
+            <w:pPr>
+              <w:spacing w:after="0"/>
+            </w:pPr>
+            <w:r>
+              <w:rPr>
+                <w:rFonts w:ascii="Times New Roman" w:hAnsi="Times New Roman" w:eastAsia="Times New Roman"/>
+                <w:b w:val="0"/>
+                <w:i w:val="0"/>
+                <w:sz w:val="16"/>
+              </w:rPr>
+              <w:t>Supervisor/admin</w:t>
+            </w:r>
+          </w:p>
+        </w:tc>
+        <w:tc>
+          <w:tcPr>
+            <w:tcW w:type="dxa" w:w="3004"/>
+            <w:vAlign w:val="center"/>
+            <w:tcMar>
+              <w:top w:w="90" w:type="dxa"/>
+              <w:start w:w="90" w:type="dxa"/>
+              <w:bottom w:w="90" w:type="dxa"/>
+              <w:end w:w="90" w:type="dxa"/>
+            </w:tcMar>
+          </w:tcPr>
+          <w:p>
+            <w:pPr>
+              <w:spacing w:after="0"/>
+            </w:pPr>
+            <w:r>
+              <w:rPr>
+                <w:rFonts w:ascii="Times New Roman" w:hAnsi="Times New Roman" w:eastAsia="Times New Roman"/>
+                <w:b w:val="0"/>
+                <w:i w:val="0"/>
+                <w:sz w:val="16"/>
+              </w:rPr>
+              <w:t>Forbidden status transition</w:t>
+            </w:r>
+          </w:p>
+        </w:tc>
+        <w:tc>
+          <w:tcPr>
+            <w:tcW w:type="dxa" w:w="3798"/>
+            <w:vAlign w:val="center"/>
+            <w:tcMar>
+              <w:top w:w="90" w:type="dxa"/>
+              <w:start w:w="90" w:type="dxa"/>
+              <w:bottom w:w="90" w:type="dxa"/>
+              <w:end w:w="90" w:type="dxa"/>
+            </w:tcMar>
+          </w:tcPr>
+          <w:p>
+            <w:pPr>
+              <w:spacing w:after="0"/>
+            </w:pPr>
+            <w:r>
+              <w:rPr>
+                <w:rFonts w:ascii="Times New Roman" w:hAnsi="Times New Roman" w:eastAsia="Times New Roman"/>
+                <w:b w:val="0"/>
+                <w:i w:val="0"/>
+                <w:sz w:val="16"/>
+              </w:rPr>
+              <w:t>start/complete attempt</w:t>
+            </w:r>
+          </w:p>
+        </w:tc>
+        <w:tc>
+          <w:tcPr>
+            <w:tcW w:type="dxa" w:w="4422"/>
+            <w:vAlign w:val="center"/>
+            <w:tcMar>
+              <w:top w:w="90" w:type="dxa"/>
+              <w:start w:w="90" w:type="dxa"/>
+              <w:bottom w:w="90" w:type="dxa"/>
+              <w:end w:w="90" w:type="dxa"/>
+            </w:tcMar>
+          </w:tcPr>
+          <w:p>
+            <w:pPr>
+              <w:spacing w:after="0"/>
+            </w:pPr>
+            <w:r>
+              <w:rPr>
+                <w:rFonts w:ascii="Times New Roman" w:hAnsi="Times New Roman" w:eastAsia="Times New Roman"/>
+                <w:b w:val="0"/>
+                <w:i w:val="0"/>
+                <w:sz w:val="16"/>
+              </w:rPr>
+              <w:t>HTTP 403 because privileged role is not assigned engineer.</w:t>
+            </w:r>
+          </w:p>
+        </w:tc>
+      </w:tr>
+      <w:tr>
+        <w:tc>
+          <w:tcPr>
+            <w:tcW w:type="dxa" w:w="1133"/>
+            <w:vAlign w:val="center"/>
+            <w:tcMar>
+              <w:top w:w="90" w:type="dxa"/>
+              <w:start w:w="90" w:type="dxa"/>
+              <w:bottom w:w="90" w:type="dxa"/>
+              <w:end w:w="90" w:type="dxa"/>
+            </w:tcMar>
+          </w:tcPr>
+          <w:p>
+            <w:pPr>
+              <w:spacing w:after="0"/>
+            </w:pPr>
+            <w:r>
+              <w:rPr>
+                <w:rFonts w:ascii="Times New Roman" w:hAnsi="Times New Roman" w:eastAsia="Times New Roman"/>
+                <w:b w:val="0"/>
+                <w:i w:val="0"/>
+                <w:sz w:val="16"/>
+              </w:rPr>
+              <w:t>F6</w:t>
+            </w:r>
+          </w:p>
+        </w:tc>
+        <w:tc>
+          <w:tcPr>
+            <w:tcW w:type="dxa" w:w="3004"/>
+            <w:vAlign w:val="center"/>
+            <w:tcMar>
+              <w:top w:w="90" w:type="dxa"/>
+              <w:start w:w="90" w:type="dxa"/>
+              <w:bottom w:w="90" w:type="dxa"/>
+              <w:end w:w="90" w:type="dxa"/>
+            </w:tcMar>
+          </w:tcPr>
+          <w:p>
+            <w:pPr>
+              <w:spacing w:after="0"/>
+            </w:pPr>
+            <w:r>
+              <w:rPr>
+                <w:rFonts w:ascii="Times New Roman" w:hAnsi="Times New Roman" w:eastAsia="Times New Roman"/>
+                <w:b w:val="0"/>
+                <w:i w:val="0"/>
+                <w:sz w:val="16"/>
+              </w:rPr>
+              <w:t>Directory request</w:t>
+            </w:r>
+          </w:p>
+        </w:tc>
+        <w:tc>
+          <w:tcPr>
+            <w:tcW w:type="dxa" w:w="3004"/>
+            <w:vAlign w:val="center"/>
+            <w:tcMar>
+              <w:top w:w="90" w:type="dxa"/>
+              <w:start w:w="90" w:type="dxa"/>
+              <w:bottom w:w="90" w:type="dxa"/>
+              <w:end w:w="90" w:type="dxa"/>
+            </w:tcMar>
+          </w:tcPr>
+          <w:p>
+            <w:pPr>
+              <w:spacing w:after="0"/>
+            </w:pPr>
+            <w:r>
+              <w:rPr>
+                <w:rFonts w:ascii="Times New Roman" w:hAnsi="Times New Roman" w:eastAsia="Times New Roman"/>
+                <w:b w:val="0"/>
+                <w:i w:val="0"/>
+                <w:sz w:val="16"/>
+              </w:rPr>
+              <w:t>User listing response</w:t>
+            </w:r>
+          </w:p>
+        </w:tc>
+        <w:tc>
+          <w:tcPr>
+            <w:tcW w:type="dxa" w:w="3798"/>
+            <w:vAlign w:val="center"/>
+            <w:tcMar>
+              <w:top w:w="90" w:type="dxa"/>
+              <w:start w:w="90" w:type="dxa"/>
+              <w:bottom w:w="90" w:type="dxa"/>
+              <w:end w:w="90" w:type="dxa"/>
+            </w:tcMar>
+          </w:tcPr>
+          <w:p>
+            <w:pPr>
+              <w:spacing w:after="0"/>
+            </w:pPr>
+            <w:r>
+              <w:rPr>
+                <w:rFonts w:ascii="Times New Roman" w:hAnsi="Times New Roman" w:eastAsia="Times New Roman"/>
+                <w:b w:val="0"/>
+                <w:i w:val="0"/>
+                <w:sz w:val="16"/>
+              </w:rPr>
+              <w:t>role filter</w:t>
+            </w:r>
+          </w:p>
+        </w:tc>
+        <w:tc>
+          <w:tcPr>
+            <w:tcW w:type="dxa" w:w="4422"/>
+            <w:vAlign w:val="center"/>
+            <w:tcMar>
+              <w:top w:w="90" w:type="dxa"/>
+              <w:start w:w="90" w:type="dxa"/>
+              <w:bottom w:w="90" w:type="dxa"/>
+              <w:end w:w="90" w:type="dxa"/>
+            </w:tcMar>
+          </w:tcPr>
+          <w:p>
+            <w:pPr>
+              <w:spacing w:after="0"/>
+            </w:pPr>
+            <w:r>
+              <w:rPr>
+                <w:rFonts w:ascii="Times New Roman" w:hAnsi="Times New Roman" w:eastAsia="Times New Roman"/>
+                <w:b w:val="0"/>
+                <w:i w:val="0"/>
+                <w:sz w:val="16"/>
+              </w:rPr>
+              <w:t>Supervisor forced to engineer scope; technical admin can list all roles.</w:t>
+            </w:r>
+          </w:p>
+        </w:tc>
+      </w:tr>
+    </w:tbl>
+    <w:p/>
     <w:tbl>
       <w:tblPr>
         <w:tblStyle w:val="TableGrid"/>
@@ -10006,7 +13641,7 @@
           <w:i w:val="0"/>
           <w:sz w:val="28"/>
         </w:rPr>
-        <w:t>Финальная проверка показывает, что приложение запускается и проходит regression tests, SAST и SCA. В отчет включены structural scheme, flowchart, trust boundary map, role/access matrix, vulnerability table, CWE, CVSS v4.0 vectors, before/after code fragments и proof-fixed tests. Для LMS вместе с отчетом следует отправить папку mvp с исправленным исходным кодом.</w:t>
+        <w:t>Результаты подтверждены regression tests, SAST, SCA и статической проверкой типов. В отчет включены Mermaid-код структурной схемы, карта trust boundaries, flowchart принятия решения о доступе, role/access matrix, таблица уязвимостей, классификация CWE, CVSS v4.0 vectors, фрагменты кода до и после исправления, а также proof-fixed tests. Для LMS вместе с отчетом предоставляется папка mvp с исправленным исходным кодом.</w:t>
       </w:r>
     </w:p>
     <w:p>
@@ -10020,7 +13655,7 @@
           <w:i w:val="0"/>
           <w:sz w:val="28"/>
         </w:rPr>
-        <w:t>Ручные скриншоты не являются обязательными, потому что требование P5 допускает screenshots or logs proving fixes, а в отчете уже есть воспроизводимые command logs. Если преподаватель ожидает именно визуальные доказательства, лучше вручную добавить один скрин терминала с pytest/SAST output и один скрин Swagger/API или браузерной страницы /app/. Диаграммы уже сгенерированы и встроены в отчет; вручную их имеет смысл перерисовывать только для более полированного оформления в draw.io или Word.</w:t>
+        <w:t>Подтверждающие материалы представлены в виде воспроизводимых команд валидации и таблиц результатов. Формат соответствует требованию P5 о наличии screenshots or logs proving fixes: для каждого исправления указан проверочный тест или инструментальный результат, а диаграммы даны как Mermaid-код, пригодный для импорта в draw.io.</w:t>
       </w:r>
     </w:p>
     <w:sectPr>

</xml_diff>

<commit_message>
Convert P5 report diagrams to D2
</commit_message>
<xml_diff>
--- a/materials/p5-output/P5 Comprehensive MVP security analysis.docx
+++ b/materials/p5-output/P5 Comprehensive MVP security analysis.docx
@@ -125,7 +125,7 @@
           <w:i w:val="0"/>
           <w:sz w:val="28"/>
         </w:rPr>
-        <w:t>Листинг 1. Mermaid-код структурной схемы MVP и trust boundaries.</w:t>
+        <w:t>Листинг 1. D2-код структурной схемы MVP и trust boundaries.</w:t>
       </w:r>
     </w:p>
     <w:p>
@@ -139,7 +139,7 @@
           <w:i w:val="0"/>
           <w:sz w:val="28"/>
         </w:rPr>
-        <w:t>Код ниже может быть импортирован в draw.io через Insert -&gt; Advanced -&gt; Mermaid. Диаграмма показывает внешнюю недоверенную зону, границу доверия приложения и основные компоненты обработки данных.</w:t>
+        <w:t>Код ниже описывает структурную схему в формате D2. Его можно отрендерить через D2 CLI в SVG и вставить в draw.io или Word. Диаграмма показывает внешнюю недоверенную зону, границу доверия приложения и основные компоненты обработки данных.</w:t>
       </w:r>
     </w:p>
     <w:p>
@@ -152,7 +152,7 @@
           <w:rFonts w:ascii="Consolas" w:hAnsi="Consolas" w:eastAsia="Consolas"/>
           <w:sz w:val="16"/>
         </w:rPr>
-        <w:t>```mermaid</w:t>
+        <w:t>```d2</w:t>
       </w:r>
     </w:p>
     <w:p>
@@ -165,7 +165,7 @@
           <w:rFonts w:ascii="Consolas" w:hAnsi="Consolas" w:eastAsia="Consolas"/>
           <w:sz w:val="16"/>
         </w:rPr>
-        <w:t>flowchart LR</w:t>
+        <w:t>direction: right</w:t>
       </w:r>
     </w:p>
     <w:p>
@@ -178,7 +178,6 @@
           <w:rFonts w:ascii="Consolas" w:hAnsi="Consolas" w:eastAsia="Consolas"/>
           <w:sz w:val="16"/>
         </w:rPr>
-        <w:t xml:space="preserve">    subgraph EXT["External / untrusted zone"]</w:t>
       </w:r>
     </w:p>
     <w:p>
@@ -191,7 +190,7 @@
           <w:rFonts w:ascii="Consolas" w:hAnsi="Consolas" w:eastAsia="Consolas"/>
           <w:sz w:val="16"/>
         </w:rPr>
-        <w:t xml:space="preserve">        C["Browser / API client"]</w:t>
+        <w:t>external: {</w:t>
       </w:r>
     </w:p>
     <w:p>
@@ -204,7 +203,7 @@
           <w:rFonts w:ascii="Consolas" w:hAnsi="Consolas" w:eastAsia="Consolas"/>
           <w:sz w:val="16"/>
         </w:rPr>
-        <w:t xml:space="preserve">        F["Static frontend /app"]</w:t>
+        <w:t xml:space="preserve">  label: "External / untrusted zone"</w:t>
       </w:r>
     </w:p>
     <w:p>
@@ -217,7 +216,7 @@
           <w:rFonts w:ascii="Consolas" w:hAnsi="Consolas" w:eastAsia="Consolas"/>
           <w:sz w:val="16"/>
         </w:rPr>
-        <w:t xml:space="preserve">    end</w:t>
+        <w:t xml:space="preserve">  style.fill: "#F4F1EA"</w:t>
       </w:r>
     </w:p>
     <w:p>
@@ -230,7 +229,7 @@
           <w:rFonts w:ascii="Consolas" w:hAnsi="Consolas" w:eastAsia="Consolas"/>
           <w:sz w:val="16"/>
         </w:rPr>
-        <w:t xml:space="preserve">    subgraph APP["Application trust boundary"]</w:t>
+        <w:t xml:space="preserve">  client: "Browser / API client"</w:t>
       </w:r>
     </w:p>
     <w:p>
@@ -243,7 +242,7 @@
           <w:rFonts w:ascii="Consolas" w:hAnsi="Consolas" w:eastAsia="Consolas"/>
           <w:sz w:val="16"/>
         </w:rPr>
-        <w:t xml:space="preserve">        R["FastAPI routes"]</w:t>
+        <w:t xml:space="preserve">  frontend: "Static frontend /app"</w:t>
       </w:r>
     </w:p>
     <w:p>
@@ -256,7 +255,7 @@
           <w:rFonts w:ascii="Consolas" w:hAnsi="Consolas" w:eastAsia="Consolas"/>
           <w:sz w:val="16"/>
         </w:rPr>
-        <w:t xml:space="preserve">        D["Dependencies: current user and DB session"]</w:t>
+        <w:t>}</w:t>
       </w:r>
     </w:p>
     <w:p>
@@ -269,7 +268,6 @@
           <w:rFonts w:ascii="Consolas" w:hAnsi="Consolas" w:eastAsia="Consolas"/>
           <w:sz w:val="16"/>
         </w:rPr>
-        <w:t xml:space="preserve">        V["Pydantic validation and bounded query params"]</w:t>
       </w:r>
     </w:p>
     <w:p>
@@ -282,7 +280,7 @@
           <w:rFonts w:ascii="Consolas" w:hAnsi="Consolas" w:eastAsia="Consolas"/>
           <w:sz w:val="16"/>
         </w:rPr>
-        <w:t xml:space="preserve">        S["Services and business rules"]</w:t>
+        <w:t>application: {</w:t>
       </w:r>
     </w:p>
     <w:p>
@@ -295,7 +293,7 @@
           <w:rFonts w:ascii="Consolas" w:hAnsi="Consolas" w:eastAsia="Consolas"/>
           <w:sz w:val="16"/>
         </w:rPr>
-        <w:t xml:space="preserve">        A["Authorization: role and object matrix"]</w:t>
+        <w:t xml:space="preserve">  label: "Application trust boundary"</w:t>
       </w:r>
     </w:p>
     <w:p>
@@ -308,7 +306,7 @@
           <w:rFonts w:ascii="Consolas" w:hAnsi="Consolas" w:eastAsia="Consolas"/>
           <w:sz w:val="16"/>
         </w:rPr>
-        <w:t xml:space="preserve">        L["Audit log helper"]</w:t>
+        <w:t xml:space="preserve">  style.fill: "#FBFAF7"</w:t>
       </w:r>
     </w:p>
     <w:p>
@@ -321,7 +319,7 @@
           <w:rFonts w:ascii="Consolas" w:hAnsi="Consolas" w:eastAsia="Consolas"/>
           <w:sz w:val="16"/>
         </w:rPr>
-        <w:t xml:space="preserve">        O["SQLAlchemy ORM"]</w:t>
+        <w:t xml:space="preserve">  routes: "FastAPI routes"</w:t>
       </w:r>
     </w:p>
     <w:p>
@@ -334,7 +332,7 @@
           <w:rFonts w:ascii="Consolas" w:hAnsi="Consolas" w:eastAsia="Consolas"/>
           <w:sz w:val="16"/>
         </w:rPr>
-        <w:t xml:space="preserve">        DB[("SQLite / production DB")]</w:t>
+        <w:t xml:space="preserve">  dependencies: "Dependencies: current user and DB session"</w:t>
       </w:r>
     </w:p>
     <w:p>
@@ -347,7 +345,7 @@
           <w:rFonts w:ascii="Consolas" w:hAnsi="Consolas" w:eastAsia="Consolas"/>
           <w:sz w:val="16"/>
         </w:rPr>
-        <w:t xml:space="preserve">        T[("Refresh token hash store")]</w:t>
+        <w:t xml:space="preserve">  validation: "Pydantic validation and bounded query params"</w:t>
       </w:r>
     </w:p>
     <w:p>
@@ -360,7 +358,7 @@
           <w:rFonts w:ascii="Consolas" w:hAnsi="Consolas" w:eastAsia="Consolas"/>
           <w:sz w:val="16"/>
         </w:rPr>
-        <w:t xml:space="preserve">    end</w:t>
+        <w:t xml:space="preserve">  services: "Services and business rules"</w:t>
       </w:r>
     </w:p>
     <w:p>
@@ -373,7 +371,7 @@
           <w:rFonts w:ascii="Consolas" w:hAnsi="Consolas" w:eastAsia="Consolas"/>
           <w:sz w:val="16"/>
         </w:rPr>
-        <w:t xml:space="preserve">    C --&gt;|"JSON, form data, query params, headers"| R</w:t>
+        <w:t xml:space="preserve">  authorization: "Authorization: role and object matrix"</w:t>
       </w:r>
     </w:p>
     <w:p>
@@ -386,7 +384,7 @@
           <w:rFonts w:ascii="Consolas" w:hAnsi="Consolas" w:eastAsia="Consolas"/>
           <w:sz w:val="16"/>
         </w:rPr>
-        <w:t xml:space="preserve">    F --&gt;|"same-origin fetch; textContent rendering"| R</w:t>
+        <w:t xml:space="preserve">  audit: "Audit log helper"</w:t>
       </w:r>
     </w:p>
     <w:p>
@@ -399,7 +397,7 @@
           <w:rFonts w:ascii="Consolas" w:hAnsi="Consolas" w:eastAsia="Consolas"/>
           <w:sz w:val="16"/>
         </w:rPr>
-        <w:t xml:space="preserve">    R --&gt; V</w:t>
+        <w:t xml:space="preserve">  orm: "SQLAlchemy ORM"</w:t>
       </w:r>
     </w:p>
     <w:p>
@@ -412,7 +410,7 @@
           <w:rFonts w:ascii="Consolas" w:hAnsi="Consolas" w:eastAsia="Consolas"/>
           <w:sz w:val="16"/>
         </w:rPr>
-        <w:t xml:space="preserve">    R --&gt; D</w:t>
+        <w:t xml:space="preserve">  database: {</w:t>
       </w:r>
     </w:p>
     <w:p>
@@ -425,7 +423,7 @@
           <w:rFonts w:ascii="Consolas" w:hAnsi="Consolas" w:eastAsia="Consolas"/>
           <w:sz w:val="16"/>
         </w:rPr>
-        <w:t xml:space="preserve">    D --&gt; A</w:t>
+        <w:t xml:space="preserve">    label: "SQLite / production DB"</w:t>
       </w:r>
     </w:p>
     <w:p>
@@ -438,7 +436,7 @@
           <w:rFonts w:ascii="Consolas" w:hAnsi="Consolas" w:eastAsia="Consolas"/>
           <w:sz w:val="16"/>
         </w:rPr>
-        <w:t xml:space="preserve">    V --&gt; S</w:t>
+        <w:t xml:space="preserve">    shape: cylinder</w:t>
       </w:r>
     </w:p>
     <w:p>
@@ -451,7 +449,7 @@
           <w:rFonts w:ascii="Consolas" w:hAnsi="Consolas" w:eastAsia="Consolas"/>
           <w:sz w:val="16"/>
         </w:rPr>
-        <w:t xml:space="preserve">    A --&gt; S</w:t>
+        <w:t xml:space="preserve">  }</w:t>
       </w:r>
     </w:p>
     <w:p>
@@ -464,7 +462,7 @@
           <w:rFonts w:ascii="Consolas" w:hAnsi="Consolas" w:eastAsia="Consolas"/>
           <w:sz w:val="16"/>
         </w:rPr>
-        <w:t xml:space="preserve">    S --&gt; O</w:t>
+        <w:t xml:space="preserve">  refresh_store: {</w:t>
       </w:r>
     </w:p>
     <w:p>
@@ -477,7 +475,7 @@
           <w:rFonts w:ascii="Consolas" w:hAnsi="Consolas" w:eastAsia="Consolas"/>
           <w:sz w:val="16"/>
         </w:rPr>
-        <w:t xml:space="preserve">    O --&gt; DB</w:t>
+        <w:t xml:space="preserve">    label: "Refresh token hash store"</w:t>
       </w:r>
     </w:p>
     <w:p>
@@ -490,7 +488,7 @@
           <w:rFonts w:ascii="Consolas" w:hAnsi="Consolas" w:eastAsia="Consolas"/>
           <w:sz w:val="16"/>
         </w:rPr>
-        <w:t xml:space="preserve">    S --&gt; T</w:t>
+        <w:t xml:space="preserve">    shape: cylinder</w:t>
       </w:r>
     </w:p>
     <w:p>
@@ -503,7 +501,7 @@
           <w:rFonts w:ascii="Consolas" w:hAnsi="Consolas" w:eastAsia="Consolas"/>
           <w:sz w:val="16"/>
         </w:rPr>
-        <w:t xml:space="preserve">    S --&gt; L</w:t>
+        <w:t xml:space="preserve">  }</w:t>
       </w:r>
     </w:p>
     <w:p>
@@ -516,7 +514,175 @@
           <w:rFonts w:ascii="Consolas" w:hAnsi="Consolas" w:eastAsia="Consolas"/>
           <w:sz w:val="16"/>
         </w:rPr>
-        <w:t xml:space="preserve">    L --&gt; DB</w:t>
+        <w:t>}</w:t>
+      </w:r>
+    </w:p>
+    <w:p>
+      <w:pPr>
+        <w:spacing w:after="0"/>
+        <w:ind w:left="283"/>
+      </w:pPr>
+      <w:r>
+        <w:rPr>
+          <w:rFonts w:ascii="Consolas" w:hAnsi="Consolas" w:eastAsia="Consolas"/>
+          <w:sz w:val="16"/>
+        </w:rPr>
+      </w:r>
+    </w:p>
+    <w:p>
+      <w:pPr>
+        <w:spacing w:after="0"/>
+        <w:ind w:left="283"/>
+      </w:pPr>
+      <w:r>
+        <w:rPr>
+          <w:rFonts w:ascii="Consolas" w:hAnsi="Consolas" w:eastAsia="Consolas"/>
+          <w:sz w:val="16"/>
+        </w:rPr>
+        <w:t>external.client -&gt; application.routes: "JSON, form data, query params, headers"</w:t>
+      </w:r>
+    </w:p>
+    <w:p>
+      <w:pPr>
+        <w:spacing w:after="0"/>
+        <w:ind w:left="283"/>
+      </w:pPr>
+      <w:r>
+        <w:rPr>
+          <w:rFonts w:ascii="Consolas" w:hAnsi="Consolas" w:eastAsia="Consolas"/>
+          <w:sz w:val="16"/>
+        </w:rPr>
+        <w:t>external.frontend -&gt; application.routes: "same-origin fetch; textContent rendering"</w:t>
+      </w:r>
+    </w:p>
+    <w:p>
+      <w:pPr>
+        <w:spacing w:after="0"/>
+        <w:ind w:left="283"/>
+      </w:pPr>
+      <w:r>
+        <w:rPr>
+          <w:rFonts w:ascii="Consolas" w:hAnsi="Consolas" w:eastAsia="Consolas"/>
+          <w:sz w:val="16"/>
+        </w:rPr>
+        <w:t>application.routes -&gt; application.validation</w:t>
+      </w:r>
+    </w:p>
+    <w:p>
+      <w:pPr>
+        <w:spacing w:after="0"/>
+        <w:ind w:left="283"/>
+      </w:pPr>
+      <w:r>
+        <w:rPr>
+          <w:rFonts w:ascii="Consolas" w:hAnsi="Consolas" w:eastAsia="Consolas"/>
+          <w:sz w:val="16"/>
+        </w:rPr>
+        <w:t>application.routes -&gt; application.dependencies</w:t>
+      </w:r>
+    </w:p>
+    <w:p>
+      <w:pPr>
+        <w:spacing w:after="0"/>
+        <w:ind w:left="283"/>
+      </w:pPr>
+      <w:r>
+        <w:rPr>
+          <w:rFonts w:ascii="Consolas" w:hAnsi="Consolas" w:eastAsia="Consolas"/>
+          <w:sz w:val="16"/>
+        </w:rPr>
+        <w:t>application.dependencies -&gt; application.authorization</w:t>
+      </w:r>
+    </w:p>
+    <w:p>
+      <w:pPr>
+        <w:spacing w:after="0"/>
+        <w:ind w:left="283"/>
+      </w:pPr>
+      <w:r>
+        <w:rPr>
+          <w:rFonts w:ascii="Consolas" w:hAnsi="Consolas" w:eastAsia="Consolas"/>
+          <w:sz w:val="16"/>
+        </w:rPr>
+        <w:t>application.validation -&gt; application.services</w:t>
+      </w:r>
+    </w:p>
+    <w:p>
+      <w:pPr>
+        <w:spacing w:after="0"/>
+        <w:ind w:left="283"/>
+      </w:pPr>
+      <w:r>
+        <w:rPr>
+          <w:rFonts w:ascii="Consolas" w:hAnsi="Consolas" w:eastAsia="Consolas"/>
+          <w:sz w:val="16"/>
+        </w:rPr>
+        <w:t>application.authorization -&gt; application.services</w:t>
+      </w:r>
+    </w:p>
+    <w:p>
+      <w:pPr>
+        <w:spacing w:after="0"/>
+        <w:ind w:left="283"/>
+      </w:pPr>
+      <w:r>
+        <w:rPr>
+          <w:rFonts w:ascii="Consolas" w:hAnsi="Consolas" w:eastAsia="Consolas"/>
+          <w:sz w:val="16"/>
+        </w:rPr>
+        <w:t>application.services -&gt; application.orm</w:t>
+      </w:r>
+    </w:p>
+    <w:p>
+      <w:pPr>
+        <w:spacing w:after="0"/>
+        <w:ind w:left="283"/>
+      </w:pPr>
+      <w:r>
+        <w:rPr>
+          <w:rFonts w:ascii="Consolas" w:hAnsi="Consolas" w:eastAsia="Consolas"/>
+          <w:sz w:val="16"/>
+        </w:rPr>
+        <w:t>application.orm -&gt; application.database</w:t>
+      </w:r>
+    </w:p>
+    <w:p>
+      <w:pPr>
+        <w:spacing w:after="0"/>
+        <w:ind w:left="283"/>
+      </w:pPr>
+      <w:r>
+        <w:rPr>
+          <w:rFonts w:ascii="Consolas" w:hAnsi="Consolas" w:eastAsia="Consolas"/>
+          <w:sz w:val="16"/>
+        </w:rPr>
+        <w:t>application.services -&gt; application.refresh_store</w:t>
+      </w:r>
+    </w:p>
+    <w:p>
+      <w:pPr>
+        <w:spacing w:after="0"/>
+        <w:ind w:left="283"/>
+      </w:pPr>
+      <w:r>
+        <w:rPr>
+          <w:rFonts w:ascii="Consolas" w:hAnsi="Consolas" w:eastAsia="Consolas"/>
+          <w:sz w:val="16"/>
+        </w:rPr>
+        <w:t>application.services -&gt; application.audit</w:t>
+      </w:r>
+    </w:p>
+    <w:p>
+      <w:pPr>
+        <w:spacing w:after="0"/>
+        <w:ind w:left="283"/>
+      </w:pPr>
+      <w:r>
+        <w:rPr>
+          <w:rFonts w:ascii="Consolas" w:hAnsi="Consolas" w:eastAsia="Consolas"/>
+          <w:sz w:val="16"/>
+        </w:rPr>
+        <w:t>application.audit -&gt; application.database</w:t>
       </w:r>
     </w:p>
     <w:p>
@@ -1723,7 +1889,7 @@
                 <w:i w:val="0"/>
                 <w:sz w:val="18"/>
               </w:rPr>
-              <w:t>Mermaid-код trust boundaries, таблица потоков, таблица sink и подтверждение защит в коде.</w:t>
+              <w:t>D2-код trust boundaries, таблица потоков, таблица sink и подтверждение защит в коде.</w:t>
             </w:r>
           </w:p>
         </w:tc>
@@ -1937,7 +2103,7 @@
                 <w:i w:val="0"/>
                 <w:sz w:val="18"/>
               </w:rPr>
-              <w:t>Все перечисленные элементы включены в отчет; диаграммы представлены Mermaid-кодом для draw.io и таблицами потоков.</w:t>
+              <w:t>Все перечисленные элементы включены в отчет; диаграммы представлены D2-кодом и таблицами потоков.</w:t>
             </w:r>
           </w:p>
         </w:tc>
@@ -2912,7 +3078,7 @@
           <w:i w:val="0"/>
           <w:sz w:val="28"/>
         </w:rPr>
-        <w:t>Листинг 2. Mermaid-код source -&gt; propagation -&gt; sink -&gt; protection.</w:t>
+        <w:t>Листинг 2. D2-код source -&gt; propagation -&gt; sink -&gt; protection.</w:t>
       </w:r>
     </w:p>
     <w:p>
@@ -2926,7 +3092,7 @@
           <w:i w:val="0"/>
           <w:sz w:val="28"/>
         </w:rPr>
-        <w:t>Код предназначен для импорта в draw.io и фиксирует основные точки входа пользовательских данных, распространение внутри MVP, dangerous sinks и меры защиты.</w:t>
+        <w:t>Код фиксирует основные точки входа пользовательских данных, распространение внутри MVP, dangerous sinks и меры защиты. D2-источник может быть отрендерен в SVG и использован как схема в draw.io или Word.</w:t>
       </w:r>
     </w:p>
     <w:p>
@@ -2939,7 +3105,7 @@
           <w:rFonts w:ascii="Consolas" w:hAnsi="Consolas" w:eastAsia="Consolas"/>
           <w:sz w:val="16"/>
         </w:rPr>
-        <w:t>```mermaid</w:t>
+        <w:t>```d2</w:t>
       </w:r>
     </w:p>
     <w:p>
@@ -2952,7 +3118,7 @@
           <w:rFonts w:ascii="Consolas" w:hAnsi="Consolas" w:eastAsia="Consolas"/>
           <w:sz w:val="16"/>
         </w:rPr>
-        <w:t>flowchart LR</w:t>
+        <w:t>direction: right</w:t>
       </w:r>
     </w:p>
     <w:p>
@@ -2965,7 +3131,6 @@
           <w:rFonts w:ascii="Consolas" w:hAnsi="Consolas" w:eastAsia="Consolas"/>
           <w:sz w:val="16"/>
         </w:rPr>
-        <w:t xml:space="preserve">    subgraph SRC["Sources"]</w:t>
       </w:r>
     </w:p>
     <w:p>
@@ -2978,7 +3143,7 @@
           <w:rFonts w:ascii="Consolas" w:hAnsi="Consolas" w:eastAsia="Consolas"/>
           <w:sz w:val="16"/>
         </w:rPr>
-        <w:t xml:space="preserve">        S1["Login form: email/password"]</w:t>
+        <w:t>sources: {</w:t>
       </w:r>
     </w:p>
     <w:p>
@@ -2991,7 +3156,7 @@
           <w:rFonts w:ascii="Consolas" w:hAnsi="Consolas" w:eastAsia="Consolas"/>
           <w:sz w:val="16"/>
         </w:rPr>
-        <w:t xml:space="preserve">        S2["Bearer token"]</w:t>
+        <w:t xml:space="preserve">  label: "Sources"</w:t>
       </w:r>
     </w:p>
     <w:p>
@@ -3004,7 +3169,7 @@
           <w:rFonts w:ascii="Consolas" w:hAnsi="Consolas" w:eastAsia="Consolas"/>
           <w:sz w:val="16"/>
         </w:rPr>
-        <w:t xml:space="preserve">        S3["Path and query params"]</w:t>
+        <w:t xml:space="preserve">  login: "Login form: email/password"</w:t>
       </w:r>
     </w:p>
     <w:p>
@@ -3017,7 +3182,7 @@
           <w:rFonts w:ascii="Consolas" w:hAnsi="Consolas" w:eastAsia="Consolas"/>
           <w:sz w:val="16"/>
         </w:rPr>
-        <w:t xml:space="preserve">        S4["JSON request body"]</w:t>
+        <w:t xml:space="preserve">  token: "Bearer token"</w:t>
       </w:r>
     </w:p>
     <w:p>
@@ -3030,7 +3195,7 @@
           <w:rFonts w:ascii="Consolas" w:hAnsi="Consolas" w:eastAsia="Consolas"/>
           <w:sz w:val="16"/>
         </w:rPr>
-        <w:t xml:space="preserve">        S5["Report filters"]</w:t>
+        <w:t xml:space="preserve">  params: "Path and query params"</w:t>
       </w:r>
     </w:p>
     <w:p>
@@ -3043,7 +3208,7 @@
           <w:rFonts w:ascii="Consolas" w:hAnsi="Consolas" w:eastAsia="Consolas"/>
           <w:sz w:val="16"/>
         </w:rPr>
-        <w:t xml:space="preserve">    end</w:t>
+        <w:t xml:space="preserve">  body: "JSON request body"</w:t>
       </w:r>
     </w:p>
     <w:p>
@@ -3056,7 +3221,7 @@
           <w:rFonts w:ascii="Consolas" w:hAnsi="Consolas" w:eastAsia="Consolas"/>
           <w:sz w:val="16"/>
         </w:rPr>
-        <w:t xml:space="preserve">    subgraph PROP["Propagation"]</w:t>
+        <w:t xml:space="preserve">  filters: "Report filters"</w:t>
       </w:r>
     </w:p>
     <w:p>
@@ -3069,7 +3234,7 @@
           <w:rFonts w:ascii="Consolas" w:hAnsi="Consolas" w:eastAsia="Consolas"/>
           <w:sz w:val="16"/>
         </w:rPr>
-        <w:t xml:space="preserve">        P1["FastAPI routes"]</w:t>
+        <w:t>}</w:t>
       </w:r>
     </w:p>
     <w:p>
@@ -3082,7 +3247,6 @@
           <w:rFonts w:ascii="Consolas" w:hAnsi="Consolas" w:eastAsia="Consolas"/>
           <w:sz w:val="16"/>
         </w:rPr>
-        <w:t xml:space="preserve">        P2["Pydantic schemas"]</w:t>
       </w:r>
     </w:p>
     <w:p>
@@ -3095,7 +3259,7 @@
           <w:rFonts w:ascii="Consolas" w:hAnsi="Consolas" w:eastAsia="Consolas"/>
           <w:sz w:val="16"/>
         </w:rPr>
-        <w:t xml:space="preserve">        P3["Dependencies"]</w:t>
+        <w:t>propagation: {</w:t>
       </w:r>
     </w:p>
     <w:p>
@@ -3108,7 +3272,7 @@
           <w:rFonts w:ascii="Consolas" w:hAnsi="Consolas" w:eastAsia="Consolas"/>
           <w:sz w:val="16"/>
         </w:rPr>
-        <w:t xml:space="preserve">        P4["Service layer"]</w:t>
+        <w:t xml:space="preserve">  label: "Propagation"</w:t>
       </w:r>
     </w:p>
     <w:p>
@@ -3121,7 +3285,7 @@
           <w:rFonts w:ascii="Consolas" w:hAnsi="Consolas" w:eastAsia="Consolas"/>
           <w:sz w:val="16"/>
         </w:rPr>
-        <w:t xml:space="preserve">        P5["Authorization checks"]</w:t>
+        <w:t xml:space="preserve">  routes: "FastAPI routes"</w:t>
       </w:r>
     </w:p>
     <w:p>
@@ -3134,7 +3298,7 @@
           <w:rFonts w:ascii="Consolas" w:hAnsi="Consolas" w:eastAsia="Consolas"/>
           <w:sz w:val="16"/>
         </w:rPr>
-        <w:t xml:space="preserve">    end</w:t>
+        <w:t xml:space="preserve">  schemas: "Pydantic schemas"</w:t>
       </w:r>
     </w:p>
     <w:p>
@@ -3147,7 +3311,7 @@
           <w:rFonts w:ascii="Consolas" w:hAnsi="Consolas" w:eastAsia="Consolas"/>
           <w:sz w:val="16"/>
         </w:rPr>
-        <w:t xml:space="preserve">    subgraph SINK["Dangerous sinks"]</w:t>
+        <w:t xml:space="preserve">  dependencies: "Dependencies"</w:t>
       </w:r>
     </w:p>
     <w:p>
@@ -3160,7 +3324,7 @@
           <w:rFonts w:ascii="Consolas" w:hAnsi="Consolas" w:eastAsia="Consolas"/>
           <w:sz w:val="16"/>
         </w:rPr>
-        <w:t xml:space="preserve">        K1["Password verification and token issuance"]</w:t>
+        <w:t xml:space="preserve">  services: "Service layer"</w:t>
       </w:r>
     </w:p>
     <w:p>
@@ -3173,7 +3337,7 @@
           <w:rFonts w:ascii="Consolas" w:hAnsi="Consolas" w:eastAsia="Consolas"/>
           <w:sz w:val="16"/>
         </w:rPr>
-        <w:t xml:space="preserve">        K2["SQLAlchemy DB queries"]</w:t>
+        <w:t xml:space="preserve">  authz: "Authorization checks"</w:t>
       </w:r>
     </w:p>
     <w:p>
@@ -3186,7 +3350,7 @@
           <w:rFonts w:ascii="Consolas" w:hAnsi="Consolas" w:eastAsia="Consolas"/>
           <w:sz w:val="16"/>
         </w:rPr>
-        <w:t xml:space="preserve">        K3["Maintenance status update"]</w:t>
+        <w:t>}</w:t>
       </w:r>
     </w:p>
     <w:p>
@@ -3199,7 +3363,6 @@
           <w:rFonts w:ascii="Consolas" w:hAnsi="Consolas" w:eastAsia="Consolas"/>
           <w:sz w:val="16"/>
         </w:rPr>
-        <w:t xml:space="preserve">        K4["Audit JSON details"]</w:t>
       </w:r>
     </w:p>
     <w:p>
@@ -3212,7 +3375,7 @@
           <w:rFonts w:ascii="Consolas" w:hAnsi="Consolas" w:eastAsia="Consolas"/>
           <w:sz w:val="16"/>
         </w:rPr>
-        <w:t xml:space="preserve">        K5["Report JSON response"]</w:t>
+        <w:t>sinks: {</w:t>
       </w:r>
     </w:p>
     <w:p>
@@ -3225,7 +3388,7 @@
           <w:rFonts w:ascii="Consolas" w:hAnsi="Consolas" w:eastAsia="Consolas"/>
           <w:sz w:val="16"/>
         </w:rPr>
-        <w:t xml:space="preserve">        K6["Frontend DOM"]</w:t>
+        <w:t xml:space="preserve">  label: "Dangerous sinks"</w:t>
       </w:r>
     </w:p>
     <w:p>
@@ -3238,7 +3401,7 @@
           <w:rFonts w:ascii="Consolas" w:hAnsi="Consolas" w:eastAsia="Consolas"/>
           <w:sz w:val="16"/>
         </w:rPr>
-        <w:t xml:space="preserve">    end</w:t>
+        <w:t xml:space="preserve">  auth: "Password verification and token issuance"</w:t>
       </w:r>
     </w:p>
     <w:p>
@@ -3251,7 +3414,7 @@
           <w:rFonts w:ascii="Consolas" w:hAnsi="Consolas" w:eastAsia="Consolas"/>
           <w:sz w:val="16"/>
         </w:rPr>
-        <w:t xml:space="preserve">    subgraph CTRL["Protections"]</w:t>
+        <w:t xml:space="preserve">  db: "SQLAlchemy DB queries"</w:t>
       </w:r>
     </w:p>
     <w:p>
@@ -3264,7 +3427,7 @@
           <w:rFonts w:ascii="Consolas" w:hAnsi="Consolas" w:eastAsia="Consolas"/>
           <w:sz w:val="16"/>
         </w:rPr>
-        <w:t xml:space="preserve">        C1["Argon2 and dummy hash"]</w:t>
+        <w:t xml:space="preserve">  status_update: "Maintenance status update"</w:t>
       </w:r>
     </w:p>
     <w:p>
@@ -3277,7 +3440,7 @@
           <w:rFonts w:ascii="Consolas" w:hAnsi="Consolas" w:eastAsia="Consolas"/>
           <w:sz w:val="16"/>
         </w:rPr>
-        <w:t xml:space="preserve">        C2["ORM expressions and bounded pagination"]</w:t>
+        <w:t xml:space="preserve">  audit_json: "Audit JSON details"</w:t>
       </w:r>
     </w:p>
     <w:p>
@@ -3290,7 +3453,7 @@
           <w:rFonts w:ascii="Consolas" w:hAnsi="Consolas" w:eastAsia="Consolas"/>
           <w:sz w:val="16"/>
         </w:rPr>
-        <w:t xml:space="preserve">        C3["Role plus object matrix"]</w:t>
+        <w:t xml:space="preserve">  report_json: "Report JSON response"</w:t>
       </w:r>
     </w:p>
     <w:p>
@@ -3303,7 +3466,7 @@
           <w:rFonts w:ascii="Consolas" w:hAnsi="Consolas" w:eastAsia="Consolas"/>
           <w:sz w:val="16"/>
         </w:rPr>
-        <w:t xml:space="preserve">        C4["No secret logging"]</w:t>
+        <w:t xml:space="preserve">  dom: "Frontend DOM"</w:t>
       </w:r>
     </w:p>
     <w:p>
@@ -3316,7 +3479,7 @@
           <w:rFonts w:ascii="Consolas" w:hAnsi="Consolas" w:eastAsia="Consolas"/>
           <w:sz w:val="16"/>
         </w:rPr>
-        <w:t xml:space="preserve">        C5["Pydantic response models"]</w:t>
+        <w:t>}</w:t>
       </w:r>
     </w:p>
     <w:p>
@@ -3329,7 +3492,6 @@
           <w:rFonts w:ascii="Consolas" w:hAnsi="Consolas" w:eastAsia="Consolas"/>
           <w:sz w:val="16"/>
         </w:rPr>
-        <w:t xml:space="preserve">        C6["textContent rendering"]</w:t>
       </w:r>
     </w:p>
     <w:p>
@@ -3342,7 +3504,7 @@
           <w:rFonts w:ascii="Consolas" w:hAnsi="Consolas" w:eastAsia="Consolas"/>
           <w:sz w:val="16"/>
         </w:rPr>
-        <w:t xml:space="preserve">    end</w:t>
+        <w:t>protections: {</w:t>
       </w:r>
     </w:p>
     <w:p>
@@ -3355,7 +3517,7 @@
           <w:rFonts w:ascii="Consolas" w:hAnsi="Consolas" w:eastAsia="Consolas"/>
           <w:sz w:val="16"/>
         </w:rPr>
-        <w:t xml:space="preserve">    S1 --&gt; P1 --&gt; K1 --&gt; C1</w:t>
+        <w:t xml:space="preserve">  label: "Protections"</w:t>
       </w:r>
     </w:p>
     <w:p>
@@ -3368,7 +3530,7 @@
           <w:rFonts w:ascii="Consolas" w:hAnsi="Consolas" w:eastAsia="Consolas"/>
           <w:sz w:val="16"/>
         </w:rPr>
-        <w:t xml:space="preserve">    S2 --&gt; P3 --&gt; P5 --&gt; K3 --&gt; C3</w:t>
+        <w:t xml:space="preserve">  argon2: "Argon2 and dummy hash"</w:t>
       </w:r>
     </w:p>
     <w:p>
@@ -3381,7 +3543,7 @@
           <w:rFonts w:ascii="Consolas" w:hAnsi="Consolas" w:eastAsia="Consolas"/>
           <w:sz w:val="16"/>
         </w:rPr>
-        <w:t xml:space="preserve">    S3 --&gt; P2 --&gt; P4 --&gt; K2 --&gt; C2</w:t>
+        <w:t xml:space="preserve">  orm_bounds: "ORM expressions and bounded pagination"</w:t>
       </w:r>
     </w:p>
     <w:p>
@@ -3394,7 +3556,7 @@
           <w:rFonts w:ascii="Consolas" w:hAnsi="Consolas" w:eastAsia="Consolas"/>
           <w:sz w:val="16"/>
         </w:rPr>
-        <w:t xml:space="preserve">    S4 --&gt; P2 --&gt; P4 --&gt; K3</w:t>
+        <w:t xml:space="preserve">  object_matrix: "Role plus object matrix"</w:t>
       </w:r>
     </w:p>
     <w:p>
@@ -3407,7 +3569,7 @@
           <w:rFonts w:ascii="Consolas" w:hAnsi="Consolas" w:eastAsia="Consolas"/>
           <w:sz w:val="16"/>
         </w:rPr>
-        <w:t xml:space="preserve">    S5 --&gt; P1 --&gt; P4 --&gt; K5 --&gt; C5</w:t>
+        <w:t xml:space="preserve">  no_secret_logging: "No secret logging"</w:t>
       </w:r>
     </w:p>
     <w:p>
@@ -3420,7 +3582,7 @@
           <w:rFonts w:ascii="Consolas" w:hAnsi="Consolas" w:eastAsia="Consolas"/>
           <w:sz w:val="16"/>
         </w:rPr>
-        <w:t xml:space="preserve">    K4 --&gt; C4</w:t>
+        <w:t xml:space="preserve">  response_models: "Pydantic response models"</w:t>
       </w:r>
     </w:p>
     <w:p>
@@ -3433,7 +3595,266 @@
           <w:rFonts w:ascii="Consolas" w:hAnsi="Consolas" w:eastAsia="Consolas"/>
           <w:sz w:val="16"/>
         </w:rPr>
-        <w:t xml:space="preserve">    K5 --&gt; K6 --&gt; C6</w:t>
+        <w:t xml:space="preserve">  text_content: "textContent rendering"</w:t>
+      </w:r>
+    </w:p>
+    <w:p>
+      <w:pPr>
+        <w:spacing w:after="0"/>
+        <w:ind w:left="283"/>
+      </w:pPr>
+      <w:r>
+        <w:rPr>
+          <w:rFonts w:ascii="Consolas" w:hAnsi="Consolas" w:eastAsia="Consolas"/>
+          <w:sz w:val="16"/>
+        </w:rPr>
+        <w:t>}</w:t>
+      </w:r>
+    </w:p>
+    <w:p>
+      <w:pPr>
+        <w:spacing w:after="0"/>
+        <w:ind w:left="283"/>
+      </w:pPr>
+      <w:r>
+        <w:rPr>
+          <w:rFonts w:ascii="Consolas" w:hAnsi="Consolas" w:eastAsia="Consolas"/>
+          <w:sz w:val="16"/>
+        </w:rPr>
+      </w:r>
+    </w:p>
+    <w:p>
+      <w:pPr>
+        <w:spacing w:after="0"/>
+        <w:ind w:left="283"/>
+      </w:pPr>
+      <w:r>
+        <w:rPr>
+          <w:rFonts w:ascii="Consolas" w:hAnsi="Consolas" w:eastAsia="Consolas"/>
+          <w:sz w:val="16"/>
+        </w:rPr>
+        <w:t>sources.login -&gt; propagation.routes: "email/password"</w:t>
+      </w:r>
+    </w:p>
+    <w:p>
+      <w:pPr>
+        <w:spacing w:after="0"/>
+        <w:ind w:left="283"/>
+      </w:pPr>
+      <w:r>
+        <w:rPr>
+          <w:rFonts w:ascii="Consolas" w:hAnsi="Consolas" w:eastAsia="Consolas"/>
+          <w:sz w:val="16"/>
+        </w:rPr>
+        <w:t>propagation.routes -&gt; sinks.auth: "credential verification"</w:t>
+      </w:r>
+    </w:p>
+    <w:p>
+      <w:pPr>
+        <w:spacing w:after="0"/>
+        <w:ind w:left="283"/>
+      </w:pPr>
+      <w:r>
+        <w:rPr>
+          <w:rFonts w:ascii="Consolas" w:hAnsi="Consolas" w:eastAsia="Consolas"/>
+          <w:sz w:val="16"/>
+        </w:rPr>
+        <w:t>sinks.auth -&gt; protections.argon2</w:t>
+      </w:r>
+    </w:p>
+    <w:p>
+      <w:pPr>
+        <w:spacing w:after="0"/>
+        <w:ind w:left="283"/>
+      </w:pPr>
+      <w:r>
+        <w:rPr>
+          <w:rFonts w:ascii="Consolas" w:hAnsi="Consolas" w:eastAsia="Consolas"/>
+          <w:sz w:val="16"/>
+        </w:rPr>
+        <w:t>sources.token -&gt; propagation.dependencies: "JWT"</w:t>
+      </w:r>
+    </w:p>
+    <w:p>
+      <w:pPr>
+        <w:spacing w:after="0"/>
+        <w:ind w:left="283"/>
+      </w:pPr>
+      <w:r>
+        <w:rPr>
+          <w:rFonts w:ascii="Consolas" w:hAnsi="Consolas" w:eastAsia="Consolas"/>
+          <w:sz w:val="16"/>
+        </w:rPr>
+        <w:t>propagation.dependencies -&gt; propagation.authz</w:t>
+      </w:r>
+    </w:p>
+    <w:p>
+      <w:pPr>
+        <w:spacing w:after="0"/>
+        <w:ind w:left="283"/>
+      </w:pPr>
+      <w:r>
+        <w:rPr>
+          <w:rFonts w:ascii="Consolas" w:hAnsi="Consolas" w:eastAsia="Consolas"/>
+          <w:sz w:val="16"/>
+        </w:rPr>
+        <w:t>propagation.authz -&gt; sinks.status_update</w:t>
+      </w:r>
+    </w:p>
+    <w:p>
+      <w:pPr>
+        <w:spacing w:after="0"/>
+        <w:ind w:left="283"/>
+      </w:pPr>
+      <w:r>
+        <w:rPr>
+          <w:rFonts w:ascii="Consolas" w:hAnsi="Consolas" w:eastAsia="Consolas"/>
+          <w:sz w:val="16"/>
+        </w:rPr>
+        <w:t>sinks.status_update -&gt; protections.object_matrix</w:t>
+      </w:r>
+    </w:p>
+    <w:p>
+      <w:pPr>
+        <w:spacing w:after="0"/>
+        <w:ind w:left="283"/>
+      </w:pPr>
+      <w:r>
+        <w:rPr>
+          <w:rFonts w:ascii="Consolas" w:hAnsi="Consolas" w:eastAsia="Consolas"/>
+          <w:sz w:val="16"/>
+        </w:rPr>
+        <w:t>sources.params -&gt; propagation.schemas</w:t>
+      </w:r>
+    </w:p>
+    <w:p>
+      <w:pPr>
+        <w:spacing w:after="0"/>
+        <w:ind w:left="283"/>
+      </w:pPr>
+      <w:r>
+        <w:rPr>
+          <w:rFonts w:ascii="Consolas" w:hAnsi="Consolas" w:eastAsia="Consolas"/>
+          <w:sz w:val="16"/>
+        </w:rPr>
+        <w:t>propagation.schemas -&gt; propagation.services</w:t>
+      </w:r>
+    </w:p>
+    <w:p>
+      <w:pPr>
+        <w:spacing w:after="0"/>
+        <w:ind w:left="283"/>
+      </w:pPr>
+      <w:r>
+        <w:rPr>
+          <w:rFonts w:ascii="Consolas" w:hAnsi="Consolas" w:eastAsia="Consolas"/>
+          <w:sz w:val="16"/>
+        </w:rPr>
+        <w:t>propagation.services -&gt; sinks.db</w:t>
+      </w:r>
+    </w:p>
+    <w:p>
+      <w:pPr>
+        <w:spacing w:after="0"/>
+        <w:ind w:left="283"/>
+      </w:pPr>
+      <w:r>
+        <w:rPr>
+          <w:rFonts w:ascii="Consolas" w:hAnsi="Consolas" w:eastAsia="Consolas"/>
+          <w:sz w:val="16"/>
+        </w:rPr>
+        <w:t>sinks.db -&gt; protections.orm_bounds</w:t>
+      </w:r>
+    </w:p>
+    <w:p>
+      <w:pPr>
+        <w:spacing w:after="0"/>
+        <w:ind w:left="283"/>
+      </w:pPr>
+      <w:r>
+        <w:rPr>
+          <w:rFonts w:ascii="Consolas" w:hAnsi="Consolas" w:eastAsia="Consolas"/>
+          <w:sz w:val="16"/>
+        </w:rPr>
+        <w:t>sources.body -&gt; propagation.schemas: "status payload"</w:t>
+      </w:r>
+    </w:p>
+    <w:p>
+      <w:pPr>
+        <w:spacing w:after="0"/>
+        <w:ind w:left="283"/>
+      </w:pPr>
+      <w:r>
+        <w:rPr>
+          <w:rFonts w:ascii="Consolas" w:hAnsi="Consolas" w:eastAsia="Consolas"/>
+          <w:sz w:val="16"/>
+        </w:rPr>
+        <w:t>sources.filters -&gt; propagation.routes</w:t>
+      </w:r>
+    </w:p>
+    <w:p>
+      <w:pPr>
+        <w:spacing w:after="0"/>
+        <w:ind w:left="283"/>
+      </w:pPr>
+      <w:r>
+        <w:rPr>
+          <w:rFonts w:ascii="Consolas" w:hAnsi="Consolas" w:eastAsia="Consolas"/>
+          <w:sz w:val="16"/>
+        </w:rPr>
+        <w:t>propagation.services -&gt; sinks.report_json</w:t>
+      </w:r>
+    </w:p>
+    <w:p>
+      <w:pPr>
+        <w:spacing w:after="0"/>
+        <w:ind w:left="283"/>
+      </w:pPr>
+      <w:r>
+        <w:rPr>
+          <w:rFonts w:ascii="Consolas" w:hAnsi="Consolas" w:eastAsia="Consolas"/>
+          <w:sz w:val="16"/>
+        </w:rPr>
+        <w:t>sinks.report_json -&gt; protections.response_models</w:t>
+      </w:r>
+    </w:p>
+    <w:p>
+      <w:pPr>
+        <w:spacing w:after="0"/>
+        <w:ind w:left="283"/>
+      </w:pPr>
+      <w:r>
+        <w:rPr>
+          <w:rFonts w:ascii="Consolas" w:hAnsi="Consolas" w:eastAsia="Consolas"/>
+          <w:sz w:val="16"/>
+        </w:rPr>
+        <w:t>sinks.audit_json -&gt; protections.no_secret_logging</w:t>
+      </w:r>
+    </w:p>
+    <w:p>
+      <w:pPr>
+        <w:spacing w:after="0"/>
+        <w:ind w:left="283"/>
+      </w:pPr>
+      <w:r>
+        <w:rPr>
+          <w:rFonts w:ascii="Consolas" w:hAnsi="Consolas" w:eastAsia="Consolas"/>
+          <w:sz w:val="16"/>
+        </w:rPr>
+        <w:t>sinks.report_json -&gt; sinks.dom</w:t>
+      </w:r>
+    </w:p>
+    <w:p>
+      <w:pPr>
+        <w:spacing w:after="0"/>
+        <w:ind w:left="283"/>
+      </w:pPr>
+      <w:r>
+        <w:rPr>
+          <w:rFonts w:ascii="Consolas" w:hAnsi="Consolas" w:eastAsia="Consolas"/>
+          <w:sz w:val="16"/>
+        </w:rPr>
+        <w:t>sinks.dom -&gt; protections.text_content</w:t>
       </w:r>
     </w:p>
     <w:p>
@@ -5800,7 +6221,7 @@
           <w:i w:val="0"/>
           <w:sz w:val="28"/>
         </w:rPr>
-        <w:t>Листинг 3. Mermaid-код блок-схемы authorization decision.</w:t>
+        <w:t>Листинг 3. D2-код блок-схемы authorization decision.</w:t>
       </w:r>
     </w:p>
     <w:p>
@@ -5827,7 +6248,7 @@
           <w:rFonts w:ascii="Consolas" w:hAnsi="Consolas" w:eastAsia="Consolas"/>
           <w:sz w:val="16"/>
         </w:rPr>
-        <w:t>```mermaid</w:t>
+        <w:t>```d2</w:t>
       </w:r>
     </w:p>
     <w:p>
@@ -5840,7 +6261,7 @@
           <w:rFonts w:ascii="Consolas" w:hAnsi="Consolas" w:eastAsia="Consolas"/>
           <w:sz w:val="16"/>
         </w:rPr>
-        <w:t>flowchart TD</w:t>
+        <w:t>direction: down</w:t>
       </w:r>
     </w:p>
     <w:p>
@@ -5853,7 +6274,6 @@
           <w:rFonts w:ascii="Consolas" w:hAnsi="Consolas" w:eastAsia="Consolas"/>
           <w:sz w:val="16"/>
         </w:rPr>
-        <w:t xml:space="preserve">    L["1. Login request"] --&gt; AU["2. Authentication: active user and password hash"]</w:t>
       </w:r>
     </w:p>
     <w:p>
@@ -5866,7 +6286,7 @@
           <w:rFonts w:ascii="Consolas" w:hAnsi="Consolas" w:eastAsia="Consolas"/>
           <w:sz w:val="16"/>
         </w:rPr>
-        <w:t xml:space="preserve">    AU --&gt; TOK["3. Access token issued"]</w:t>
+        <w:t>login: "1. Login request"</w:t>
       </w:r>
     </w:p>
     <w:p>
@@ -5879,7 +6299,7 @@
           <w:rFonts w:ascii="Consolas" w:hAnsi="Consolas" w:eastAsia="Consolas"/>
           <w:sz w:val="16"/>
         </w:rPr>
-        <w:t xml:space="preserve">    TOK --&gt; LOAD["4. Load current user and request object"]</w:t>
+        <w:t>authn: "2. Authentication: active user and password hash"</w:t>
       </w:r>
     </w:p>
     <w:p>
@@ -5892,7 +6312,7 @@
           <w:rFonts w:ascii="Consolas" w:hAnsi="Consolas" w:eastAsia="Consolas"/>
           <w:sz w:val="16"/>
         </w:rPr>
-        <w:t xml:space="preserve">    LOAD --&gt; ASSIGN["5. Supervisor assigns engineer"]</w:t>
+        <w:t>token: "3. Access token issued"</w:t>
       </w:r>
     </w:p>
     <w:p>
@@ -5905,7 +6325,7 @@
           <w:rFonts w:ascii="Consolas" w:hAnsi="Consolas" w:eastAsia="Consolas"/>
           <w:sz w:val="16"/>
         </w:rPr>
-        <w:t xml:space="preserve">    ASSIGN --&gt; ECHK{"6. Actor is assigned engineer?"}</w:t>
+        <w:t>load: "4. Load current user and request object"</w:t>
       </w:r>
     </w:p>
     <w:p>
@@ -5918,7 +6338,7 @@
           <w:rFonts w:ascii="Consolas" w:hAnsi="Consolas" w:eastAsia="Consolas"/>
           <w:sz w:val="16"/>
         </w:rPr>
-        <w:t xml:space="preserve">    ECHK --&gt;|"yes"| START["7. Move assigned request to in_progress"]</w:t>
+        <w:t>assign: "5. Supervisor assigns engineer"</w:t>
       </w:r>
     </w:p>
     <w:p>
@@ -5931,7 +6351,7 @@
           <w:rFonts w:ascii="Consolas" w:hAnsi="Consolas" w:eastAsia="Consolas"/>
           <w:sz w:val="16"/>
         </w:rPr>
-        <w:t xml:space="preserve">    START --&gt; DONE["8. Move assigned request to completed"]</w:t>
+        <w:t>engineer_check: {</w:t>
       </w:r>
     </w:p>
     <w:p>
@@ -5944,7 +6364,7 @@
           <w:rFonts w:ascii="Consolas" w:hAnsi="Consolas" w:eastAsia="Consolas"/>
           <w:sz w:val="16"/>
         </w:rPr>
-        <w:t xml:space="preserve">    DONE --&gt; AUDIT["9. Audit event and report data"]</w:t>
+        <w:t xml:space="preserve">  label: "6. Actor is assigned engineer?"</w:t>
       </w:r>
     </w:p>
     <w:p>
@@ -5957,7 +6377,7 @@
           <w:rFonts w:ascii="Consolas" w:hAnsi="Consolas" w:eastAsia="Consolas"/>
           <w:sz w:val="16"/>
         </w:rPr>
-        <w:t xml:space="preserve">    ECHK --&gt;|"no; supervisor/admin attempts start or complete"| DENY["403 Forbidden"]</w:t>
+        <w:t xml:space="preserve">  shape: diamond</w:t>
       </w:r>
     </w:p>
     <w:p>
@@ -5970,7 +6390,7 @@
           <w:rFonts w:ascii="Consolas" w:hAnsi="Consolas" w:eastAsia="Consolas"/>
           <w:sz w:val="16"/>
         </w:rPr>
-        <w:t xml:space="preserve">    LOAD --&gt; DIR{"Directory access requested?"}</w:t>
+        <w:t>}</w:t>
       </w:r>
     </w:p>
     <w:p>
@@ -5983,7 +6403,7 @@
           <w:rFonts w:ascii="Consolas" w:hAnsi="Consolas" w:eastAsia="Consolas"/>
           <w:sz w:val="16"/>
         </w:rPr>
-        <w:t xml:space="preserve">    DIR --&gt;|"supervisor"| ENG["Engineer-only directory"]</w:t>
+        <w:t>start: "7. Move assigned request to in_progress"</w:t>
       </w:r>
     </w:p>
     <w:p>
@@ -5996,7 +6416,7 @@
           <w:rFonts w:ascii="Consolas" w:hAnsi="Consolas" w:eastAsia="Consolas"/>
           <w:sz w:val="16"/>
         </w:rPr>
-        <w:t xml:space="preserve">    DIR --&gt;|"technical_admin"| ALL["Full role directory"]</w:t>
+        <w:t>complete: "8. Move assigned request to completed"</w:t>
       </w:r>
     </w:p>
     <w:p>
@@ -6009,7 +6429,318 @@
           <w:rFonts w:ascii="Consolas" w:hAnsi="Consolas" w:eastAsia="Consolas"/>
           <w:sz w:val="16"/>
         </w:rPr>
-        <w:t xml:space="preserve">    DENY --&gt; AUDIT</w:t>
+        <w:t>audit: "9. Audit event and report data"</w:t>
+      </w:r>
+    </w:p>
+    <w:p>
+      <w:pPr>
+        <w:spacing w:after="0"/>
+        <w:ind w:left="283"/>
+      </w:pPr>
+      <w:r>
+        <w:rPr>
+          <w:rFonts w:ascii="Consolas" w:hAnsi="Consolas" w:eastAsia="Consolas"/>
+          <w:sz w:val="16"/>
+        </w:rPr>
+        <w:t>deny: {</w:t>
+      </w:r>
+    </w:p>
+    <w:p>
+      <w:pPr>
+        <w:spacing w:after="0"/>
+        <w:ind w:left="283"/>
+      </w:pPr>
+      <w:r>
+        <w:rPr>
+          <w:rFonts w:ascii="Consolas" w:hAnsi="Consolas" w:eastAsia="Consolas"/>
+          <w:sz w:val="16"/>
+        </w:rPr>
+        <w:t xml:space="preserve">  label: "403 Forbidden"</w:t>
+      </w:r>
+    </w:p>
+    <w:p>
+      <w:pPr>
+        <w:spacing w:after="0"/>
+        <w:ind w:left="283"/>
+      </w:pPr>
+      <w:r>
+        <w:rPr>
+          <w:rFonts w:ascii="Consolas" w:hAnsi="Consolas" w:eastAsia="Consolas"/>
+          <w:sz w:val="16"/>
+        </w:rPr>
+        <w:t xml:space="preserve">  shape: hexagon</w:t>
+      </w:r>
+    </w:p>
+    <w:p>
+      <w:pPr>
+        <w:spacing w:after="0"/>
+        <w:ind w:left="283"/>
+      </w:pPr>
+      <w:r>
+        <w:rPr>
+          <w:rFonts w:ascii="Consolas" w:hAnsi="Consolas" w:eastAsia="Consolas"/>
+          <w:sz w:val="16"/>
+        </w:rPr>
+        <w:t>}</w:t>
+      </w:r>
+    </w:p>
+    <w:p>
+      <w:pPr>
+        <w:spacing w:after="0"/>
+        <w:ind w:left="283"/>
+      </w:pPr>
+      <w:r>
+        <w:rPr>
+          <w:rFonts w:ascii="Consolas" w:hAnsi="Consolas" w:eastAsia="Consolas"/>
+          <w:sz w:val="16"/>
+        </w:rPr>
+        <w:t>directory_check: {</w:t>
+      </w:r>
+    </w:p>
+    <w:p>
+      <w:pPr>
+        <w:spacing w:after="0"/>
+        <w:ind w:left="283"/>
+      </w:pPr>
+      <w:r>
+        <w:rPr>
+          <w:rFonts w:ascii="Consolas" w:hAnsi="Consolas" w:eastAsia="Consolas"/>
+          <w:sz w:val="16"/>
+        </w:rPr>
+        <w:t xml:space="preserve">  label: "Directory access requested?"</w:t>
+      </w:r>
+    </w:p>
+    <w:p>
+      <w:pPr>
+        <w:spacing w:after="0"/>
+        <w:ind w:left="283"/>
+      </w:pPr>
+      <w:r>
+        <w:rPr>
+          <w:rFonts w:ascii="Consolas" w:hAnsi="Consolas" w:eastAsia="Consolas"/>
+          <w:sz w:val="16"/>
+        </w:rPr>
+        <w:t xml:space="preserve">  shape: diamond</w:t>
+      </w:r>
+    </w:p>
+    <w:p>
+      <w:pPr>
+        <w:spacing w:after="0"/>
+        <w:ind w:left="283"/>
+      </w:pPr>
+      <w:r>
+        <w:rPr>
+          <w:rFonts w:ascii="Consolas" w:hAnsi="Consolas" w:eastAsia="Consolas"/>
+          <w:sz w:val="16"/>
+        </w:rPr>
+        <w:t>}</w:t>
+      </w:r>
+    </w:p>
+    <w:p>
+      <w:pPr>
+        <w:spacing w:after="0"/>
+        <w:ind w:left="283"/>
+      </w:pPr>
+      <w:r>
+        <w:rPr>
+          <w:rFonts w:ascii="Consolas" w:hAnsi="Consolas" w:eastAsia="Consolas"/>
+          <w:sz w:val="16"/>
+        </w:rPr>
+        <w:t>engineer_directory: "Engineer-only directory"</w:t>
+      </w:r>
+    </w:p>
+    <w:p>
+      <w:pPr>
+        <w:spacing w:after="0"/>
+        <w:ind w:left="283"/>
+      </w:pPr>
+      <w:r>
+        <w:rPr>
+          <w:rFonts w:ascii="Consolas" w:hAnsi="Consolas" w:eastAsia="Consolas"/>
+          <w:sz w:val="16"/>
+        </w:rPr>
+        <w:t>full_directory: "Full role directory"</w:t>
+      </w:r>
+    </w:p>
+    <w:p>
+      <w:pPr>
+        <w:spacing w:after="0"/>
+        <w:ind w:left="283"/>
+      </w:pPr>
+      <w:r>
+        <w:rPr>
+          <w:rFonts w:ascii="Consolas" w:hAnsi="Consolas" w:eastAsia="Consolas"/>
+          <w:sz w:val="16"/>
+        </w:rPr>
+      </w:r>
+    </w:p>
+    <w:p>
+      <w:pPr>
+        <w:spacing w:after="0"/>
+        <w:ind w:left="283"/>
+      </w:pPr>
+      <w:r>
+        <w:rPr>
+          <w:rFonts w:ascii="Consolas" w:hAnsi="Consolas" w:eastAsia="Consolas"/>
+          <w:sz w:val="16"/>
+        </w:rPr>
+        <w:t>login -&gt; authn</w:t>
+      </w:r>
+    </w:p>
+    <w:p>
+      <w:pPr>
+        <w:spacing w:after="0"/>
+        <w:ind w:left="283"/>
+      </w:pPr>
+      <w:r>
+        <w:rPr>
+          <w:rFonts w:ascii="Consolas" w:hAnsi="Consolas" w:eastAsia="Consolas"/>
+          <w:sz w:val="16"/>
+        </w:rPr>
+        <w:t>authn -&gt; token</w:t>
+      </w:r>
+    </w:p>
+    <w:p>
+      <w:pPr>
+        <w:spacing w:after="0"/>
+        <w:ind w:left="283"/>
+      </w:pPr>
+      <w:r>
+        <w:rPr>
+          <w:rFonts w:ascii="Consolas" w:hAnsi="Consolas" w:eastAsia="Consolas"/>
+          <w:sz w:val="16"/>
+        </w:rPr>
+        <w:t>token -&gt; load</w:t>
+      </w:r>
+    </w:p>
+    <w:p>
+      <w:pPr>
+        <w:spacing w:after="0"/>
+        <w:ind w:left="283"/>
+      </w:pPr>
+      <w:r>
+        <w:rPr>
+          <w:rFonts w:ascii="Consolas" w:hAnsi="Consolas" w:eastAsia="Consolas"/>
+          <w:sz w:val="16"/>
+        </w:rPr>
+        <w:t>load -&gt; assign</w:t>
+      </w:r>
+    </w:p>
+    <w:p>
+      <w:pPr>
+        <w:spacing w:after="0"/>
+        <w:ind w:left="283"/>
+      </w:pPr>
+      <w:r>
+        <w:rPr>
+          <w:rFonts w:ascii="Consolas" w:hAnsi="Consolas" w:eastAsia="Consolas"/>
+          <w:sz w:val="16"/>
+        </w:rPr>
+        <w:t>assign -&gt; engineer_check</w:t>
+      </w:r>
+    </w:p>
+    <w:p>
+      <w:pPr>
+        <w:spacing w:after="0"/>
+        <w:ind w:left="283"/>
+      </w:pPr>
+      <w:r>
+        <w:rPr>
+          <w:rFonts w:ascii="Consolas" w:hAnsi="Consolas" w:eastAsia="Consolas"/>
+          <w:sz w:val="16"/>
+        </w:rPr>
+        <w:t>engineer_check -&gt; start: "yes"</w:t>
+      </w:r>
+    </w:p>
+    <w:p>
+      <w:pPr>
+        <w:spacing w:after="0"/>
+        <w:ind w:left="283"/>
+      </w:pPr>
+      <w:r>
+        <w:rPr>
+          <w:rFonts w:ascii="Consolas" w:hAnsi="Consolas" w:eastAsia="Consolas"/>
+          <w:sz w:val="16"/>
+        </w:rPr>
+        <w:t>start -&gt; complete</w:t>
+      </w:r>
+    </w:p>
+    <w:p>
+      <w:pPr>
+        <w:spacing w:after="0"/>
+        <w:ind w:left="283"/>
+      </w:pPr>
+      <w:r>
+        <w:rPr>
+          <w:rFonts w:ascii="Consolas" w:hAnsi="Consolas" w:eastAsia="Consolas"/>
+          <w:sz w:val="16"/>
+        </w:rPr>
+        <w:t>complete -&gt; audit</w:t>
+      </w:r>
+    </w:p>
+    <w:p>
+      <w:pPr>
+        <w:spacing w:after="0"/>
+        <w:ind w:left="283"/>
+      </w:pPr>
+      <w:r>
+        <w:rPr>
+          <w:rFonts w:ascii="Consolas" w:hAnsi="Consolas" w:eastAsia="Consolas"/>
+          <w:sz w:val="16"/>
+        </w:rPr>
+        <w:t>engineer_check -&gt; deny: "no: supervisor/admin attempts start or complete"</w:t>
+      </w:r>
+    </w:p>
+    <w:p>
+      <w:pPr>
+        <w:spacing w:after="0"/>
+        <w:ind w:left="283"/>
+      </w:pPr>
+      <w:r>
+        <w:rPr>
+          <w:rFonts w:ascii="Consolas" w:hAnsi="Consolas" w:eastAsia="Consolas"/>
+          <w:sz w:val="16"/>
+        </w:rPr>
+        <w:t>deny -&gt; audit</w:t>
+      </w:r>
+    </w:p>
+    <w:p>
+      <w:pPr>
+        <w:spacing w:after="0"/>
+        <w:ind w:left="283"/>
+      </w:pPr>
+      <w:r>
+        <w:rPr>
+          <w:rFonts w:ascii="Consolas" w:hAnsi="Consolas" w:eastAsia="Consolas"/>
+          <w:sz w:val="16"/>
+        </w:rPr>
+        <w:t>load -&gt; directory_check</w:t>
+      </w:r>
+    </w:p>
+    <w:p>
+      <w:pPr>
+        <w:spacing w:after="0"/>
+        <w:ind w:left="283"/>
+      </w:pPr>
+      <w:r>
+        <w:rPr>
+          <w:rFonts w:ascii="Consolas" w:hAnsi="Consolas" w:eastAsia="Consolas"/>
+          <w:sz w:val="16"/>
+        </w:rPr>
+        <w:t>directory_check -&gt; engineer_directory: "supervisor"</w:t>
+      </w:r>
+    </w:p>
+    <w:p>
+      <w:pPr>
+        <w:spacing w:after="0"/>
+        <w:ind w:left="283"/>
+      </w:pPr>
+      <w:r>
+        <w:rPr>
+          <w:rFonts w:ascii="Consolas" w:hAnsi="Consolas" w:eastAsia="Consolas"/>
+          <w:sz w:val="16"/>
+        </w:rPr>
+        <w:t>directory_check -&gt; full_directory: "technical_admin"</w:t>
       </w:r>
     </w:p>
     <w:p>
@@ -13641,7 +14372,7 @@
           <w:i w:val="0"/>
           <w:sz w:val="28"/>
         </w:rPr>
-        <w:t>Результаты подтверждены regression tests, SAST, SCA и статической проверкой типов. В отчет включены Mermaid-код структурной схемы, карта trust boundaries, flowchart принятия решения о доступе, role/access matrix, таблица уязвимостей, классификация CWE, CVSS v4.0 vectors, фрагменты кода до и после исправления, а также proof-fixed tests. Для LMS вместе с отчетом предоставляется папка mvp с исправленным исходным кодом.</w:t>
+        <w:t>Результаты подтверждены regression tests, SAST, SCA и статической проверкой типов. В отчет включены D2-код структурной схемы, карта trust boundaries, flowchart принятия решения о доступе, role/access matrix, таблица уязвимостей, классификация CWE, CVSS v4.0 vectors, фрагменты кода до и после исправления, а также proof-fixed tests. Для LMS вместе с отчетом предоставляется папка mvp с исправленным исходным кодом.</w:t>
       </w:r>
     </w:p>
     <w:p>
@@ -13655,7 +14386,7 @@
           <w:i w:val="0"/>
           <w:sz w:val="28"/>
         </w:rPr>
-        <w:t>Подтверждающие материалы представлены в виде воспроизводимых команд валидации и таблиц результатов. Формат соответствует требованию P5 о наличии screenshots or logs proving fixes: для каждого исправления указан проверочный тест или инструментальный результат, а диаграммы даны как Mermaid-код, пригодный для импорта в draw.io.</w:t>
+        <w:t>Подтверждающие материалы представлены в виде воспроизводимых команд валидации и таблиц результатов. Формат соответствует требованию P5 о наличии screenshots or logs proving fixes: для каждого исправления указан проверочный тест или инструментальный результат, а диаграммы даны как D2-код, пригодный для рендеринга в SVG и последующего импорта в draw.io или Word.</w:t>
       </w:r>
     </w:p>
     <w:sectPr>

</xml_diff>

<commit_message>
Clarify D2 trust boundaries in P5 report
</commit_message>
<xml_diff>
--- a/materials/p5-output/P5 Comprehensive MVP security analysis.docx
+++ b/materials/p5-output/P5 Comprehensive MVP security analysis.docx
@@ -190,7 +190,7 @@
           <w:rFonts w:ascii="Consolas" w:hAnsi="Consolas" w:eastAsia="Consolas"/>
           <w:sz w:val="16"/>
         </w:rPr>
-        <w:t>external: {</w:t>
+        <w:t>client_in: {</w:t>
       </w:r>
     </w:p>
     <w:p>
@@ -203,7 +203,7 @@
           <w:rFonts w:ascii="Consolas" w:hAnsi="Consolas" w:eastAsia="Consolas"/>
           <w:sz w:val="16"/>
         </w:rPr>
-        <w:t xml:space="preserve">  label: "External / untrusted zone"</w:t>
+        <w:t xml:space="preserve">  label: "Zone 1a: Untrusted request origin"</w:t>
       </w:r>
     </w:p>
     <w:p>
@@ -216,7 +216,7 @@
           <w:rFonts w:ascii="Consolas" w:hAnsi="Consolas" w:eastAsia="Consolas"/>
           <w:sz w:val="16"/>
         </w:rPr>
-        <w:t xml:space="preserve">  style.fill: "#F4F1EA"</w:t>
+        <w:t xml:space="preserve">  style.fill: "#FFF5F2"</w:t>
       </w:r>
     </w:p>
     <w:p>
@@ -229,7 +229,7 @@
           <w:rFonts w:ascii="Consolas" w:hAnsi="Consolas" w:eastAsia="Consolas"/>
           <w:sz w:val="16"/>
         </w:rPr>
-        <w:t xml:space="preserve">  client: "Browser / API client"</w:t>
+        <w:t xml:space="preserve">  user: "Human user: engineer / supervisor / technical admin"</w:t>
       </w:r>
     </w:p>
     <w:p>
@@ -242,7 +242,7 @@
           <w:rFonts w:ascii="Consolas" w:hAnsi="Consolas" w:eastAsia="Consolas"/>
           <w:sz w:val="16"/>
         </w:rPr>
-        <w:t xml:space="preserve">  frontend: "Static frontend /app"</w:t>
+        <w:t xml:space="preserve">  browser_js: "Browser + delivered app.js; untrusted after /app delivery"</w:t>
       </w:r>
     </w:p>
     <w:p>
@@ -255,6 +255,19 @@
           <w:rFonts w:ascii="Consolas" w:hAnsi="Consolas" w:eastAsia="Consolas"/>
           <w:sz w:val="16"/>
         </w:rPr>
+        <w:t xml:space="preserve">  api_client: "Direct API client / automated test client"</w:t>
+      </w:r>
+    </w:p>
+    <w:p>
+      <w:pPr>
+        <w:spacing w:after="0"/>
+        <w:ind w:left="283"/>
+      </w:pPr>
+      <w:r>
+        <w:rPr>
+          <w:rFonts w:ascii="Consolas" w:hAnsi="Consolas" w:eastAsia="Consolas"/>
+          <w:sz w:val="16"/>
+        </w:rPr>
         <w:t>}</w:t>
       </w:r>
     </w:p>
@@ -280,7 +293,7 @@
           <w:rFonts w:ascii="Consolas" w:hAnsi="Consolas" w:eastAsia="Consolas"/>
           <w:sz w:val="16"/>
         </w:rPr>
-        <w:t>application: {</w:t>
+        <w:t>b1: {</w:t>
       </w:r>
     </w:p>
     <w:p>
@@ -293,7 +306,7 @@
           <w:rFonts w:ascii="Consolas" w:hAnsi="Consolas" w:eastAsia="Consolas"/>
           <w:sz w:val="16"/>
         </w:rPr>
-        <w:t xml:space="preserve">  label: "Application trust boundary"</w:t>
+        <w:t xml:space="preserve">  label: "B1: untrusted request enters server"</w:t>
       </w:r>
     </w:p>
     <w:p>
@@ -306,7 +319,7 @@
           <w:rFonts w:ascii="Consolas" w:hAnsi="Consolas" w:eastAsia="Consolas"/>
           <w:sz w:val="16"/>
         </w:rPr>
-        <w:t xml:space="preserve">  style.fill: "#FBFAF7"</w:t>
+        <w:t xml:space="preserve">  shape: diamond</w:t>
       </w:r>
     </w:p>
     <w:p>
@@ -319,7 +332,7 @@
           <w:rFonts w:ascii="Consolas" w:hAnsi="Consolas" w:eastAsia="Consolas"/>
           <w:sz w:val="16"/>
         </w:rPr>
-        <w:t xml:space="preserve">  routes: "FastAPI routes"</w:t>
+        <w:t>}</w:t>
       </w:r>
     </w:p>
     <w:p>
@@ -332,7 +345,6 @@
           <w:rFonts w:ascii="Consolas" w:hAnsi="Consolas" w:eastAsia="Consolas"/>
           <w:sz w:val="16"/>
         </w:rPr>
-        <w:t xml:space="preserve">  dependencies: "Dependencies: current user and DB session"</w:t>
       </w:r>
     </w:p>
     <w:p>
@@ -345,7 +357,7 @@
           <w:rFonts w:ascii="Consolas" w:hAnsi="Consolas" w:eastAsia="Consolas"/>
           <w:sz w:val="16"/>
         </w:rPr>
-        <w:t xml:space="preserve">  validation: "Pydantic validation and bounded query params"</w:t>
+        <w:t>server: {</w:t>
       </w:r>
     </w:p>
     <w:p>
@@ -358,7 +370,7 @@
           <w:rFonts w:ascii="Consolas" w:hAnsi="Consolas" w:eastAsia="Consolas"/>
           <w:sz w:val="16"/>
         </w:rPr>
-        <w:t xml:space="preserve">  services: "Services and business rules"</w:t>
+        <w:t xml:space="preserve">  label: "Zone 2: FastAPI application trust boundary"</w:t>
       </w:r>
     </w:p>
     <w:p>
@@ -371,7 +383,7 @@
           <w:rFonts w:ascii="Consolas" w:hAnsi="Consolas" w:eastAsia="Consolas"/>
           <w:sz w:val="16"/>
         </w:rPr>
-        <w:t xml:space="preserve">  authorization: "Authorization: role and object matrix"</w:t>
+        <w:t xml:space="preserve">  style.fill: "#E8F5F4"</w:t>
       </w:r>
     </w:p>
     <w:p>
@@ -384,7 +396,7 @@
           <w:rFonts w:ascii="Consolas" w:hAnsi="Consolas" w:eastAsia="Consolas"/>
           <w:sz w:val="16"/>
         </w:rPr>
-        <w:t xml:space="preserve">  audit: "Audit log helper"</w:t>
+        <w:t xml:space="preserve">  direction: down</w:t>
       </w:r>
     </w:p>
     <w:p>
@@ -397,6 +409,200 @@
           <w:rFonts w:ascii="Consolas" w:hAnsi="Consolas" w:eastAsia="Consolas"/>
           <w:sz w:val="16"/>
         </w:rPr>
+        <w:t xml:space="preserve">  static_handler: "Static asset handler: /app; delivery only"</w:t>
+      </w:r>
+    </w:p>
+    <w:p>
+      <w:pPr>
+        <w:spacing w:after="0"/>
+        <w:ind w:left="283"/>
+      </w:pPr>
+      <w:r>
+        <w:rPr>
+          <w:rFonts w:ascii="Consolas" w:hAnsi="Consolas" w:eastAsia="Consolas"/>
+          <w:sz w:val="16"/>
+        </w:rPr>
+        <w:t xml:space="preserve">  ingress: "Middleware: body limit and security headers"</w:t>
+      </w:r>
+    </w:p>
+    <w:p>
+      <w:pPr>
+        <w:spacing w:after="0"/>
+        <w:ind w:left="283"/>
+      </w:pPr>
+      <w:r>
+        <w:rPr>
+          <w:rFonts w:ascii="Consolas" w:hAnsi="Consolas" w:eastAsia="Consolas"/>
+          <w:sz w:val="16"/>
+        </w:rPr>
+        <w:t xml:space="preserve">  routes: "API routes: /api/v1 and /auth"</w:t>
+      </w:r>
+    </w:p>
+    <w:p>
+      <w:pPr>
+        <w:spacing w:after="0"/>
+        <w:ind w:left="283"/>
+      </w:pPr>
+      <w:r>
+        <w:rPr>
+          <w:rFonts w:ascii="Consolas" w:hAnsi="Consolas" w:eastAsia="Consolas"/>
+          <w:sz w:val="16"/>
+        </w:rPr>
+        <w:t xml:space="preserve">  validation: "Pydantic schemas and Query bounds"</w:t>
+      </w:r>
+    </w:p>
+    <w:p>
+      <w:pPr>
+        <w:spacing w:after="0"/>
+        <w:ind w:left="283"/>
+      </w:pPr>
+      <w:r>
+        <w:rPr>
+          <w:rFonts w:ascii="Consolas" w:hAnsi="Consolas" w:eastAsia="Consolas"/>
+          <w:sz w:val="16"/>
+        </w:rPr>
+        <w:t xml:space="preserve">  auth_context: "Dependencies: JWT current user and DB session"</w:t>
+      </w:r>
+    </w:p>
+    <w:p>
+      <w:pPr>
+        <w:spacing w:after="0"/>
+        <w:ind w:left="283"/>
+      </w:pPr>
+      <w:r>
+        <w:rPr>
+          <w:rFonts w:ascii="Consolas" w:hAnsi="Consolas" w:eastAsia="Consolas"/>
+          <w:sz w:val="16"/>
+        </w:rPr>
+        <w:t xml:space="preserve">  authn: "Authentication service"</w:t>
+      </w:r>
+    </w:p>
+    <w:p>
+      <w:pPr>
+        <w:spacing w:after="0"/>
+        <w:ind w:left="283"/>
+      </w:pPr>
+      <w:r>
+        <w:rPr>
+          <w:rFonts w:ascii="Consolas" w:hAnsi="Consolas" w:eastAsia="Consolas"/>
+          <w:sz w:val="16"/>
+        </w:rPr>
+        <w:t xml:space="preserve">  authz: "Authorization matrix: role + object relation"</w:t>
+      </w:r>
+    </w:p>
+    <w:p>
+      <w:pPr>
+        <w:spacing w:after="0"/>
+        <w:ind w:left="283"/>
+      </w:pPr>
+      <w:r>
+        <w:rPr>
+          <w:rFonts w:ascii="Consolas" w:hAnsi="Consolas" w:eastAsia="Consolas"/>
+          <w:sz w:val="16"/>
+        </w:rPr>
+        <w:t xml:space="preserve">  services: "Business services"</w:t>
+      </w:r>
+    </w:p>
+    <w:p>
+      <w:pPr>
+        <w:spacing w:after="0"/>
+        <w:ind w:left="283"/>
+      </w:pPr>
+      <w:r>
+        <w:rPr>
+          <w:rFonts w:ascii="Consolas" w:hAnsi="Consolas" w:eastAsia="Consolas"/>
+          <w:sz w:val="16"/>
+        </w:rPr>
+        <w:t xml:space="preserve">  response_filter: "Response models / serializers"</w:t>
+      </w:r>
+    </w:p>
+    <w:p>
+      <w:pPr>
+        <w:spacing w:after="0"/>
+        <w:ind w:left="283"/>
+      </w:pPr>
+      <w:r>
+        <w:rPr>
+          <w:rFonts w:ascii="Consolas" w:hAnsi="Consolas" w:eastAsia="Consolas"/>
+          <w:sz w:val="16"/>
+        </w:rPr>
+        <w:t xml:space="preserve">  audit: "Audit helper"</w:t>
+      </w:r>
+    </w:p>
+    <w:p>
+      <w:pPr>
+        <w:spacing w:after="0"/>
+        <w:ind w:left="283"/>
+      </w:pPr>
+      <w:r>
+        <w:rPr>
+          <w:rFonts w:ascii="Consolas" w:hAnsi="Consolas" w:eastAsia="Consolas"/>
+          <w:sz w:val="16"/>
+        </w:rPr>
+        <w:t>}</w:t>
+      </w:r>
+    </w:p>
+    <w:p>
+      <w:pPr>
+        <w:spacing w:after="0"/>
+        <w:ind w:left="283"/>
+      </w:pPr>
+      <w:r>
+        <w:rPr>
+          <w:rFonts w:ascii="Consolas" w:hAnsi="Consolas" w:eastAsia="Consolas"/>
+          <w:sz w:val="16"/>
+        </w:rPr>
+      </w:r>
+    </w:p>
+    <w:p>
+      <w:pPr>
+        <w:spacing w:after="0"/>
+        <w:ind w:left="283"/>
+      </w:pPr>
+      <w:r>
+        <w:rPr>
+          <w:rFonts w:ascii="Consolas" w:hAnsi="Consolas" w:eastAsia="Consolas"/>
+          <w:sz w:val="16"/>
+        </w:rPr>
+        <w:t>persistence: {</w:t>
+      </w:r>
+    </w:p>
+    <w:p>
+      <w:pPr>
+        <w:spacing w:after="0"/>
+        <w:ind w:left="283"/>
+      </w:pPr>
+      <w:r>
+        <w:rPr>
+          <w:rFonts w:ascii="Consolas" w:hAnsi="Consolas" w:eastAsia="Consolas"/>
+          <w:sz w:val="16"/>
+        </w:rPr>
+        <w:t xml:space="preserve">  label: "Zone 3: Trusted persistence boundary"</w:t>
+      </w:r>
+    </w:p>
+    <w:p>
+      <w:pPr>
+        <w:spacing w:after="0"/>
+        <w:ind w:left="283"/>
+      </w:pPr>
+      <w:r>
+        <w:rPr>
+          <w:rFonts w:ascii="Consolas" w:hAnsi="Consolas" w:eastAsia="Consolas"/>
+          <w:sz w:val="16"/>
+        </w:rPr>
+        <w:t xml:space="preserve">  style.fill: "#F7F1E8"</w:t>
+      </w:r>
+    </w:p>
+    <w:p>
+      <w:pPr>
+        <w:spacing w:after="0"/>
+        <w:ind w:left="283"/>
+      </w:pPr>
+      <w:r>
+        <w:rPr>
+          <w:rFonts w:ascii="Consolas" w:hAnsi="Consolas" w:eastAsia="Consolas"/>
+          <w:sz w:val="16"/>
+        </w:rPr>
         <w:t xml:space="preserve">  orm: "SQLAlchemy ORM"</w:t>
       </w:r>
     </w:p>
@@ -410,7 +616,7 @@
           <w:rFonts w:ascii="Consolas" w:hAnsi="Consolas" w:eastAsia="Consolas"/>
           <w:sz w:val="16"/>
         </w:rPr>
-        <w:t xml:space="preserve">  database: {</w:t>
+        <w:t xml:space="preserve">  db: {</w:t>
       </w:r>
     </w:p>
     <w:p>
@@ -423,7 +629,7 @@
           <w:rFonts w:ascii="Consolas" w:hAnsi="Consolas" w:eastAsia="Consolas"/>
           <w:sz w:val="16"/>
         </w:rPr>
-        <w:t xml:space="preserve">    label: "SQLite / production DB"</w:t>
+        <w:t xml:space="preserve">    label: "DB tables: users, assets, requests"</w:t>
       </w:r>
     </w:p>
     <w:p>
@@ -462,7 +668,7 @@
           <w:rFonts w:ascii="Consolas" w:hAnsi="Consolas" w:eastAsia="Consolas"/>
           <w:sz w:val="16"/>
         </w:rPr>
-        <w:t xml:space="preserve">  refresh_store: {</w:t>
+        <w:t xml:space="preserve">  refresh_tokens: {</w:t>
       </w:r>
     </w:p>
     <w:p>
@@ -475,7 +681,7 @@
           <w:rFonts w:ascii="Consolas" w:hAnsi="Consolas" w:eastAsia="Consolas"/>
           <w:sz w:val="16"/>
         </w:rPr>
-        <w:t xml:space="preserve">    label: "Refresh token hash store"</w:t>
+        <w:t xml:space="preserve">    label: "Refresh token hashes"</w:t>
       </w:r>
     </w:p>
     <w:p>
@@ -514,6 +720,58 @@
           <w:rFonts w:ascii="Consolas" w:hAnsi="Consolas" w:eastAsia="Consolas"/>
           <w:sz w:val="16"/>
         </w:rPr>
+        <w:t xml:space="preserve">  audit_logs: {</w:t>
+      </w:r>
+    </w:p>
+    <w:p>
+      <w:pPr>
+        <w:spacing w:after="0"/>
+        <w:ind w:left="283"/>
+      </w:pPr>
+      <w:r>
+        <w:rPr>
+          <w:rFonts w:ascii="Consolas" w:hAnsi="Consolas" w:eastAsia="Consolas"/>
+          <w:sz w:val="16"/>
+        </w:rPr>
+        <w:t xml:space="preserve">    label: "Audit log records"</w:t>
+      </w:r>
+    </w:p>
+    <w:p>
+      <w:pPr>
+        <w:spacing w:after="0"/>
+        <w:ind w:left="283"/>
+      </w:pPr>
+      <w:r>
+        <w:rPr>
+          <w:rFonts w:ascii="Consolas" w:hAnsi="Consolas" w:eastAsia="Consolas"/>
+          <w:sz w:val="16"/>
+        </w:rPr>
+        <w:t xml:space="preserve">    shape: cylinder</w:t>
+      </w:r>
+    </w:p>
+    <w:p>
+      <w:pPr>
+        <w:spacing w:after="0"/>
+        <w:ind w:left="283"/>
+      </w:pPr>
+      <w:r>
+        <w:rPr>
+          <w:rFonts w:ascii="Consolas" w:hAnsi="Consolas" w:eastAsia="Consolas"/>
+          <w:sz w:val="16"/>
+        </w:rPr>
+        <w:t xml:space="preserve">  }</w:t>
+      </w:r>
+    </w:p>
+    <w:p>
+      <w:pPr>
+        <w:spacing w:after="0"/>
+        <w:ind w:left="283"/>
+      </w:pPr>
+      <w:r>
+        <w:rPr>
+          <w:rFonts w:ascii="Consolas" w:hAnsi="Consolas" w:eastAsia="Consolas"/>
+          <w:sz w:val="16"/>
+        </w:rPr>
         <w:t>}</w:t>
       </w:r>
     </w:p>
@@ -539,7 +797,7 @@
           <w:rFonts w:ascii="Consolas" w:hAnsi="Consolas" w:eastAsia="Consolas"/>
           <w:sz w:val="16"/>
         </w:rPr>
-        <w:t>external.client -&gt; application.routes: "JSON, form data, query params, headers"</w:t>
+        <w:t>configuration: {</w:t>
       </w:r>
     </w:p>
     <w:p>
@@ -552,7 +810,7 @@
           <w:rFonts w:ascii="Consolas" w:hAnsi="Consolas" w:eastAsia="Consolas"/>
           <w:sz w:val="16"/>
         </w:rPr>
-        <w:t>external.frontend -&gt; application.routes: "same-origin fetch; textContent rendering"</w:t>
+        <w:t xml:space="preserve">  label: "Zone 4: Deployment configuration boundary"</w:t>
       </w:r>
     </w:p>
     <w:p>
@@ -565,7 +823,7 @@
           <w:rFonts w:ascii="Consolas" w:hAnsi="Consolas" w:eastAsia="Consolas"/>
           <w:sz w:val="16"/>
         </w:rPr>
-        <w:t>application.routes -&gt; application.validation</w:t>
+        <w:t xml:space="preserve">  style.fill: "#EEF0F4"</w:t>
       </w:r>
     </w:p>
     <w:p>
@@ -578,7 +836,7 @@
           <w:rFonts w:ascii="Consolas" w:hAnsi="Consolas" w:eastAsia="Consolas"/>
           <w:sz w:val="16"/>
         </w:rPr>
-        <w:t>application.routes -&gt; application.dependencies</w:t>
+        <w:t xml:space="preserve">  env: "Environment variables"</w:t>
       </w:r>
     </w:p>
     <w:p>
@@ -591,7 +849,7 @@
           <w:rFonts w:ascii="Consolas" w:hAnsi="Consolas" w:eastAsia="Consolas"/>
           <w:sz w:val="16"/>
         </w:rPr>
-        <w:t>application.dependencies -&gt; application.authorization</w:t>
+        <w:t xml:space="preserve">  settings: "Settings validation"</w:t>
       </w:r>
     </w:p>
     <w:p>
@@ -604,7 +862,7 @@
           <w:rFonts w:ascii="Consolas" w:hAnsi="Consolas" w:eastAsia="Consolas"/>
           <w:sz w:val="16"/>
         </w:rPr>
-        <w:t>application.validation -&gt; application.services</w:t>
+        <w:t xml:space="preserve">  secrets: "SECRET_KEY, TTLs, bootstrap passwords"</w:t>
       </w:r>
     </w:p>
     <w:p>
@@ -617,7 +875,7 @@
           <w:rFonts w:ascii="Consolas" w:hAnsi="Consolas" w:eastAsia="Consolas"/>
           <w:sz w:val="16"/>
         </w:rPr>
-        <w:t>application.authorization -&gt; application.services</w:t>
+        <w:t>}</w:t>
       </w:r>
     </w:p>
     <w:p>
@@ -630,7 +888,6 @@
           <w:rFonts w:ascii="Consolas" w:hAnsi="Consolas" w:eastAsia="Consolas"/>
           <w:sz w:val="16"/>
         </w:rPr>
-        <w:t>application.services -&gt; application.orm</w:t>
       </w:r>
     </w:p>
     <w:p>
@@ -643,7 +900,7 @@
           <w:rFonts w:ascii="Consolas" w:hAnsi="Consolas" w:eastAsia="Consolas"/>
           <w:sz w:val="16"/>
         </w:rPr>
-        <w:t>application.orm -&gt; application.database</w:t>
+        <w:t>b2: {</w:t>
       </w:r>
     </w:p>
     <w:p>
@@ -656,7 +913,7 @@
           <w:rFonts w:ascii="Consolas" w:hAnsi="Consolas" w:eastAsia="Consolas"/>
           <w:sz w:val="16"/>
         </w:rPr>
-        <w:t>application.services -&gt; application.refresh_store</w:t>
+        <w:t xml:space="preserve">  label: "B2: filtered response leaves server"</w:t>
       </w:r>
     </w:p>
     <w:p>
@@ -669,7 +926,7 @@
           <w:rFonts w:ascii="Consolas" w:hAnsi="Consolas" w:eastAsia="Consolas"/>
           <w:sz w:val="16"/>
         </w:rPr>
-        <w:t>application.services -&gt; application.audit</w:t>
+        <w:t xml:space="preserve">  shape: diamond</w:t>
       </w:r>
     </w:p>
     <w:p>
@@ -682,7 +939,408 @@
           <w:rFonts w:ascii="Consolas" w:hAnsi="Consolas" w:eastAsia="Consolas"/>
           <w:sz w:val="16"/>
         </w:rPr>
-        <w:t>application.audit -&gt; application.database</w:t>
+        <w:t>}</w:t>
+      </w:r>
+    </w:p>
+    <w:p>
+      <w:pPr>
+        <w:spacing w:after="0"/>
+        <w:ind w:left="283"/>
+      </w:pPr>
+      <w:r>
+        <w:rPr>
+          <w:rFonts w:ascii="Consolas" w:hAnsi="Consolas" w:eastAsia="Consolas"/>
+          <w:sz w:val="16"/>
+        </w:rPr>
+      </w:r>
+    </w:p>
+    <w:p>
+      <w:pPr>
+        <w:spacing w:after="0"/>
+        <w:ind w:left="283"/>
+      </w:pPr>
+      <w:r>
+        <w:rPr>
+          <w:rFonts w:ascii="Consolas" w:hAnsi="Consolas" w:eastAsia="Consolas"/>
+          <w:sz w:val="16"/>
+        </w:rPr>
+        <w:t>client_out: {</w:t>
+      </w:r>
+    </w:p>
+    <w:p>
+      <w:pPr>
+        <w:spacing w:after="0"/>
+        <w:ind w:left="283"/>
+      </w:pPr>
+      <w:r>
+        <w:rPr>
+          <w:rFonts w:ascii="Consolas" w:hAnsi="Consolas" w:eastAsia="Consolas"/>
+          <w:sz w:val="16"/>
+        </w:rPr>
+        <w:t xml:space="preserve">  label: "Zone 1b: Untrusted response handling"</w:t>
+      </w:r>
+    </w:p>
+    <w:p>
+      <w:pPr>
+        <w:spacing w:after="0"/>
+        <w:ind w:left="283"/>
+      </w:pPr>
+      <w:r>
+        <w:rPr>
+          <w:rFonts w:ascii="Consolas" w:hAnsi="Consolas" w:eastAsia="Consolas"/>
+          <w:sz w:val="16"/>
+        </w:rPr>
+        <w:t xml:space="preserve">  style.fill: "#FFF5F2"</w:t>
+      </w:r>
+    </w:p>
+    <w:p>
+      <w:pPr>
+        <w:spacing w:after="0"/>
+        <w:ind w:left="283"/>
+      </w:pPr>
+      <w:r>
+        <w:rPr>
+          <w:rFonts w:ascii="Consolas" w:hAnsi="Consolas" w:eastAsia="Consolas"/>
+          <w:sz w:val="16"/>
+        </w:rPr>
+        <w:t xml:space="preserve">  browser_runtime: "Browser runtime receives JSON/static responses"</w:t>
+      </w:r>
+    </w:p>
+    <w:p>
+      <w:pPr>
+        <w:spacing w:after="0"/>
+        <w:ind w:left="283"/>
+      </w:pPr>
+      <w:r>
+        <w:rPr>
+          <w:rFonts w:ascii="Consolas" w:hAnsi="Consolas" w:eastAsia="Consolas"/>
+          <w:sz w:val="16"/>
+        </w:rPr>
+        <w:t xml:space="preserve">  dom: "DOM rendering surface"</w:t>
+      </w:r>
+    </w:p>
+    <w:p>
+      <w:pPr>
+        <w:spacing w:after="0"/>
+        <w:ind w:left="283"/>
+      </w:pPr>
+      <w:r>
+        <w:rPr>
+          <w:rFonts w:ascii="Consolas" w:hAnsi="Consolas" w:eastAsia="Consolas"/>
+          <w:sz w:val="16"/>
+        </w:rPr>
+        <w:t>}</w:t>
+      </w:r>
+    </w:p>
+    <w:p>
+      <w:pPr>
+        <w:spacing w:after="0"/>
+        <w:ind w:left="283"/>
+      </w:pPr>
+      <w:r>
+        <w:rPr>
+          <w:rFonts w:ascii="Consolas" w:hAnsi="Consolas" w:eastAsia="Consolas"/>
+          <w:sz w:val="16"/>
+        </w:rPr>
+      </w:r>
+    </w:p>
+    <w:p>
+      <w:pPr>
+        <w:spacing w:after="0"/>
+        <w:ind w:left="283"/>
+      </w:pPr>
+      <w:r>
+        <w:rPr>
+          <w:rFonts w:ascii="Consolas" w:hAnsi="Consolas" w:eastAsia="Consolas"/>
+          <w:sz w:val="16"/>
+        </w:rPr>
+        <w:t>client_in.user -&gt; client_in.browser_js: "uses UI"</w:t>
+      </w:r>
+    </w:p>
+    <w:p>
+      <w:pPr>
+        <w:spacing w:after="0"/>
+        <w:ind w:left="283"/>
+      </w:pPr>
+      <w:r>
+        <w:rPr>
+          <w:rFonts w:ascii="Consolas" w:hAnsi="Consolas" w:eastAsia="Consolas"/>
+          <w:sz w:val="16"/>
+        </w:rPr>
+        <w:t>client_in.browser_js -&gt; b1: "same-origin fetch with JSON/form/query/header data"</w:t>
+      </w:r>
+    </w:p>
+    <w:p>
+      <w:pPr>
+        <w:spacing w:after="0"/>
+        <w:ind w:left="283"/>
+      </w:pPr>
+      <w:r>
+        <w:rPr>
+          <w:rFonts w:ascii="Consolas" w:hAnsi="Consolas" w:eastAsia="Consolas"/>
+          <w:sz w:val="16"/>
+        </w:rPr>
+        <w:t>client_in.api_client -&gt; b1: "direct HTTP request"</w:t>
+      </w:r>
+    </w:p>
+    <w:p>
+      <w:pPr>
+        <w:spacing w:after="0"/>
+        <w:ind w:left="283"/>
+      </w:pPr>
+      <w:r>
+        <w:rPr>
+          <w:rFonts w:ascii="Consolas" w:hAnsi="Consolas" w:eastAsia="Consolas"/>
+          <w:sz w:val="16"/>
+        </w:rPr>
+        <w:t>b1 -&gt; server.ingress: "first server-side control point"</w:t>
+      </w:r>
+    </w:p>
+    <w:p>
+      <w:pPr>
+        <w:spacing w:after="0"/>
+        <w:ind w:left="283"/>
+      </w:pPr>
+      <w:r>
+        <w:rPr>
+          <w:rFonts w:ascii="Consolas" w:hAnsi="Consolas" w:eastAsia="Consolas"/>
+          <w:sz w:val="16"/>
+        </w:rPr>
+        <w:t>server.ingress -&gt; server.routes: "bounded body and security headers"</w:t>
+      </w:r>
+    </w:p>
+    <w:p>
+      <w:pPr>
+        <w:spacing w:after="0"/>
+        <w:ind w:left="283"/>
+      </w:pPr>
+      <w:r>
+        <w:rPr>
+          <w:rFonts w:ascii="Consolas" w:hAnsi="Consolas" w:eastAsia="Consolas"/>
+          <w:sz w:val="16"/>
+        </w:rPr>
+        <w:t>server.routes -&gt; server.validation: "parse and validate user input"</w:t>
+      </w:r>
+    </w:p>
+    <w:p>
+      <w:pPr>
+        <w:spacing w:after="0"/>
+        <w:ind w:left="283"/>
+      </w:pPr>
+      <w:r>
+        <w:rPr>
+          <w:rFonts w:ascii="Consolas" w:hAnsi="Consolas" w:eastAsia="Consolas"/>
+          <w:sz w:val="16"/>
+        </w:rPr>
+        <w:t>server.routes -&gt; server.auth_context: "load bearer token, user and DB session"</w:t>
+      </w:r>
+    </w:p>
+    <w:p>
+      <w:pPr>
+        <w:spacing w:after="0"/>
+        <w:ind w:left="283"/>
+      </w:pPr>
+      <w:r>
+        <w:rPr>
+          <w:rFonts w:ascii="Consolas" w:hAnsi="Consolas" w:eastAsia="Consolas"/>
+          <w:sz w:val="16"/>
+        </w:rPr>
+        <w:t>server.auth_context -&gt; server.authz: "current role and object relation"</w:t>
+      </w:r>
+    </w:p>
+    <w:p>
+      <w:pPr>
+        <w:spacing w:after="0"/>
+        <w:ind w:left="283"/>
+      </w:pPr>
+      <w:r>
+        <w:rPr>
+          <w:rFonts w:ascii="Consolas" w:hAnsi="Consolas" w:eastAsia="Consolas"/>
+          <w:sz w:val="16"/>
+        </w:rPr>
+        <w:t>server.routes -&gt; server.authn: "login/refresh flow"</w:t>
+      </w:r>
+    </w:p>
+    <w:p>
+      <w:pPr>
+        <w:spacing w:after="0"/>
+        <w:ind w:left="283"/>
+      </w:pPr>
+      <w:r>
+        <w:rPr>
+          <w:rFonts w:ascii="Consolas" w:hAnsi="Consolas" w:eastAsia="Consolas"/>
+          <w:sz w:val="16"/>
+        </w:rPr>
+        <w:t>server.validation -&gt; server.services: "validated payload only"</w:t>
+      </w:r>
+    </w:p>
+    <w:p>
+      <w:pPr>
+        <w:spacing w:after="0"/>
+        <w:ind w:left="283"/>
+      </w:pPr>
+      <w:r>
+        <w:rPr>
+          <w:rFonts w:ascii="Consolas" w:hAnsi="Consolas" w:eastAsia="Consolas"/>
+          <w:sz w:val="16"/>
+        </w:rPr>
+        <w:t>server.authz -&gt; server.services: "allowed action only"</w:t>
+      </w:r>
+    </w:p>
+    <w:p>
+      <w:pPr>
+        <w:spacing w:after="0"/>
+        <w:ind w:left="283"/>
+      </w:pPr>
+      <w:r>
+        <w:rPr>
+          <w:rFonts w:ascii="Consolas" w:hAnsi="Consolas" w:eastAsia="Consolas"/>
+          <w:sz w:val="16"/>
+        </w:rPr>
+        <w:t>server.services -&gt; server.audit: "operation outcome"</w:t>
+      </w:r>
+    </w:p>
+    <w:p>
+      <w:pPr>
+        <w:spacing w:after="0"/>
+        <w:ind w:left="283"/>
+      </w:pPr>
+      <w:r>
+        <w:rPr>
+          <w:rFonts w:ascii="Consolas" w:hAnsi="Consolas" w:eastAsia="Consolas"/>
+          <w:sz w:val="16"/>
+        </w:rPr>
+        <w:t>server.services -&gt; persistence: "ORM reads/writes, refresh hashes and audit records"</w:t>
+      </w:r>
+    </w:p>
+    <w:p>
+      <w:pPr>
+        <w:spacing w:after="0"/>
+        <w:ind w:left="283"/>
+      </w:pPr>
+      <w:r>
+        <w:rPr>
+          <w:rFonts w:ascii="Consolas" w:hAnsi="Consolas" w:eastAsia="Consolas"/>
+          <w:sz w:val="16"/>
+        </w:rPr>
+        <w:t>server.authn -&gt; persistence: "store refresh token hash only"</w:t>
+      </w:r>
+    </w:p>
+    <w:p>
+      <w:pPr>
+        <w:spacing w:after="0"/>
+        <w:ind w:left="283"/>
+      </w:pPr>
+      <w:r>
+        <w:rPr>
+          <w:rFonts w:ascii="Consolas" w:hAnsi="Consolas" w:eastAsia="Consolas"/>
+          <w:sz w:val="16"/>
+        </w:rPr>
+        <w:t>server.audit -&gt; persistence: "structured event without secrets"</w:t>
+      </w:r>
+    </w:p>
+    <w:p>
+      <w:pPr>
+        <w:spacing w:after="0"/>
+        <w:ind w:left="283"/>
+      </w:pPr>
+      <w:r>
+        <w:rPr>
+          <w:rFonts w:ascii="Consolas" w:hAnsi="Consolas" w:eastAsia="Consolas"/>
+          <w:sz w:val="16"/>
+        </w:rPr>
+        <w:t>server.services -&gt; server.response_filter: "domain object"</w:t>
+      </w:r>
+    </w:p>
+    <w:p>
+      <w:pPr>
+        <w:spacing w:after="0"/>
+        <w:ind w:left="283"/>
+      </w:pPr>
+      <w:r>
+        <w:rPr>
+          <w:rFonts w:ascii="Consolas" w:hAnsi="Consolas" w:eastAsia="Consolas"/>
+          <w:sz w:val="16"/>
+        </w:rPr>
+        <w:t>server.static_handler -&gt; server.response_filter: "HTML/CSS/JS response also exits through B2"</w:t>
+      </w:r>
+    </w:p>
+    <w:p>
+      <w:pPr>
+        <w:spacing w:after="0"/>
+        <w:ind w:left="283"/>
+      </w:pPr>
+      <w:r>
+        <w:rPr>
+          <w:rFonts w:ascii="Consolas" w:hAnsi="Consolas" w:eastAsia="Consolas"/>
+          <w:sz w:val="16"/>
+        </w:rPr>
+        <w:t>server.response_filter -&gt; b2: "response_model-filtered JSON or static response"</w:t>
+      </w:r>
+    </w:p>
+    <w:p>
+      <w:pPr>
+        <w:spacing w:after="0"/>
+        <w:ind w:left="283"/>
+      </w:pPr>
+      <w:r>
+        <w:rPr>
+          <w:rFonts w:ascii="Consolas" w:hAnsi="Consolas" w:eastAsia="Consolas"/>
+          <w:sz w:val="16"/>
+        </w:rPr>
+        <w:t>b2 -&gt; client_out.browser_runtime: "data/code leaves server trust boundary"</w:t>
+      </w:r>
+    </w:p>
+    <w:p>
+      <w:pPr>
+        <w:spacing w:after="0"/>
+        <w:ind w:left="283"/>
+      </w:pPr>
+      <w:r>
+        <w:rPr>
+          <w:rFonts w:ascii="Consolas" w:hAnsi="Consolas" w:eastAsia="Consolas"/>
+          <w:sz w:val="16"/>
+        </w:rPr>
+        <w:t>client_out.browser_runtime -&gt; client_out.dom: "render API data with textContent"</w:t>
+      </w:r>
+    </w:p>
+    <w:p>
+      <w:pPr>
+        <w:spacing w:after="0"/>
+        <w:ind w:left="283"/>
+      </w:pPr>
+      <w:r>
+        <w:rPr>
+          <w:rFonts w:ascii="Consolas" w:hAnsi="Consolas" w:eastAsia="Consolas"/>
+          <w:sz w:val="16"/>
+        </w:rPr>
+        <w:t>configuration.env -&gt; configuration.secrets: "deployment-provided values"</w:t>
+      </w:r>
+    </w:p>
+    <w:p>
+      <w:pPr>
+        <w:spacing w:after="0"/>
+        <w:ind w:left="283"/>
+      </w:pPr>
+      <w:r>
+        <w:rPr>
+          <w:rFonts w:ascii="Consolas" w:hAnsi="Consolas" w:eastAsia="Consolas"/>
+          <w:sz w:val="16"/>
+        </w:rPr>
+        <w:t>configuration.secrets -&gt; configuration.settings: "startup validation"</w:t>
+      </w:r>
+    </w:p>
+    <w:p>
+      <w:pPr>
+        <w:spacing w:after="0"/>
+        <w:ind w:left="283"/>
+      </w:pPr>
+      <w:r>
+        <w:rPr>
+          <w:rFonts w:ascii="Consolas" w:hAnsi="Consolas" w:eastAsia="Consolas"/>
+          <w:sz w:val="16"/>
+        </w:rPr>
+        <w:t>configuration.settings -&gt; server: "validated secret, TTL and request-limit policy"</w:t>
       </w:r>
     </w:p>
     <w:p>
@@ -892,7 +1550,7 @@
                 <w:i w:val="0"/>
                 <w:sz w:val="16"/>
               </w:rPr>
-              <w:t>Browser/API client</w:t>
+              <w:t>FastAPI static asset handler</w:t>
             </w:r>
           </w:p>
         </w:tc>
@@ -918,7 +1576,7 @@
                 <w:i w:val="0"/>
                 <w:sz w:val="16"/>
               </w:rPr>
-              <w:t>FastAPI routes</w:t>
+              <w:t>Browser runtime</w:t>
             </w:r>
           </w:p>
         </w:tc>
@@ -944,7 +1602,7 @@
                 <w:i w:val="0"/>
                 <w:sz w:val="16"/>
               </w:rPr>
-              <w:t>JSON, form data, query params, headers</w:t>
+              <w:t>HTML/CSS/JS delivery</w:t>
             </w:r>
           </w:p>
         </w:tc>
@@ -970,7 +1628,7 @@
                 <w:i w:val="0"/>
                 <w:sz w:val="16"/>
               </w:rPr>
-              <w:t>Request size limit, Pydantic validation, neutral errors.</w:t>
+              <w:t>After delivery the frontend executes in the untrusted client environment.</w:t>
             </w:r>
           </w:p>
         </w:tc>
@@ -1024,7 +1682,7 @@
                 <w:i w:val="0"/>
                 <w:sz w:val="16"/>
               </w:rPr>
-              <w:t>Static frontend /app</w:t>
+              <w:t>Browser runtime / API client</w:t>
             </w:r>
           </w:p>
         </w:tc>
@@ -1050,7 +1708,7 @@
                 <w:i w:val="0"/>
                 <w:sz w:val="16"/>
               </w:rPr>
-              <w:t>FastAPI routes</w:t>
+              <w:t>FastAPI middleware</w:t>
             </w:r>
           </w:p>
         </w:tc>
@@ -1076,7 +1734,7 @@
                 <w:i w:val="0"/>
                 <w:sz w:val="16"/>
               </w:rPr>
-              <w:t>same-origin API calls</w:t>
+              <w:t>JSON, form data, query params, Authorization header</w:t>
             </w:r>
           </w:p>
         </w:tc>
@@ -1102,7 +1760,7 @@
                 <w:i w:val="0"/>
                 <w:sz w:val="16"/>
               </w:rPr>
-              <w:t>No token persistence; API data rendered with textContent.</w:t>
+              <w:t>Main trust-boundary crossing B1; request size limit and security headers.</w:t>
             </w:r>
           </w:p>
         </w:tc>
@@ -1182,7 +1840,7 @@
                 <w:i w:val="0"/>
                 <w:sz w:val="16"/>
               </w:rPr>
-              <w:t>Dependencies</w:t>
+              <w:t>Validation and dependencies</w:t>
             </w:r>
           </w:p>
         </w:tc>
@@ -1208,7 +1866,7 @@
                 <w:i w:val="0"/>
                 <w:sz w:val="16"/>
               </w:rPr>
-              <w:t>Bearer token and DB session</w:t>
+              <w:t>payload, query values, bearer token, DB session</w:t>
             </w:r>
           </w:p>
         </w:tc>
@@ -1234,7 +1892,7 @@
                 <w:i w:val="0"/>
                 <w:sz w:val="16"/>
               </w:rPr>
-              <w:t>JWT validation, active user check, session lifecycle in dependency.</w:t>
+              <w:t>Pydantic validation, Query(le=...), JWT validation, active-user check.</w:t>
             </w:r>
           </w:p>
         </w:tc>
@@ -1288,7 +1946,7 @@
                 <w:i w:val="0"/>
                 <w:sz w:val="16"/>
               </w:rPr>
-              <w:t>Dependencies</w:t>
+              <w:t>Authorization matrix</w:t>
             </w:r>
           </w:p>
         </w:tc>
@@ -1314,7 +1972,7 @@
                 <w:i w:val="0"/>
                 <w:sz w:val="16"/>
               </w:rPr>
-              <w:t>Authorization matrix</w:t>
+              <w:t>Business services</w:t>
             </w:r>
           </w:p>
         </w:tc>
@@ -1340,7 +1998,7 @@
                 <w:i w:val="0"/>
                 <w:sz w:val="16"/>
               </w:rPr>
-              <w:t>current user role and object relation</w:t>
+              <w:t>role, object ownership, requested transition</w:t>
             </w:r>
           </w:p>
         </w:tc>
@@ -1366,7 +2024,7 @@
                 <w:i w:val="0"/>
                 <w:sz w:val="16"/>
               </w:rPr>
-              <w:t>Role checks plus object-level status transition checks.</w:t>
+              <w:t>Server-side role and object checks before state mutation.</w:t>
             </w:r>
           </w:p>
         </w:tc>
@@ -1420,7 +2078,7 @@
                 <w:i w:val="0"/>
                 <w:sz w:val="16"/>
               </w:rPr>
-              <w:t>Services</w:t>
+              <w:t>Business services</w:t>
             </w:r>
           </w:p>
         </w:tc>
@@ -1446,7 +2104,7 @@
                 <w:i w:val="0"/>
                 <w:sz w:val="16"/>
               </w:rPr>
-              <w:t>SQLAlchemy ORM / DB</w:t>
+              <w:t>Persistence boundary</w:t>
             </w:r>
           </w:p>
         </w:tc>
@@ -1472,7 +2130,7 @@
                 <w:i w:val="0"/>
                 <w:sz w:val="16"/>
               </w:rPr>
-              <w:t>validated business objects</w:t>
+              <w:t>ORM query/update, refresh hash, audit record</w:t>
             </w:r>
           </w:p>
         </w:tc>
@@ -1498,7 +2156,7 @@
                 <w:i w:val="0"/>
                 <w:sz w:val="16"/>
               </w:rPr>
-              <w:t>Expression API, bounded pagination, no raw SQL string construction.</w:t>
+              <w:t>SQLAlchemy expression API, hash-only token storage, no secret audit details.</w:t>
             </w:r>
           </w:p>
         </w:tc>
@@ -1552,7 +2210,7 @@
                 <w:i w:val="0"/>
                 <w:sz w:val="16"/>
               </w:rPr>
-              <w:t>Services</w:t>
+              <w:t>Response models</w:t>
             </w:r>
           </w:p>
         </w:tc>
@@ -1578,7 +2236,7 @@
                 <w:i w:val="0"/>
                 <w:sz w:val="16"/>
               </w:rPr>
-              <w:t>Audit log helper</w:t>
+              <w:t>Browser DOM surface</w:t>
             </w:r>
           </w:p>
         </w:tc>
@@ -1604,7 +2262,7 @@
                 <w:i w:val="0"/>
                 <w:sz w:val="16"/>
               </w:rPr>
-              <w:t>structured event details</w:t>
+              <w:t>serialized JSON response</w:t>
             </w:r>
           </w:p>
         </w:tc>
@@ -1630,7 +2288,139 @@
                 <w:i w:val="0"/>
                 <w:sz w:val="16"/>
               </w:rPr>
-              <w:t>No password/token logging; controlled action names.</w:t>
+              <w:t>Boundary crossing B2; response_model filtering and textContent rendering.</w:t>
+            </w:r>
+          </w:p>
+        </w:tc>
+      </w:tr>
+      <w:tr>
+        <w:tc>
+          <w:tcPr>
+            <w:tcW w:type="dxa" w:w="1133"/>
+            <w:vAlign w:val="center"/>
+            <w:tcMar>
+              <w:top w:w="90" w:type="dxa"/>
+              <w:start w:w="90" w:type="dxa"/>
+              <w:bottom w:w="90" w:type="dxa"/>
+              <w:end w:w="90" w:type="dxa"/>
+            </w:tcMar>
+          </w:tcPr>
+          <w:p>
+            <w:pPr>
+              <w:spacing w:after="0"/>
+            </w:pPr>
+            <w:r>
+              <w:rPr>
+                <w:rFonts w:ascii="Times New Roman" w:hAnsi="Times New Roman" w:eastAsia="Times New Roman"/>
+                <w:b w:val="0"/>
+                <w:i w:val="0"/>
+                <w:sz w:val="16"/>
+              </w:rPr>
+              <w:t>F7</w:t>
+            </w:r>
+          </w:p>
+        </w:tc>
+        <w:tc>
+          <w:tcPr>
+            <w:tcW w:type="dxa" w:w="3004"/>
+            <w:vAlign w:val="center"/>
+            <w:tcMar>
+              <w:top w:w="90" w:type="dxa"/>
+              <w:start w:w="90" w:type="dxa"/>
+              <w:bottom w:w="90" w:type="dxa"/>
+              <w:end w:w="90" w:type="dxa"/>
+            </w:tcMar>
+          </w:tcPr>
+          <w:p>
+            <w:pPr>
+              <w:spacing w:after="0"/>
+            </w:pPr>
+            <w:r>
+              <w:rPr>
+                <w:rFonts w:ascii="Times New Roman" w:hAnsi="Times New Roman" w:eastAsia="Times New Roman"/>
+                <w:b w:val="0"/>
+                <w:i w:val="0"/>
+                <w:sz w:val="16"/>
+              </w:rPr>
+              <w:t>Environment variables</w:t>
+            </w:r>
+          </w:p>
+        </w:tc>
+        <w:tc>
+          <w:tcPr>
+            <w:tcW w:type="dxa" w:w="3004"/>
+            <w:vAlign w:val="center"/>
+            <w:tcMar>
+              <w:top w:w="90" w:type="dxa"/>
+              <w:start w:w="90" w:type="dxa"/>
+              <w:bottom w:w="90" w:type="dxa"/>
+              <w:end w:w="90" w:type="dxa"/>
+            </w:tcMar>
+          </w:tcPr>
+          <w:p>
+            <w:pPr>
+              <w:spacing w:after="0"/>
+            </w:pPr>
+            <w:r>
+              <w:rPr>
+                <w:rFonts w:ascii="Times New Roman" w:hAnsi="Times New Roman" w:eastAsia="Times New Roman"/>
+                <w:b w:val="0"/>
+                <w:i w:val="0"/>
+                <w:sz w:val="16"/>
+              </w:rPr>
+              <w:t>Settings validation</w:t>
+            </w:r>
+          </w:p>
+        </w:tc>
+        <w:tc>
+          <w:tcPr>
+            <w:tcW w:type="dxa" w:w="3798"/>
+            <w:vAlign w:val="center"/>
+            <w:tcMar>
+              <w:top w:w="90" w:type="dxa"/>
+              <w:start w:w="90" w:type="dxa"/>
+              <w:bottom w:w="90" w:type="dxa"/>
+              <w:end w:w="90" w:type="dxa"/>
+            </w:tcMar>
+          </w:tcPr>
+          <w:p>
+            <w:pPr>
+              <w:spacing w:after="0"/>
+            </w:pPr>
+            <w:r>
+              <w:rPr>
+                <w:rFonts w:ascii="Times New Roman" w:hAnsi="Times New Roman" w:eastAsia="Times New Roman"/>
+                <w:b w:val="0"/>
+                <w:i w:val="0"/>
+                <w:sz w:val="16"/>
+              </w:rPr>
+              <w:t>SECRET_KEY, TTLs, bootstrap passwords, limits</w:t>
+            </w:r>
+          </w:p>
+        </w:tc>
+        <w:tc>
+          <w:tcPr>
+            <w:tcW w:type="dxa" w:w="4422"/>
+            <w:vAlign w:val="center"/>
+            <w:tcMar>
+              <w:top w:w="90" w:type="dxa"/>
+              <w:start w:w="90" w:type="dxa"/>
+              <w:bottom w:w="90" w:type="dxa"/>
+              <w:end w:w="90" w:type="dxa"/>
+            </w:tcMar>
+          </w:tcPr>
+          <w:p>
+            <w:pPr>
+              <w:spacing w:after="0"/>
+            </w:pPr>
+            <w:r>
+              <w:rPr>
+                <w:rFonts w:ascii="Times New Roman" w:hAnsi="Times New Roman" w:eastAsia="Times New Roman"/>
+                <w:b w:val="0"/>
+                <w:i w:val="0"/>
+                <w:sz w:val="16"/>
+              </w:rPr>
+              <w:t>Production rejects placeholder secrets, DEBUG=true, and unsafe bootstrap credentials.</w:t>
             </w:r>
           </w:p>
         </w:tc>
@@ -3118,7 +3908,7 @@
           <w:rFonts w:ascii="Consolas" w:hAnsi="Consolas" w:eastAsia="Consolas"/>
           <w:sz w:val="16"/>
         </w:rPr>
-        <w:t>direction: right</w:t>
+        <w:t>direction: down</w:t>
       </w:r>
     </w:p>
     <w:p>
@@ -3131,6 +3921,7 @@
           <w:rFonts w:ascii="Consolas" w:hAnsi="Consolas" w:eastAsia="Consolas"/>
           <w:sz w:val="16"/>
         </w:rPr>
+        <w:t>grid-rows: 6</w:t>
       </w:r>
     </w:p>
     <w:p>
@@ -3143,7 +3934,7 @@
           <w:rFonts w:ascii="Consolas" w:hAnsi="Consolas" w:eastAsia="Consolas"/>
           <w:sz w:val="16"/>
         </w:rPr>
-        <w:t>sources: {</w:t>
+        <w:t>grid-gap: 60</w:t>
       </w:r>
     </w:p>
     <w:p>
@@ -3156,7 +3947,6 @@
           <w:rFonts w:ascii="Consolas" w:hAnsi="Consolas" w:eastAsia="Consolas"/>
           <w:sz w:val="16"/>
         </w:rPr>
-        <w:t xml:space="preserve">  label: "Sources"</w:t>
       </w:r>
     </w:p>
     <w:p>
@@ -3169,7 +3959,7 @@
           <w:rFonts w:ascii="Consolas" w:hAnsi="Consolas" w:eastAsia="Consolas"/>
           <w:sz w:val="16"/>
         </w:rPr>
-        <w:t xml:space="preserve">  login: "Login form: email/password"</w:t>
+        <w:t>f1_authentication: {</w:t>
       </w:r>
     </w:p>
     <w:p>
@@ -3182,7 +3972,7 @@
           <w:rFonts w:ascii="Consolas" w:hAnsi="Consolas" w:eastAsia="Consolas"/>
           <w:sz w:val="16"/>
         </w:rPr>
-        <w:t xml:space="preserve">  token: "Bearer token"</w:t>
+        <w:t xml:space="preserve">  label: "F1. Authentication source to credential and refresh-token sinks"</w:t>
       </w:r>
     </w:p>
     <w:p>
@@ -3195,7 +3985,7 @@
           <w:rFonts w:ascii="Consolas" w:hAnsi="Consolas" w:eastAsia="Consolas"/>
           <w:sz w:val="16"/>
         </w:rPr>
-        <w:t xml:space="preserve">  params: "Path and query params"</w:t>
+        <w:t xml:space="preserve">  direction: right</w:t>
       </w:r>
     </w:p>
     <w:p>
@@ -3208,7 +3998,7 @@
           <w:rFonts w:ascii="Consolas" w:hAnsi="Consolas" w:eastAsia="Consolas"/>
           <w:sz w:val="16"/>
         </w:rPr>
-        <w:t xml:space="preserve">  body: "JSON request body"</w:t>
+        <w:t xml:space="preserve">  style.fill: "#FFF5F2"</w:t>
       </w:r>
     </w:p>
     <w:p>
@@ -3221,7 +4011,7 @@
           <w:rFonts w:ascii="Consolas" w:hAnsi="Consolas" w:eastAsia="Consolas"/>
           <w:sz w:val="16"/>
         </w:rPr>
-        <w:t xml:space="preserve">  filters: "Report filters"</w:t>
+        <w:t xml:space="preserve">  source: "Source: login form username/password in untrusted browser"</w:t>
       </w:r>
     </w:p>
     <w:p>
@@ -3234,6 +4024,110 @@
           <w:rFonts w:ascii="Consolas" w:hAnsi="Consolas" w:eastAsia="Consolas"/>
           <w:sz w:val="16"/>
         </w:rPr>
+        <w:t xml:space="preserve">  b1: {</w:t>
+      </w:r>
+    </w:p>
+    <w:p>
+      <w:pPr>
+        <w:spacing w:after="0"/>
+        <w:ind w:left="283"/>
+      </w:pPr>
+      <w:r>
+        <w:rPr>
+          <w:rFonts w:ascii="Consolas" w:hAnsi="Consolas" w:eastAsia="Consolas"/>
+          <w:sz w:val="16"/>
+        </w:rPr>
+        <w:t xml:space="preserve">    label: "B1: POST /auth/login enters FastAPI"</w:t>
+      </w:r>
+    </w:p>
+    <w:p>
+      <w:pPr>
+        <w:spacing w:after="0"/>
+        <w:ind w:left="283"/>
+      </w:pPr>
+      <w:r>
+        <w:rPr>
+          <w:rFonts w:ascii="Consolas" w:hAnsi="Consolas" w:eastAsia="Consolas"/>
+          <w:sz w:val="16"/>
+        </w:rPr>
+        <w:t xml:space="preserve">    shape: diamond</w:t>
+      </w:r>
+    </w:p>
+    <w:p>
+      <w:pPr>
+        <w:spacing w:after="0"/>
+        <w:ind w:left="283"/>
+      </w:pPr>
+      <w:r>
+        <w:rPr>
+          <w:rFonts w:ascii="Consolas" w:hAnsi="Consolas" w:eastAsia="Consolas"/>
+          <w:sz w:val="16"/>
+        </w:rPr>
+        <w:t xml:space="preserve">  }</w:t>
+      </w:r>
+    </w:p>
+    <w:p>
+      <w:pPr>
+        <w:spacing w:after="0"/>
+        <w:ind w:left="283"/>
+      </w:pPr>
+      <w:r>
+        <w:rPr>
+          <w:rFonts w:ascii="Consolas" w:hAnsi="Consolas" w:eastAsia="Consolas"/>
+          <w:sz w:val="16"/>
+        </w:rPr>
+        <w:t xml:space="preserve">  propagation: "Propagation: middleware -&gt; auth route -&gt; authentication service"</w:t>
+      </w:r>
+    </w:p>
+    <w:p>
+      <w:pPr>
+        <w:spacing w:after="0"/>
+        <w:ind w:left="283"/>
+      </w:pPr>
+      <w:r>
+        <w:rPr>
+          <w:rFonts w:ascii="Consolas" w:hAnsi="Consolas" w:eastAsia="Consolas"/>
+          <w:sz w:val="16"/>
+        </w:rPr>
+        <w:t xml:space="preserve">  sink: "Sinks: password hash verification and refresh token storage"</w:t>
+      </w:r>
+    </w:p>
+    <w:p>
+      <w:pPr>
+        <w:spacing w:after="0"/>
+        <w:ind w:left="283"/>
+      </w:pPr>
+      <w:r>
+        <w:rPr>
+          <w:rFonts w:ascii="Consolas" w:hAnsi="Consolas" w:eastAsia="Consolas"/>
+          <w:sz w:val="16"/>
+        </w:rPr>
+        <w:t xml:space="preserve">  protection: "Protection: dummy Argon2 path, neutral login error, hash-only refresh token"</w:t>
+      </w:r>
+    </w:p>
+    <w:p>
+      <w:pPr>
+        <w:spacing w:after="0"/>
+        <w:ind w:left="283"/>
+      </w:pPr>
+      <w:r>
+        <w:rPr>
+          <w:rFonts w:ascii="Consolas" w:hAnsi="Consolas" w:eastAsia="Consolas"/>
+          <w:sz w:val="16"/>
+        </w:rPr>
+        <w:t xml:space="preserve">  source -&gt; b1 -&gt; propagation -&gt; sink -&gt; protection</w:t>
+      </w:r>
+    </w:p>
+    <w:p>
+      <w:pPr>
+        <w:spacing w:after="0"/>
+        <w:ind w:left="283"/>
+      </w:pPr>
+      <w:r>
+        <w:rPr>
+          <w:rFonts w:ascii="Consolas" w:hAnsi="Consolas" w:eastAsia="Consolas"/>
+          <w:sz w:val="16"/>
+        </w:rPr>
         <w:t>}</w:t>
       </w:r>
     </w:p>
@@ -3259,7 +4153,7 @@
           <w:rFonts w:ascii="Consolas" w:hAnsi="Consolas" w:eastAsia="Consolas"/>
           <w:sz w:val="16"/>
         </w:rPr>
-        <w:t>propagation: {</w:t>
+        <w:t>f2_authorization: {</w:t>
       </w:r>
     </w:p>
     <w:p>
@@ -3272,7 +4166,7 @@
           <w:rFonts w:ascii="Consolas" w:hAnsi="Consolas" w:eastAsia="Consolas"/>
           <w:sz w:val="16"/>
         </w:rPr>
-        <w:t xml:space="preserve">  label: "Propagation"</w:t>
+        <w:t xml:space="preserve">  label: "F2. Bearer token source to authorization decision"</w:t>
       </w:r>
     </w:p>
     <w:p>
@@ -3285,7 +4179,7 @@
           <w:rFonts w:ascii="Consolas" w:hAnsi="Consolas" w:eastAsia="Consolas"/>
           <w:sz w:val="16"/>
         </w:rPr>
-        <w:t xml:space="preserve">  routes: "FastAPI routes"</w:t>
+        <w:t xml:space="preserve">  direction: right</w:t>
       </w:r>
     </w:p>
     <w:p>
@@ -3298,7 +4192,7 @@
           <w:rFonts w:ascii="Consolas" w:hAnsi="Consolas" w:eastAsia="Consolas"/>
           <w:sz w:val="16"/>
         </w:rPr>
-        <w:t xml:space="preserve">  schemas: "Pydantic schemas"</w:t>
+        <w:t xml:space="preserve">  style.fill: "#FFF5F2"</w:t>
       </w:r>
     </w:p>
     <w:p>
@@ -3311,7 +4205,7 @@
           <w:rFonts w:ascii="Consolas" w:hAnsi="Consolas" w:eastAsia="Consolas"/>
           <w:sz w:val="16"/>
         </w:rPr>
-        <w:t xml:space="preserve">  dependencies: "Dependencies"</w:t>
+        <w:t xml:space="preserve">  source: "Source: Authorization header from browser/API client"</w:t>
       </w:r>
     </w:p>
     <w:p>
@@ -3324,7 +4218,7 @@
           <w:rFonts w:ascii="Consolas" w:hAnsi="Consolas" w:eastAsia="Consolas"/>
           <w:sz w:val="16"/>
         </w:rPr>
-        <w:t xml:space="preserve">  services: "Service layer"</w:t>
+        <w:t xml:space="preserve">  b1: {</w:t>
       </w:r>
     </w:p>
     <w:p>
@@ -3337,7 +4231,7 @@
           <w:rFonts w:ascii="Consolas" w:hAnsi="Consolas" w:eastAsia="Consolas"/>
           <w:sz w:val="16"/>
         </w:rPr>
-        <w:t xml:space="preserve">  authz: "Authorization checks"</w:t>
+        <w:t xml:space="preserve">    label: "B1: protected request enters server"</w:t>
       </w:r>
     </w:p>
     <w:p>
@@ -3350,6 +4244,84 @@
           <w:rFonts w:ascii="Consolas" w:hAnsi="Consolas" w:eastAsia="Consolas"/>
           <w:sz w:val="16"/>
         </w:rPr>
+        <w:t xml:space="preserve">    shape: diamond</w:t>
+      </w:r>
+    </w:p>
+    <w:p>
+      <w:pPr>
+        <w:spacing w:after="0"/>
+        <w:ind w:left="283"/>
+      </w:pPr>
+      <w:r>
+        <w:rPr>
+          <w:rFonts w:ascii="Consolas" w:hAnsi="Consolas" w:eastAsia="Consolas"/>
+          <w:sz w:val="16"/>
+        </w:rPr>
+        <w:t xml:space="preserve">  }</w:t>
+      </w:r>
+    </w:p>
+    <w:p>
+      <w:pPr>
+        <w:spacing w:after="0"/>
+        <w:ind w:left="283"/>
+      </w:pPr>
+      <w:r>
+        <w:rPr>
+          <w:rFonts w:ascii="Consolas" w:hAnsi="Consolas" w:eastAsia="Consolas"/>
+          <w:sz w:val="16"/>
+        </w:rPr>
+        <w:t xml:space="preserve">  propagation: "Propagation: JWT dependency -&gt; active user lookup -&gt; DB session"</w:t>
+      </w:r>
+    </w:p>
+    <w:p>
+      <w:pPr>
+        <w:spacing w:after="0"/>
+        <w:ind w:left="283"/>
+      </w:pPr>
+      <w:r>
+        <w:rPr>
+          <w:rFonts w:ascii="Consolas" w:hAnsi="Consolas" w:eastAsia="Consolas"/>
+          <w:sz w:val="16"/>
+        </w:rPr>
+        <w:t xml:space="preserve">  sink: "Sink: authorization decision for role and object relation"</w:t>
+      </w:r>
+    </w:p>
+    <w:p>
+      <w:pPr>
+        <w:spacing w:after="0"/>
+        <w:ind w:left="283"/>
+      </w:pPr>
+      <w:r>
+        <w:rPr>
+          <w:rFonts w:ascii="Consolas" w:hAnsi="Consolas" w:eastAsia="Consolas"/>
+          <w:sz w:val="16"/>
+        </w:rPr>
+        <w:t xml:space="preserve">  protection: "Protection: signed JWT validation, active-user check, object-level matrix"</w:t>
+      </w:r>
+    </w:p>
+    <w:p>
+      <w:pPr>
+        <w:spacing w:after="0"/>
+        <w:ind w:left="283"/>
+      </w:pPr>
+      <w:r>
+        <w:rPr>
+          <w:rFonts w:ascii="Consolas" w:hAnsi="Consolas" w:eastAsia="Consolas"/>
+          <w:sz w:val="16"/>
+        </w:rPr>
+        <w:t xml:space="preserve">  source -&gt; b1 -&gt; propagation -&gt; sink -&gt; protection</w:t>
+      </w:r>
+    </w:p>
+    <w:p>
+      <w:pPr>
+        <w:spacing w:after="0"/>
+        <w:ind w:left="283"/>
+      </w:pPr>
+      <w:r>
+        <w:rPr>
+          <w:rFonts w:ascii="Consolas" w:hAnsi="Consolas" w:eastAsia="Consolas"/>
+          <w:sz w:val="16"/>
+        </w:rPr>
         <w:t>}</w:t>
       </w:r>
     </w:p>
@@ -3375,7 +4347,7 @@
           <w:rFonts w:ascii="Consolas" w:hAnsi="Consolas" w:eastAsia="Consolas"/>
           <w:sz w:val="16"/>
         </w:rPr>
-        <w:t>sinks: {</w:t>
+        <w:t>f3_query_data: {</w:t>
       </w:r>
     </w:p>
     <w:p>
@@ -3388,7 +4360,7 @@
           <w:rFonts w:ascii="Consolas" w:hAnsi="Consolas" w:eastAsia="Consolas"/>
           <w:sz w:val="16"/>
         </w:rPr>
-        <w:t xml:space="preserve">  label: "Dangerous sinks"</w:t>
+        <w:t xml:space="preserve">  label: "F3. Path and query input to database read sink"</w:t>
       </w:r>
     </w:p>
     <w:p>
@@ -3401,7 +4373,7 @@
           <w:rFonts w:ascii="Consolas" w:hAnsi="Consolas" w:eastAsia="Consolas"/>
           <w:sz w:val="16"/>
         </w:rPr>
-        <w:t xml:space="preserve">  auth: "Password verification and token issuance"</w:t>
+        <w:t xml:space="preserve">  direction: right</w:t>
       </w:r>
     </w:p>
     <w:p>
@@ -3414,7 +4386,7 @@
           <w:rFonts w:ascii="Consolas" w:hAnsi="Consolas" w:eastAsia="Consolas"/>
           <w:sz w:val="16"/>
         </w:rPr>
-        <w:t xml:space="preserve">  db: "SQLAlchemy DB queries"</w:t>
+        <w:t xml:space="preserve">  style.fill: "#FFF5F2"</w:t>
       </w:r>
     </w:p>
     <w:p>
@@ -3427,7 +4399,7 @@
           <w:rFonts w:ascii="Consolas" w:hAnsi="Consolas" w:eastAsia="Consolas"/>
           <w:sz w:val="16"/>
         </w:rPr>
-        <w:t xml:space="preserve">  status_update: "Maintenance status update"</w:t>
+        <w:t xml:space="preserve">  source: "Source: UUID path params, role/status filters, limit, offset"</w:t>
       </w:r>
     </w:p>
     <w:p>
@@ -3440,7 +4412,7 @@
           <w:rFonts w:ascii="Consolas" w:hAnsi="Consolas" w:eastAsia="Consolas"/>
           <w:sz w:val="16"/>
         </w:rPr>
-        <w:t xml:space="preserve">  audit_json: "Audit JSON details"</w:t>
+        <w:t xml:space="preserve">  b1: {</w:t>
       </w:r>
     </w:p>
     <w:p>
@@ -3453,7 +4425,7 @@
           <w:rFonts w:ascii="Consolas" w:hAnsi="Consolas" w:eastAsia="Consolas"/>
           <w:sz w:val="16"/>
         </w:rPr>
-        <w:t xml:space="preserve">  report_json: "Report JSON response"</w:t>
+        <w:t xml:space="preserve">    label: "B1: list/report request enters server"</w:t>
       </w:r>
     </w:p>
     <w:p>
@@ -3466,7 +4438,7 @@
           <w:rFonts w:ascii="Consolas" w:hAnsi="Consolas" w:eastAsia="Consolas"/>
           <w:sz w:val="16"/>
         </w:rPr>
-        <w:t xml:space="preserve">  dom: "Frontend DOM"</w:t>
+        <w:t xml:space="preserve">    shape: diamond</w:t>
       </w:r>
     </w:p>
     <w:p>
@@ -3479,6 +4451,71 @@
           <w:rFonts w:ascii="Consolas" w:hAnsi="Consolas" w:eastAsia="Consolas"/>
           <w:sz w:val="16"/>
         </w:rPr>
+        <w:t xml:space="preserve">  }</w:t>
+      </w:r>
+    </w:p>
+    <w:p>
+      <w:pPr>
+        <w:spacing w:after="0"/>
+        <w:ind w:left="283"/>
+      </w:pPr>
+      <w:r>
+        <w:rPr>
+          <w:rFonts w:ascii="Consolas" w:hAnsi="Consolas" w:eastAsia="Consolas"/>
+          <w:sz w:val="16"/>
+        </w:rPr>
+        <w:t xml:space="preserve">  propagation: "Propagation: FastAPI route -&gt; Pydantic/enum parsing -&gt; service layer"</w:t>
+      </w:r>
+    </w:p>
+    <w:p>
+      <w:pPr>
+        <w:spacing w:after="0"/>
+        <w:ind w:left="283"/>
+      </w:pPr>
+      <w:r>
+        <w:rPr>
+          <w:rFonts w:ascii="Consolas" w:hAnsi="Consolas" w:eastAsia="Consolas"/>
+          <w:sz w:val="16"/>
+        </w:rPr>
+        <w:t xml:space="preserve">  sink: "Sink: SQLAlchemy SELECT against users/assets/requests tables"</w:t>
+      </w:r>
+    </w:p>
+    <w:p>
+      <w:pPr>
+        <w:spacing w:after="0"/>
+        <w:ind w:left="283"/>
+      </w:pPr>
+      <w:r>
+        <w:rPr>
+          <w:rFonts w:ascii="Consolas" w:hAnsi="Consolas" w:eastAsia="Consolas"/>
+          <w:sz w:val="16"/>
+        </w:rPr>
+        <w:t xml:space="preserve">  protection: "Protection: Query(le=...), enum/UUID validation, ORM expressions"</w:t>
+      </w:r>
+    </w:p>
+    <w:p>
+      <w:pPr>
+        <w:spacing w:after="0"/>
+        <w:ind w:left="283"/>
+      </w:pPr>
+      <w:r>
+        <w:rPr>
+          <w:rFonts w:ascii="Consolas" w:hAnsi="Consolas" w:eastAsia="Consolas"/>
+          <w:sz w:val="16"/>
+        </w:rPr>
+        <w:t xml:space="preserve">  source -&gt; b1 -&gt; propagation -&gt; sink -&gt; protection</w:t>
+      </w:r>
+    </w:p>
+    <w:p>
+      <w:pPr>
+        <w:spacing w:after="0"/>
+        <w:ind w:left="283"/>
+      </w:pPr>
+      <w:r>
+        <w:rPr>
+          <w:rFonts w:ascii="Consolas" w:hAnsi="Consolas" w:eastAsia="Consolas"/>
+          <w:sz w:val="16"/>
+        </w:rPr>
         <w:t>}</w:t>
       </w:r>
     </w:p>
@@ -3504,7 +4541,7 @@
           <w:rFonts w:ascii="Consolas" w:hAnsi="Consolas" w:eastAsia="Consolas"/>
           <w:sz w:val="16"/>
         </w:rPr>
-        <w:t>protections: {</w:t>
+        <w:t>f4_state_change: {</w:t>
       </w:r>
     </w:p>
     <w:p>
@@ -3517,7 +4554,7 @@
           <w:rFonts w:ascii="Consolas" w:hAnsi="Consolas" w:eastAsia="Consolas"/>
           <w:sz w:val="16"/>
         </w:rPr>
-        <w:t xml:space="preserve">  label: "Protections"</w:t>
+        <w:t xml:space="preserve">  label: "F4. JSON body to maintenance status mutation sink"</w:t>
       </w:r>
     </w:p>
     <w:p>
@@ -3530,7 +4567,7 @@
           <w:rFonts w:ascii="Consolas" w:hAnsi="Consolas" w:eastAsia="Consolas"/>
           <w:sz w:val="16"/>
         </w:rPr>
-        <w:t xml:space="preserve">  argon2: "Argon2 and dummy hash"</w:t>
+        <w:t xml:space="preserve">  direction: right</w:t>
       </w:r>
     </w:p>
     <w:p>
@@ -3543,7 +4580,7 @@
           <w:rFonts w:ascii="Consolas" w:hAnsi="Consolas" w:eastAsia="Consolas"/>
           <w:sz w:val="16"/>
         </w:rPr>
-        <w:t xml:space="preserve">  orm_bounds: "ORM expressions and bounded pagination"</w:t>
+        <w:t xml:space="preserve">  style.fill: "#FFF5F2"</w:t>
       </w:r>
     </w:p>
     <w:p>
@@ -3556,7 +4593,7 @@
           <w:rFonts w:ascii="Consolas" w:hAnsi="Consolas" w:eastAsia="Consolas"/>
           <w:sz w:val="16"/>
         </w:rPr>
-        <w:t xml:space="preserve">  object_matrix: "Role plus object matrix"</w:t>
+        <w:t xml:space="preserve">  source: "Source: JSON body with status, assigned_engineer_id, internal_notes"</w:t>
       </w:r>
     </w:p>
     <w:p>
@@ -3569,7 +4606,7 @@
           <w:rFonts w:ascii="Consolas" w:hAnsi="Consolas" w:eastAsia="Consolas"/>
           <w:sz w:val="16"/>
         </w:rPr>
-        <w:t xml:space="preserve">  no_secret_logging: "No secret logging"</w:t>
+        <w:t xml:space="preserve">  b1: {</w:t>
       </w:r>
     </w:p>
     <w:p>
@@ -3582,7 +4619,7 @@
           <w:rFonts w:ascii="Consolas" w:hAnsi="Consolas" w:eastAsia="Consolas"/>
           <w:sz w:val="16"/>
         </w:rPr>
-        <w:t xml:space="preserve">  response_models: "Pydantic response models"</w:t>
+        <w:t xml:space="preserve">    label: "B1: create/update request enters server"</w:t>
       </w:r>
     </w:p>
     <w:p>
@@ -3595,7 +4632,7 @@
           <w:rFonts w:ascii="Consolas" w:hAnsi="Consolas" w:eastAsia="Consolas"/>
           <w:sz w:val="16"/>
         </w:rPr>
-        <w:t xml:space="preserve">  text_content: "textContent rendering"</w:t>
+        <w:t xml:space="preserve">    shape: diamond</w:t>
       </w:r>
     </w:p>
     <w:p>
@@ -3608,6 +4645,71 @@
           <w:rFonts w:ascii="Consolas" w:hAnsi="Consolas" w:eastAsia="Consolas"/>
           <w:sz w:val="16"/>
         </w:rPr>
+        <w:t xml:space="preserve">  }</w:t>
+      </w:r>
+    </w:p>
+    <w:p>
+      <w:pPr>
+        <w:spacing w:after="0"/>
+        <w:ind w:left="283"/>
+      </w:pPr>
+      <w:r>
+        <w:rPr>
+          <w:rFonts w:ascii="Consolas" w:hAnsi="Consolas" w:eastAsia="Consolas"/>
+          <w:sz w:val="16"/>
+        </w:rPr>
+        <w:t xml:space="preserve">  propagation: "Propagation: schema validator -&gt; maintenance service -&gt; authorization matrix"</w:t>
+      </w:r>
+    </w:p>
+    <w:p>
+      <w:pPr>
+        <w:spacing w:after="0"/>
+        <w:ind w:left="283"/>
+      </w:pPr>
+      <w:r>
+        <w:rPr>
+          <w:rFonts w:ascii="Consolas" w:hAnsi="Consolas" w:eastAsia="Consolas"/>
+          <w:sz w:val="16"/>
+        </w:rPr>
+        <w:t xml:space="preserve">  sink: "Sink: UPDATE of maintenance request status/assignment"</w:t>
+      </w:r>
+    </w:p>
+    <w:p>
+      <w:pPr>
+        <w:spacing w:after="0"/>
+        <w:ind w:left="283"/>
+      </w:pPr>
+      <w:r>
+        <w:rPr>
+          <w:rFonts w:ascii="Consolas" w:hAnsi="Consolas" w:eastAsia="Consolas"/>
+          <w:sz w:val="16"/>
+        </w:rPr>
+        <w:t xml:space="preserve">  protection: "Protection: role checks plus assigned/requester object checks before mutation"</w:t>
+      </w:r>
+    </w:p>
+    <w:p>
+      <w:pPr>
+        <w:spacing w:after="0"/>
+        <w:ind w:left="283"/>
+      </w:pPr>
+      <w:r>
+        <w:rPr>
+          <w:rFonts w:ascii="Consolas" w:hAnsi="Consolas" w:eastAsia="Consolas"/>
+          <w:sz w:val="16"/>
+        </w:rPr>
+        <w:t xml:space="preserve">  source -&gt; b1 -&gt; propagation -&gt; sink -&gt; protection</w:t>
+      </w:r>
+    </w:p>
+    <w:p>
+      <w:pPr>
+        <w:spacing w:after="0"/>
+        <w:ind w:left="283"/>
+      </w:pPr>
+      <w:r>
+        <w:rPr>
+          <w:rFonts w:ascii="Consolas" w:hAnsi="Consolas" w:eastAsia="Consolas"/>
+          <w:sz w:val="16"/>
+        </w:rPr>
         <w:t>}</w:t>
       </w:r>
     </w:p>
@@ -3633,7 +4735,7 @@
           <w:rFonts w:ascii="Consolas" w:hAnsi="Consolas" w:eastAsia="Consolas"/>
           <w:sz w:val="16"/>
         </w:rPr>
-        <w:t>sources.login -&gt; propagation.routes: "email/password"</w:t>
+        <w:t>f5_audit: {</w:t>
       </w:r>
     </w:p>
     <w:p>
@@ -3646,7 +4748,7 @@
           <w:rFonts w:ascii="Consolas" w:hAnsi="Consolas" w:eastAsia="Consolas"/>
           <w:sz w:val="16"/>
         </w:rPr>
-        <w:t>propagation.routes -&gt; sinks.auth: "credential verification"</w:t>
+        <w:t xml:space="preserve">  label: "F5. Server context to audit JSON sink"</w:t>
       </w:r>
     </w:p>
     <w:p>
@@ -3659,7 +4761,7 @@
           <w:rFonts w:ascii="Consolas" w:hAnsi="Consolas" w:eastAsia="Consolas"/>
           <w:sz w:val="16"/>
         </w:rPr>
-        <w:t>sinks.auth -&gt; protections.argon2</w:t>
+        <w:t xml:space="preserve">  direction: right</w:t>
       </w:r>
     </w:p>
     <w:p>
@@ -3672,7 +4774,7 @@
           <w:rFonts w:ascii="Consolas" w:hAnsi="Consolas" w:eastAsia="Consolas"/>
           <w:sz w:val="16"/>
         </w:rPr>
-        <w:t>sources.token -&gt; propagation.dependencies: "JWT"</w:t>
+        <w:t xml:space="preserve">  style.fill: "#EFFAF8"</w:t>
       </w:r>
     </w:p>
     <w:p>
@@ -3685,7 +4787,7 @@
           <w:rFonts w:ascii="Consolas" w:hAnsi="Consolas" w:eastAsia="Consolas"/>
           <w:sz w:val="16"/>
         </w:rPr>
-        <w:t>propagation.dependencies -&gt; propagation.authz</w:t>
+        <w:t xml:space="preserve">  source: "Source: server-side request context after authentication"</w:t>
       </w:r>
     </w:p>
     <w:p>
@@ -3698,7 +4800,7 @@
           <w:rFonts w:ascii="Consolas" w:hAnsi="Consolas" w:eastAsia="Consolas"/>
           <w:sz w:val="16"/>
         </w:rPr>
-        <w:t>propagation.authz -&gt; sinks.status_update</w:t>
+        <w:t xml:space="preserve">  propagation: "Propagation: route/service outcome -&gt; audit helper"</w:t>
       </w:r>
     </w:p>
     <w:p>
@@ -3711,7 +4813,7 @@
           <w:rFonts w:ascii="Consolas" w:hAnsi="Consolas" w:eastAsia="Consolas"/>
           <w:sz w:val="16"/>
         </w:rPr>
-        <w:t>sinks.status_update -&gt; protections.object_matrix</w:t>
+        <w:t xml:space="preserve">  sink: "Sink: audit_logs.details JSON"</w:t>
       </w:r>
     </w:p>
     <w:p>
@@ -3724,7 +4826,7 @@
           <w:rFonts w:ascii="Consolas" w:hAnsi="Consolas" w:eastAsia="Consolas"/>
           <w:sz w:val="16"/>
         </w:rPr>
-        <w:t>sources.params -&gt; propagation.schemas</w:t>
+        <w:t xml:space="preserve">  protection: "Protection: allowlisted event fields; no raw password or token values"</w:t>
       </w:r>
     </w:p>
     <w:p>
@@ -3737,7 +4839,7 @@
           <w:rFonts w:ascii="Consolas" w:hAnsi="Consolas" w:eastAsia="Consolas"/>
           <w:sz w:val="16"/>
         </w:rPr>
-        <w:t>propagation.schemas -&gt; propagation.services</w:t>
+        <w:t xml:space="preserve">  source -&gt; propagation -&gt; sink -&gt; protection</w:t>
       </w:r>
     </w:p>
     <w:p>
@@ -3750,7 +4852,7 @@
           <w:rFonts w:ascii="Consolas" w:hAnsi="Consolas" w:eastAsia="Consolas"/>
           <w:sz w:val="16"/>
         </w:rPr>
-        <w:t>propagation.services -&gt; sinks.db</w:t>
+        <w:t>}</w:t>
       </w:r>
     </w:p>
     <w:p>
@@ -3763,7 +4865,6 @@
           <w:rFonts w:ascii="Consolas" w:hAnsi="Consolas" w:eastAsia="Consolas"/>
           <w:sz w:val="16"/>
         </w:rPr>
-        <w:t>sinks.db -&gt; protections.orm_bounds</w:t>
       </w:r>
     </w:p>
     <w:p>
@@ -3776,7 +4877,7 @@
           <w:rFonts w:ascii="Consolas" w:hAnsi="Consolas" w:eastAsia="Consolas"/>
           <w:sz w:val="16"/>
         </w:rPr>
-        <w:t>sources.body -&gt; propagation.schemas: "status payload"</w:t>
+        <w:t>f6_response_dom: {</w:t>
       </w:r>
     </w:p>
     <w:p>
@@ -3789,7 +4890,7 @@
           <w:rFonts w:ascii="Consolas" w:hAnsi="Consolas" w:eastAsia="Consolas"/>
           <w:sz w:val="16"/>
         </w:rPr>
-        <w:t>sources.filters -&gt; propagation.routes</w:t>
+        <w:t xml:space="preserve">  label: "F6. Report response to untrusted DOM sink"</w:t>
       </w:r>
     </w:p>
     <w:p>
@@ -3802,7 +4903,7 @@
           <w:rFonts w:ascii="Consolas" w:hAnsi="Consolas" w:eastAsia="Consolas"/>
           <w:sz w:val="16"/>
         </w:rPr>
-        <w:t>propagation.services -&gt; sinks.report_json</w:t>
+        <w:t xml:space="preserve">  direction: right</w:t>
       </w:r>
     </w:p>
     <w:p>
@@ -3815,7 +4916,7 @@
           <w:rFonts w:ascii="Consolas" w:hAnsi="Consolas" w:eastAsia="Consolas"/>
           <w:sz w:val="16"/>
         </w:rPr>
-        <w:t>sinks.report_json -&gt; protections.response_models</w:t>
+        <w:t xml:space="preserve">  style.fill: "#EFFAF8"</w:t>
       </w:r>
     </w:p>
     <w:p>
@@ -3828,7 +4929,7 @@
           <w:rFonts w:ascii="Consolas" w:hAnsi="Consolas" w:eastAsia="Consolas"/>
           <w:sz w:val="16"/>
         </w:rPr>
-        <w:t>sinks.audit_json -&gt; protections.no_secret_logging</w:t>
+        <w:t xml:space="preserve">  source: "Source: server-side report/query result"</w:t>
       </w:r>
     </w:p>
     <w:p>
@@ -3841,7 +4942,7 @@
           <w:rFonts w:ascii="Consolas" w:hAnsi="Consolas" w:eastAsia="Consolas"/>
           <w:sz w:val="16"/>
         </w:rPr>
-        <w:t>sinks.report_json -&gt; sinks.dom</w:t>
+        <w:t xml:space="preserve">  propagation: "Propagation: response_model serializer"</w:t>
       </w:r>
     </w:p>
     <w:p>
@@ -3854,7 +4955,98 @@
           <w:rFonts w:ascii="Consolas" w:hAnsi="Consolas" w:eastAsia="Consolas"/>
           <w:sz w:val="16"/>
         </w:rPr>
-        <w:t>sinks.dom -&gt; protections.text_content</w:t>
+        <w:t xml:space="preserve">  b2: {</w:t>
+      </w:r>
+    </w:p>
+    <w:p>
+      <w:pPr>
+        <w:spacing w:after="0"/>
+        <w:ind w:left="283"/>
+      </w:pPr>
+      <w:r>
+        <w:rPr>
+          <w:rFonts w:ascii="Consolas" w:hAnsi="Consolas" w:eastAsia="Consolas"/>
+          <w:sz w:val="16"/>
+        </w:rPr>
+        <w:t xml:space="preserve">    label: "B2: JSON leaves server trust boundary"</w:t>
+      </w:r>
+    </w:p>
+    <w:p>
+      <w:pPr>
+        <w:spacing w:after="0"/>
+        <w:ind w:left="283"/>
+      </w:pPr>
+      <w:r>
+        <w:rPr>
+          <w:rFonts w:ascii="Consolas" w:hAnsi="Consolas" w:eastAsia="Consolas"/>
+          <w:sz w:val="16"/>
+        </w:rPr>
+        <w:t xml:space="preserve">    shape: diamond</w:t>
+      </w:r>
+    </w:p>
+    <w:p>
+      <w:pPr>
+        <w:spacing w:after="0"/>
+        <w:ind w:left="283"/>
+      </w:pPr>
+      <w:r>
+        <w:rPr>
+          <w:rFonts w:ascii="Consolas" w:hAnsi="Consolas" w:eastAsia="Consolas"/>
+          <w:sz w:val="16"/>
+        </w:rPr>
+        <w:t xml:space="preserve">  }</w:t>
+      </w:r>
+    </w:p>
+    <w:p>
+      <w:pPr>
+        <w:spacing w:after="0"/>
+        <w:ind w:left="283"/>
+      </w:pPr>
+      <w:r>
+        <w:rPr>
+          <w:rFonts w:ascii="Consolas" w:hAnsi="Consolas" w:eastAsia="Consolas"/>
+          <w:sz w:val="16"/>
+        </w:rPr>
+        <w:t xml:space="preserve">  sink: "Sink: browser DOM update"</w:t>
+      </w:r>
+    </w:p>
+    <w:p>
+      <w:pPr>
+        <w:spacing w:after="0"/>
+        <w:ind w:left="283"/>
+      </w:pPr>
+      <w:r>
+        <w:rPr>
+          <w:rFonts w:ascii="Consolas" w:hAnsi="Consolas" w:eastAsia="Consolas"/>
+          <w:sz w:val="16"/>
+        </w:rPr>
+        <w:t xml:space="preserve">  protection: "Protection: response_model filtering plus textContent rendering"</w:t>
+      </w:r>
+    </w:p>
+    <w:p>
+      <w:pPr>
+        <w:spacing w:after="0"/>
+        <w:ind w:left="283"/>
+      </w:pPr>
+      <w:r>
+        <w:rPr>
+          <w:rFonts w:ascii="Consolas" w:hAnsi="Consolas" w:eastAsia="Consolas"/>
+          <w:sz w:val="16"/>
+        </w:rPr>
+        <w:t xml:space="preserve">  source -&gt; propagation -&gt; b2 -&gt; sink -&gt; protection</w:t>
+      </w:r>
+    </w:p>
+    <w:p>
+      <w:pPr>
+        <w:spacing w:after="0"/>
+        <w:ind w:left="283"/>
+      </w:pPr>
+      <w:r>
+        <w:rPr>
+          <w:rFonts w:ascii="Consolas" w:hAnsi="Consolas" w:eastAsia="Consolas"/>
+          <w:sz w:val="16"/>
+        </w:rPr>
+        <w:t>}</w:t>
       </w:r>
     </w:p>
     <w:p>
@@ -4090,7 +5282,7 @@
                 <w:i w:val="0"/>
                 <w:sz w:val="16"/>
               </w:rPr>
-              <w:t>Password verification/token sink</w:t>
+              <w:t>Password verification and refresh token sinks</w:t>
             </w:r>
           </w:p>
         </w:tc>
@@ -4116,7 +5308,7 @@
                 <w:i w:val="0"/>
                 <w:sz w:val="16"/>
               </w:rPr>
-              <w:t>email and password</w:t>
+              <w:t>username/password form data</w:t>
             </w:r>
           </w:p>
         </w:tc>
@@ -4142,7 +5334,7 @@
                 <w:i w:val="0"/>
                 <w:sz w:val="16"/>
               </w:rPr>
-              <w:t>Argon2 verification, dummy hash for absent/inactive/locked user, neutral error.</w:t>
+              <w:t>Dummy Argon2 verification, neutral error, refresh token stored as hash.</w:t>
             </w:r>
           </w:p>
         </w:tc>
@@ -4196,7 +5388,7 @@
                 <w:i w:val="0"/>
                 <w:sz w:val="16"/>
               </w:rPr>
-              <w:t>Bearer token</w:t>
+              <w:t>Authorization header</w:t>
             </w:r>
           </w:p>
         </w:tc>
@@ -4222,7 +5414,7 @@
                 <w:i w:val="0"/>
                 <w:sz w:val="16"/>
               </w:rPr>
-              <w:t>Authorization decision</w:t>
+              <w:t>JWT dependency and authorization matrix</w:t>
             </w:r>
           </w:p>
         </w:tc>
@@ -4248,7 +5440,7 @@
                 <w:i w:val="0"/>
                 <w:sz w:val="16"/>
               </w:rPr>
-              <w:t>JWT claims and current user</w:t>
+              <w:t>bearer token and current user lookup</w:t>
             </w:r>
           </w:p>
         </w:tc>
@@ -4274,7 +5466,7 @@
                 <w:i w:val="0"/>
                 <w:sz w:val="16"/>
               </w:rPr>
-              <w:t>JWT validation, active user lookup, role/object matrix.</w:t>
+              <w:t>JWT validation, active user check, object-level authorization.</w:t>
             </w:r>
           </w:p>
         </w:tc>
@@ -4328,7 +5520,7 @@
                 <w:i w:val="0"/>
                 <w:sz w:val="16"/>
               </w:rPr>
-              <w:t>Query params</w:t>
+              <w:t>Path/query parameters</w:t>
             </w:r>
           </w:p>
         </w:tc>
@@ -4354,7 +5546,7 @@
                 <w:i w:val="0"/>
                 <w:sz w:val="16"/>
               </w:rPr>
-              <w:t>SQLAlchemy DB query</w:t>
+              <w:t>SQLAlchemy query sink</w:t>
             </w:r>
           </w:p>
         </w:tc>
@@ -4380,7 +5572,7 @@
                 <w:i w:val="0"/>
                 <w:sz w:val="16"/>
               </w:rPr>
-              <w:t>limit, offset, role/status filters</w:t>
+              <w:t>UUID, role/status filter, limit, offset</w:t>
             </w:r>
           </w:p>
         </w:tc>
@@ -4406,7 +5598,7 @@
                 <w:i w:val="0"/>
                 <w:sz w:val="16"/>
               </w:rPr>
-              <w:t>Typed enums, ge/le bounds, ORM expression API.</w:t>
+              <w:t>Pydantic/enum parsing, Query bounds, ORM expressions.</w:t>
             </w:r>
           </w:p>
         </w:tc>
@@ -4486,7 +5678,7 @@
                 <w:i w:val="0"/>
                 <w:sz w:val="16"/>
               </w:rPr>
-              <w:t>Maintenance status update</w:t>
+              <w:t>Maintenance status mutation sink</w:t>
             </w:r>
           </w:p>
         </w:tc>
@@ -4538,7 +5730,7 @@
                 <w:i w:val="0"/>
                 <w:sz w:val="16"/>
               </w:rPr>
-              <w:t>Pydantic validator and backend authorization check.</w:t>
+              <w:t>Pydantic validator plus server-side role/object transition check.</w:t>
             </w:r>
           </w:p>
         </w:tc>
@@ -4592,7 +5784,7 @@
                 <w:i w:val="0"/>
                 <w:sz w:val="16"/>
               </w:rPr>
-              <w:t>Request context</w:t>
+              <w:t>Server request context</w:t>
             </w:r>
           </w:p>
         </w:tc>
@@ -4618,7 +5810,7 @@
                 <w:i w:val="0"/>
                 <w:sz w:val="16"/>
               </w:rPr>
-              <w:t>Audit JSON details</w:t>
+              <w:t>Audit JSON sink</w:t>
             </w:r>
           </w:p>
         </w:tc>
@@ -4644,7 +5836,7 @@
                 <w:i w:val="0"/>
                 <w:sz w:val="16"/>
               </w:rPr>
-              <w:t>actor, action, entity, outcome</w:t>
+              <w:t>actor, action, entity, outcome, IP</w:t>
             </w:r>
           </w:p>
         </w:tc>
@@ -4670,7 +5862,7 @@
                 <w:i w:val="0"/>
                 <w:sz w:val="16"/>
               </w:rPr>
-              <w:t>Structured details without raw passwords or tokens.</w:t>
+              <w:t>Structured allowlisted fields; no passwords or tokens.</w:t>
             </w:r>
           </w:p>
         </w:tc>
@@ -4724,7 +5916,7 @@
                 <w:i w:val="0"/>
                 <w:sz w:val="16"/>
               </w:rPr>
-              <w:t>Report filters</w:t>
+              <w:t>Report response</w:t>
             </w:r>
           </w:p>
         </w:tc>
@@ -4750,7 +5942,7 @@
                 <w:i w:val="0"/>
                 <w:sz w:val="16"/>
               </w:rPr>
-              <w:t>Report JSON and frontend DOM</w:t>
+              <w:t>Browser DOM sink</w:t>
             </w:r>
           </w:p>
         </w:tc>
@@ -4776,7 +5968,7 @@
                 <w:i w:val="0"/>
                 <w:sz w:val="16"/>
               </w:rPr>
-              <w:t>summary rows and status counts</w:t>
+              <w:t>maintenance summary rows and counts</w:t>
             </w:r>
           </w:p>
         </w:tc>
@@ -4802,7 +5994,7 @@
                 <w:i w:val="0"/>
                 <w:sz w:val="16"/>
               </w:rPr>
-              <w:t>Role-protected report endpoint, response_model, textContent rendering.</w:t>
+              <w:t>Role-protected report, response_model filtering, textContent rendering.</w:t>
             </w:r>
           </w:p>
         </w:tc>
@@ -6286,7 +7478,7 @@
           <w:rFonts w:ascii="Consolas" w:hAnsi="Consolas" w:eastAsia="Consolas"/>
           <w:sz w:val="16"/>
         </w:rPr>
-        <w:t>login: "1. Login request"</w:t>
+        <w:t>request: "Incoming protected API request"</w:t>
       </w:r>
     </w:p>
     <w:p>
@@ -6299,7 +7491,7 @@
           <w:rFonts w:ascii="Consolas" w:hAnsi="Consolas" w:eastAsia="Consolas"/>
           <w:sz w:val="16"/>
         </w:rPr>
-        <w:t>authn: "2. Authentication: active user and password hash"</w:t>
+        <w:t>authn_check: {</w:t>
       </w:r>
     </w:p>
     <w:p>
@@ -6312,7 +7504,7 @@
           <w:rFonts w:ascii="Consolas" w:hAnsi="Consolas" w:eastAsia="Consolas"/>
           <w:sz w:val="16"/>
         </w:rPr>
-        <w:t>token: "3. Access token issued"</w:t>
+        <w:t xml:space="preserve">  label: "Authenticated and active user?"</w:t>
       </w:r>
     </w:p>
     <w:p>
@@ -6325,7 +7517,7 @@
           <w:rFonts w:ascii="Consolas" w:hAnsi="Consolas" w:eastAsia="Consolas"/>
           <w:sz w:val="16"/>
         </w:rPr>
-        <w:t>load: "4. Load current user and request object"</w:t>
+        <w:t xml:space="preserve">  shape: diamond</w:t>
       </w:r>
     </w:p>
     <w:p>
@@ -6338,7 +7530,7 @@
           <w:rFonts w:ascii="Consolas" w:hAnsi="Consolas" w:eastAsia="Consolas"/>
           <w:sz w:val="16"/>
         </w:rPr>
-        <w:t>assign: "5. Supervisor assigns engineer"</w:t>
+        <w:t>}</w:t>
       </w:r>
     </w:p>
     <w:p>
@@ -6351,7 +7543,7 @@
           <w:rFonts w:ascii="Consolas" w:hAnsi="Consolas" w:eastAsia="Consolas"/>
           <w:sz w:val="16"/>
         </w:rPr>
-        <w:t>engineer_check: {</w:t>
+        <w:t>deny_401: {</w:t>
       </w:r>
     </w:p>
     <w:p>
@@ -6364,7 +7556,7 @@
           <w:rFonts w:ascii="Consolas" w:hAnsi="Consolas" w:eastAsia="Consolas"/>
           <w:sz w:val="16"/>
         </w:rPr>
-        <w:t xml:space="preserve">  label: "6. Actor is assigned engineer?"</w:t>
+        <w:t xml:space="preserve">  label: "401 Unauthorized"</w:t>
       </w:r>
     </w:p>
     <w:p>
@@ -6377,6 +7569,71 @@
           <w:rFonts w:ascii="Consolas" w:hAnsi="Consolas" w:eastAsia="Consolas"/>
           <w:sz w:val="16"/>
         </w:rPr>
+        <w:t xml:space="preserve">  shape: hexagon</w:t>
+      </w:r>
+    </w:p>
+    <w:p>
+      <w:pPr>
+        <w:spacing w:after="0"/>
+        <w:ind w:left="283"/>
+      </w:pPr>
+      <w:r>
+        <w:rPr>
+          <w:rFonts w:ascii="Consolas" w:hAnsi="Consolas" w:eastAsia="Consolas"/>
+          <w:sz w:val="16"/>
+        </w:rPr>
+        <w:t>}</w:t>
+      </w:r>
+    </w:p>
+    <w:p>
+      <w:pPr>
+        <w:spacing w:after="0"/>
+        <w:ind w:left="283"/>
+      </w:pPr>
+      <w:r>
+        <w:rPr>
+          <w:rFonts w:ascii="Consolas" w:hAnsi="Consolas" w:eastAsia="Consolas"/>
+          <w:sz w:val="16"/>
+        </w:rPr>
+        <w:t>load_context: "Load current user, role, DB session, target object"</w:t>
+      </w:r>
+    </w:p>
+    <w:p>
+      <w:pPr>
+        <w:spacing w:after="0"/>
+        <w:ind w:left="283"/>
+      </w:pPr>
+      <w:r>
+        <w:rPr>
+          <w:rFonts w:ascii="Consolas" w:hAnsi="Consolas" w:eastAsia="Consolas"/>
+          <w:sz w:val="16"/>
+        </w:rPr>
+        <w:t>action: {</w:t>
+      </w:r>
+    </w:p>
+    <w:p>
+      <w:pPr>
+        <w:spacing w:after="0"/>
+        <w:ind w:left="283"/>
+      </w:pPr>
+      <w:r>
+        <w:rPr>
+          <w:rFonts w:ascii="Consolas" w:hAnsi="Consolas" w:eastAsia="Consolas"/>
+          <w:sz w:val="16"/>
+        </w:rPr>
+        <w:t xml:space="preserve">  label: "Requested action"</w:t>
+      </w:r>
+    </w:p>
+    <w:p>
+      <w:pPr>
+        <w:spacing w:after="0"/>
+        <w:ind w:left="283"/>
+      </w:pPr>
+      <w:r>
+        <w:rPr>
+          <w:rFonts w:ascii="Consolas" w:hAnsi="Consolas" w:eastAsia="Consolas"/>
+          <w:sz w:val="16"/>
+        </w:rPr>
         <w:t xml:space="preserve">  shape: diamond</w:t>
       </w:r>
     </w:p>
@@ -6403,7 +7660,6 @@
           <w:rFonts w:ascii="Consolas" w:hAnsi="Consolas" w:eastAsia="Consolas"/>
           <w:sz w:val="16"/>
         </w:rPr>
-        <w:t>start: "7. Move assigned request to in_progress"</w:t>
       </w:r>
     </w:p>
     <w:p>
@@ -6416,7 +7672,7 @@
           <w:rFonts w:ascii="Consolas" w:hAnsi="Consolas" w:eastAsia="Consolas"/>
           <w:sz w:val="16"/>
         </w:rPr>
-        <w:t>complete: "8. Move assigned request to completed"</w:t>
+        <w:t>assign_cancel: "Assign engineer or cancel request"</w:t>
       </w:r>
     </w:p>
     <w:p>
@@ -6429,7 +7685,7 @@
           <w:rFonts w:ascii="Consolas" w:hAnsi="Consolas" w:eastAsia="Consolas"/>
           <w:sz w:val="16"/>
         </w:rPr>
-        <w:t>audit: "9. Audit event and report data"</w:t>
+        <w:t>privileged_check: {</w:t>
       </w:r>
     </w:p>
     <w:p>
@@ -6442,7 +7698,7 @@
           <w:rFonts w:ascii="Consolas" w:hAnsi="Consolas" w:eastAsia="Consolas"/>
           <w:sz w:val="16"/>
         </w:rPr>
-        <w:t>deny: {</w:t>
+        <w:t xml:space="preserve">  label: "Role is supervisor or technical_admin?"</w:t>
       </w:r>
     </w:p>
     <w:p>
@@ -6455,6 +7711,353 @@
           <w:rFonts w:ascii="Consolas" w:hAnsi="Consolas" w:eastAsia="Consolas"/>
           <w:sz w:val="16"/>
         </w:rPr>
+        <w:t xml:space="preserve">  shape: diamond</w:t>
+      </w:r>
+    </w:p>
+    <w:p>
+      <w:pPr>
+        <w:spacing w:after="0"/>
+        <w:ind w:left="283"/>
+      </w:pPr>
+      <w:r>
+        <w:rPr>
+          <w:rFonts w:ascii="Consolas" w:hAnsi="Consolas" w:eastAsia="Consolas"/>
+          <w:sz w:val="16"/>
+        </w:rPr>
+        <w:t>}</w:t>
+      </w:r>
+    </w:p>
+    <w:p>
+      <w:pPr>
+        <w:spacing w:after="0"/>
+        <w:ind w:left="283"/>
+      </w:pPr>
+      <w:r>
+        <w:rPr>
+          <w:rFonts w:ascii="Consolas" w:hAnsi="Consolas" w:eastAsia="Consolas"/>
+          <w:sz w:val="16"/>
+        </w:rPr>
+        <w:t>allow_assign: "Allow assign/cancel"</w:t>
+      </w:r>
+    </w:p>
+    <w:p>
+      <w:pPr>
+        <w:spacing w:after="0"/>
+        <w:ind w:left="283"/>
+      </w:pPr>
+      <w:r>
+        <w:rPr>
+          <w:rFonts w:ascii="Consolas" w:hAnsi="Consolas" w:eastAsia="Consolas"/>
+          <w:sz w:val="16"/>
+        </w:rPr>
+      </w:r>
+    </w:p>
+    <w:p>
+      <w:pPr>
+        <w:spacing w:after="0"/>
+        <w:ind w:left="283"/>
+      </w:pPr>
+      <w:r>
+        <w:rPr>
+          <w:rFonts w:ascii="Consolas" w:hAnsi="Consolas" w:eastAsia="Consolas"/>
+          <w:sz w:val="16"/>
+        </w:rPr>
+        <w:t>start_complete: "Start or complete maintenance work"</w:t>
+      </w:r>
+    </w:p>
+    <w:p>
+      <w:pPr>
+        <w:spacing w:after="0"/>
+        <w:ind w:left="283"/>
+      </w:pPr>
+      <w:r>
+        <w:rPr>
+          <w:rFonts w:ascii="Consolas" w:hAnsi="Consolas" w:eastAsia="Consolas"/>
+          <w:sz w:val="16"/>
+        </w:rPr>
+        <w:t>assigned_check: {</w:t>
+      </w:r>
+    </w:p>
+    <w:p>
+      <w:pPr>
+        <w:spacing w:after="0"/>
+        <w:ind w:left="283"/>
+      </w:pPr>
+      <w:r>
+        <w:rPr>
+          <w:rFonts w:ascii="Consolas" w:hAnsi="Consolas" w:eastAsia="Consolas"/>
+          <w:sz w:val="16"/>
+        </w:rPr>
+        <w:t xml:space="preserve">  label: "Actor is assigned engineer?"</w:t>
+      </w:r>
+    </w:p>
+    <w:p>
+      <w:pPr>
+        <w:spacing w:after="0"/>
+        <w:ind w:left="283"/>
+      </w:pPr>
+      <w:r>
+        <w:rPr>
+          <w:rFonts w:ascii="Consolas" w:hAnsi="Consolas" w:eastAsia="Consolas"/>
+          <w:sz w:val="16"/>
+        </w:rPr>
+        <w:t xml:space="preserve">  shape: diamond</w:t>
+      </w:r>
+    </w:p>
+    <w:p>
+      <w:pPr>
+        <w:spacing w:after="0"/>
+        <w:ind w:left="283"/>
+      </w:pPr>
+      <w:r>
+        <w:rPr>
+          <w:rFonts w:ascii="Consolas" w:hAnsi="Consolas" w:eastAsia="Consolas"/>
+          <w:sz w:val="16"/>
+        </w:rPr>
+        <w:t>}</w:t>
+      </w:r>
+    </w:p>
+    <w:p>
+      <w:pPr>
+        <w:spacing w:after="0"/>
+        <w:ind w:left="283"/>
+      </w:pPr>
+      <w:r>
+        <w:rPr>
+          <w:rFonts w:ascii="Consolas" w:hAnsi="Consolas" w:eastAsia="Consolas"/>
+          <w:sz w:val="16"/>
+        </w:rPr>
+        <w:t>allow_work: "Allow in_progress/completed"</w:t>
+      </w:r>
+    </w:p>
+    <w:p>
+      <w:pPr>
+        <w:spacing w:after="0"/>
+        <w:ind w:left="283"/>
+      </w:pPr>
+      <w:r>
+        <w:rPr>
+          <w:rFonts w:ascii="Consolas" w:hAnsi="Consolas" w:eastAsia="Consolas"/>
+          <w:sz w:val="16"/>
+        </w:rPr>
+      </w:r>
+    </w:p>
+    <w:p>
+      <w:pPr>
+        <w:spacing w:after="0"/>
+        <w:ind w:left="283"/>
+      </w:pPr>
+      <w:r>
+        <w:rPr>
+          <w:rFonts w:ascii="Consolas" w:hAnsi="Consolas" w:eastAsia="Consolas"/>
+          <w:sz w:val="16"/>
+        </w:rPr>
+        <w:t>requester_cancel: "Requester cancels own open request"</w:t>
+      </w:r>
+    </w:p>
+    <w:p>
+      <w:pPr>
+        <w:spacing w:after="0"/>
+        <w:ind w:left="283"/>
+      </w:pPr>
+      <w:r>
+        <w:rPr>
+          <w:rFonts w:ascii="Consolas" w:hAnsi="Consolas" w:eastAsia="Consolas"/>
+          <w:sz w:val="16"/>
+        </w:rPr>
+        <w:t>requester_check: {</w:t>
+      </w:r>
+    </w:p>
+    <w:p>
+      <w:pPr>
+        <w:spacing w:after="0"/>
+        <w:ind w:left="283"/>
+      </w:pPr>
+      <w:r>
+        <w:rPr>
+          <w:rFonts w:ascii="Consolas" w:hAnsi="Consolas" w:eastAsia="Consolas"/>
+          <w:sz w:val="16"/>
+        </w:rPr>
+        <w:t xml:space="preserve">  label: "Requester owns open unassigned request?"</w:t>
+      </w:r>
+    </w:p>
+    <w:p>
+      <w:pPr>
+        <w:spacing w:after="0"/>
+        <w:ind w:left="283"/>
+      </w:pPr>
+      <w:r>
+        <w:rPr>
+          <w:rFonts w:ascii="Consolas" w:hAnsi="Consolas" w:eastAsia="Consolas"/>
+          <w:sz w:val="16"/>
+        </w:rPr>
+        <w:t xml:space="preserve">  shape: diamond</w:t>
+      </w:r>
+    </w:p>
+    <w:p>
+      <w:pPr>
+        <w:spacing w:after="0"/>
+        <w:ind w:left="283"/>
+      </w:pPr>
+      <w:r>
+        <w:rPr>
+          <w:rFonts w:ascii="Consolas" w:hAnsi="Consolas" w:eastAsia="Consolas"/>
+          <w:sz w:val="16"/>
+        </w:rPr>
+        <w:t>}</w:t>
+      </w:r>
+    </w:p>
+    <w:p>
+      <w:pPr>
+        <w:spacing w:after="0"/>
+        <w:ind w:left="283"/>
+      </w:pPr>
+      <w:r>
+        <w:rPr>
+          <w:rFonts w:ascii="Consolas" w:hAnsi="Consolas" w:eastAsia="Consolas"/>
+          <w:sz w:val="16"/>
+        </w:rPr>
+        <w:t>allow_requester_cancel: "Allow cancel"</w:t>
+      </w:r>
+    </w:p>
+    <w:p>
+      <w:pPr>
+        <w:spacing w:after="0"/>
+        <w:ind w:left="283"/>
+      </w:pPr>
+      <w:r>
+        <w:rPr>
+          <w:rFonts w:ascii="Consolas" w:hAnsi="Consolas" w:eastAsia="Consolas"/>
+          <w:sz w:val="16"/>
+        </w:rPr>
+      </w:r>
+    </w:p>
+    <w:p>
+      <w:pPr>
+        <w:spacing w:after="0"/>
+        <w:ind w:left="283"/>
+      </w:pPr>
+      <w:r>
+        <w:rPr>
+          <w:rFonts w:ascii="Consolas" w:hAnsi="Consolas" w:eastAsia="Consolas"/>
+          <w:sz w:val="16"/>
+        </w:rPr>
+        <w:t>directory: "User directory request"</w:t>
+      </w:r>
+    </w:p>
+    <w:p>
+      <w:pPr>
+        <w:spacing w:after="0"/>
+        <w:ind w:left="283"/>
+      </w:pPr>
+      <w:r>
+        <w:rPr>
+          <w:rFonts w:ascii="Consolas" w:hAnsi="Consolas" w:eastAsia="Consolas"/>
+          <w:sz w:val="16"/>
+        </w:rPr>
+        <w:t>directory_role: {</w:t>
+      </w:r>
+    </w:p>
+    <w:p>
+      <w:pPr>
+        <w:spacing w:after="0"/>
+        <w:ind w:left="283"/>
+      </w:pPr>
+      <w:r>
+        <w:rPr>
+          <w:rFonts w:ascii="Consolas" w:hAnsi="Consolas" w:eastAsia="Consolas"/>
+          <w:sz w:val="16"/>
+        </w:rPr>
+        <w:t xml:space="preserve">  label: "Directory role scope"</w:t>
+      </w:r>
+    </w:p>
+    <w:p>
+      <w:pPr>
+        <w:spacing w:after="0"/>
+        <w:ind w:left="283"/>
+      </w:pPr>
+      <w:r>
+        <w:rPr>
+          <w:rFonts w:ascii="Consolas" w:hAnsi="Consolas" w:eastAsia="Consolas"/>
+          <w:sz w:val="16"/>
+        </w:rPr>
+        <w:t xml:space="preserve">  shape: diamond</w:t>
+      </w:r>
+    </w:p>
+    <w:p>
+      <w:pPr>
+        <w:spacing w:after="0"/>
+        <w:ind w:left="283"/>
+      </w:pPr>
+      <w:r>
+        <w:rPr>
+          <w:rFonts w:ascii="Consolas" w:hAnsi="Consolas" w:eastAsia="Consolas"/>
+          <w:sz w:val="16"/>
+        </w:rPr>
+        <w:t>}</w:t>
+      </w:r>
+    </w:p>
+    <w:p>
+      <w:pPr>
+        <w:spacing w:after="0"/>
+        <w:ind w:left="283"/>
+      </w:pPr>
+      <w:r>
+        <w:rPr>
+          <w:rFonts w:ascii="Consolas" w:hAnsi="Consolas" w:eastAsia="Consolas"/>
+          <w:sz w:val="16"/>
+        </w:rPr>
+        <w:t>engineer_only: "Supervisor: force engineer-only directory"</w:t>
+      </w:r>
+    </w:p>
+    <w:p>
+      <w:pPr>
+        <w:spacing w:after="0"/>
+        <w:ind w:left="283"/>
+      </w:pPr>
+      <w:r>
+        <w:rPr>
+          <w:rFonts w:ascii="Consolas" w:hAnsi="Consolas" w:eastAsia="Consolas"/>
+          <w:sz w:val="16"/>
+        </w:rPr>
+        <w:t>admin_all: "Technical admin: allow all roles"</w:t>
+      </w:r>
+    </w:p>
+    <w:p>
+      <w:pPr>
+        <w:spacing w:after="0"/>
+        <w:ind w:left="283"/>
+      </w:pPr>
+      <w:r>
+        <w:rPr>
+          <w:rFonts w:ascii="Consolas" w:hAnsi="Consolas" w:eastAsia="Consolas"/>
+          <w:sz w:val="16"/>
+        </w:rPr>
+      </w:r>
+    </w:p>
+    <w:p>
+      <w:pPr>
+        <w:spacing w:after="0"/>
+        <w:ind w:left="283"/>
+      </w:pPr>
+      <w:r>
+        <w:rPr>
+          <w:rFonts w:ascii="Consolas" w:hAnsi="Consolas" w:eastAsia="Consolas"/>
+          <w:sz w:val="16"/>
+        </w:rPr>
+        <w:t>deny_403: {</w:t>
+      </w:r>
+    </w:p>
+    <w:p>
+      <w:pPr>
+        <w:spacing w:after="0"/>
+        <w:ind w:left="283"/>
+      </w:pPr>
+      <w:r>
+        <w:rPr>
+          <w:rFonts w:ascii="Consolas" w:hAnsi="Consolas" w:eastAsia="Consolas"/>
+          <w:sz w:val="16"/>
+        </w:rPr>
         <w:t xml:space="preserve">  label: "403 Forbidden"</w:t>
       </w:r>
     </w:p>
@@ -6494,7 +8097,7 @@
           <w:rFonts w:ascii="Consolas" w:hAnsi="Consolas" w:eastAsia="Consolas"/>
           <w:sz w:val="16"/>
         </w:rPr>
-        <w:t>directory_check: {</w:t>
+        <w:t>audit: "Audit operation result"</w:t>
       </w:r>
     </w:p>
     <w:p>
@@ -6507,7 +8110,7 @@
           <w:rFonts w:ascii="Consolas" w:hAnsi="Consolas" w:eastAsia="Consolas"/>
           <w:sz w:val="16"/>
         </w:rPr>
-        <w:t xml:space="preserve">  label: "Directory access requested?"</w:t>
+        <w:t>response: "Return filtered response_model"</w:t>
       </w:r>
     </w:p>
     <w:p>
@@ -6520,7 +8123,6 @@
           <w:rFonts w:ascii="Consolas" w:hAnsi="Consolas" w:eastAsia="Consolas"/>
           <w:sz w:val="16"/>
         </w:rPr>
-        <w:t xml:space="preserve">  shape: diamond</w:t>
       </w:r>
     </w:p>
     <w:p>
@@ -6533,7 +8135,7 @@
           <w:rFonts w:ascii="Consolas" w:hAnsi="Consolas" w:eastAsia="Consolas"/>
           <w:sz w:val="16"/>
         </w:rPr>
-        <w:t>}</w:t>
+        <w:t>request -&gt; authn_check</w:t>
       </w:r>
     </w:p>
     <w:p>
@@ -6546,7 +8148,7 @@
           <w:rFonts w:ascii="Consolas" w:hAnsi="Consolas" w:eastAsia="Consolas"/>
           <w:sz w:val="16"/>
         </w:rPr>
-        <w:t>engineer_directory: "Engineer-only directory"</w:t>
+        <w:t>authn_check -&gt; deny_401: "no"</w:t>
       </w:r>
     </w:p>
     <w:p>
@@ -6559,7 +8161,7 @@
           <w:rFonts w:ascii="Consolas" w:hAnsi="Consolas" w:eastAsia="Consolas"/>
           <w:sz w:val="16"/>
         </w:rPr>
-        <w:t>full_directory: "Full role directory"</w:t>
+        <w:t>authn_check -&gt; load_context: "yes"</w:t>
       </w:r>
     </w:p>
     <w:p>
@@ -6572,6 +8174,7 @@
           <w:rFonts w:ascii="Consolas" w:hAnsi="Consolas" w:eastAsia="Consolas"/>
           <w:sz w:val="16"/>
         </w:rPr>
+        <w:t>load_context -&gt; action</w:t>
       </w:r>
     </w:p>
     <w:p>
@@ -6584,7 +8187,7 @@
           <w:rFonts w:ascii="Consolas" w:hAnsi="Consolas" w:eastAsia="Consolas"/>
           <w:sz w:val="16"/>
         </w:rPr>
-        <w:t>login -&gt; authn</w:t>
+        <w:t>action -&gt; assign_cancel: "assign/cancel"</w:t>
       </w:r>
     </w:p>
     <w:p>
@@ -6597,7 +8200,7 @@
           <w:rFonts w:ascii="Consolas" w:hAnsi="Consolas" w:eastAsia="Consolas"/>
           <w:sz w:val="16"/>
         </w:rPr>
-        <w:t>authn -&gt; token</w:t>
+        <w:t>assign_cancel -&gt; privileged_check</w:t>
       </w:r>
     </w:p>
     <w:p>
@@ -6610,7 +8213,7 @@
           <w:rFonts w:ascii="Consolas" w:hAnsi="Consolas" w:eastAsia="Consolas"/>
           <w:sz w:val="16"/>
         </w:rPr>
-        <w:t>token -&gt; load</w:t>
+        <w:t>privileged_check -&gt; allow_assign: "yes"</w:t>
       </w:r>
     </w:p>
     <w:p>
@@ -6623,7 +8226,7 @@
           <w:rFonts w:ascii="Consolas" w:hAnsi="Consolas" w:eastAsia="Consolas"/>
           <w:sz w:val="16"/>
         </w:rPr>
-        <w:t>load -&gt; assign</w:t>
+        <w:t>privileged_check -&gt; deny_403: "no"</w:t>
       </w:r>
     </w:p>
     <w:p>
@@ -6636,7 +8239,7 @@
           <w:rFonts w:ascii="Consolas" w:hAnsi="Consolas" w:eastAsia="Consolas"/>
           <w:sz w:val="16"/>
         </w:rPr>
-        <w:t>assign -&gt; engineer_check</w:t>
+        <w:t>action -&gt; start_complete: "start/complete"</w:t>
       </w:r>
     </w:p>
     <w:p>
@@ -6649,7 +8252,7 @@
           <w:rFonts w:ascii="Consolas" w:hAnsi="Consolas" w:eastAsia="Consolas"/>
           <w:sz w:val="16"/>
         </w:rPr>
-        <w:t>engineer_check -&gt; start: "yes"</w:t>
+        <w:t>start_complete -&gt; assigned_check</w:t>
       </w:r>
     </w:p>
     <w:p>
@@ -6662,7 +8265,7 @@
           <w:rFonts w:ascii="Consolas" w:hAnsi="Consolas" w:eastAsia="Consolas"/>
           <w:sz w:val="16"/>
         </w:rPr>
-        <w:t>start -&gt; complete</w:t>
+        <w:t>assigned_check -&gt; allow_work: "yes"</w:t>
       </w:r>
     </w:p>
     <w:p>
@@ -6675,7 +8278,7 @@
           <w:rFonts w:ascii="Consolas" w:hAnsi="Consolas" w:eastAsia="Consolas"/>
           <w:sz w:val="16"/>
         </w:rPr>
-        <w:t>complete -&gt; audit</w:t>
+        <w:t>assigned_check -&gt; deny_403: "no: supervisor/admin is not assigned engineer"</w:t>
       </w:r>
     </w:p>
     <w:p>
@@ -6688,7 +8291,7 @@
           <w:rFonts w:ascii="Consolas" w:hAnsi="Consolas" w:eastAsia="Consolas"/>
           <w:sz w:val="16"/>
         </w:rPr>
-        <w:t>engineer_check -&gt; deny: "no: supervisor/admin attempts start or complete"</w:t>
+        <w:t>action -&gt; requester_cancel: "cancel own open request"</w:t>
       </w:r>
     </w:p>
     <w:p>
@@ -6701,7 +8304,7 @@
           <w:rFonts w:ascii="Consolas" w:hAnsi="Consolas" w:eastAsia="Consolas"/>
           <w:sz w:val="16"/>
         </w:rPr>
-        <w:t>deny -&gt; audit</w:t>
+        <w:t>requester_cancel -&gt; requester_check</w:t>
       </w:r>
     </w:p>
     <w:p>
@@ -6714,7 +8317,7 @@
           <w:rFonts w:ascii="Consolas" w:hAnsi="Consolas" w:eastAsia="Consolas"/>
           <w:sz w:val="16"/>
         </w:rPr>
-        <w:t>load -&gt; directory_check</w:t>
+        <w:t>requester_check -&gt; allow_requester_cancel: "yes"</w:t>
       </w:r>
     </w:p>
     <w:p>
@@ -6727,7 +8330,7 @@
           <w:rFonts w:ascii="Consolas" w:hAnsi="Consolas" w:eastAsia="Consolas"/>
           <w:sz w:val="16"/>
         </w:rPr>
-        <w:t>directory_check -&gt; engineer_directory: "supervisor"</w:t>
+        <w:t>requester_check -&gt; deny_403: "no"</w:t>
       </w:r>
     </w:p>
     <w:p>
@@ -6740,7 +8343,150 @@
           <w:rFonts w:ascii="Consolas" w:hAnsi="Consolas" w:eastAsia="Consolas"/>
           <w:sz w:val="16"/>
         </w:rPr>
-        <w:t>directory_check -&gt; full_directory: "technical_admin"</w:t>
+        <w:t>action -&gt; directory: "list users"</w:t>
+      </w:r>
+    </w:p>
+    <w:p>
+      <w:pPr>
+        <w:spacing w:after="0"/>
+        <w:ind w:left="283"/>
+      </w:pPr>
+      <w:r>
+        <w:rPr>
+          <w:rFonts w:ascii="Consolas" w:hAnsi="Consolas" w:eastAsia="Consolas"/>
+          <w:sz w:val="16"/>
+        </w:rPr>
+        <w:t>directory -&gt; directory_role</w:t>
+      </w:r>
+    </w:p>
+    <w:p>
+      <w:pPr>
+        <w:spacing w:after="0"/>
+        <w:ind w:left="283"/>
+      </w:pPr>
+      <w:r>
+        <w:rPr>
+          <w:rFonts w:ascii="Consolas" w:hAnsi="Consolas" w:eastAsia="Consolas"/>
+          <w:sz w:val="16"/>
+        </w:rPr>
+        <w:t>directory_role -&gt; engineer_only: "supervisor"</w:t>
+      </w:r>
+    </w:p>
+    <w:p>
+      <w:pPr>
+        <w:spacing w:after="0"/>
+        <w:ind w:left="283"/>
+      </w:pPr>
+      <w:r>
+        <w:rPr>
+          <w:rFonts w:ascii="Consolas" w:hAnsi="Consolas" w:eastAsia="Consolas"/>
+          <w:sz w:val="16"/>
+        </w:rPr>
+        <w:t>directory_role -&gt; admin_all: "technical_admin"</w:t>
+      </w:r>
+    </w:p>
+    <w:p>
+      <w:pPr>
+        <w:spacing w:after="0"/>
+        <w:ind w:left="283"/>
+      </w:pPr>
+      <w:r>
+        <w:rPr>
+          <w:rFonts w:ascii="Consolas" w:hAnsi="Consolas" w:eastAsia="Consolas"/>
+          <w:sz w:val="16"/>
+        </w:rPr>
+        <w:t>directory_role -&gt; deny_403: "engineer or disallowed role filter"</w:t>
+      </w:r>
+    </w:p>
+    <w:p>
+      <w:pPr>
+        <w:spacing w:after="0"/>
+        <w:ind w:left="283"/>
+      </w:pPr>
+      <w:r>
+        <w:rPr>
+          <w:rFonts w:ascii="Consolas" w:hAnsi="Consolas" w:eastAsia="Consolas"/>
+          <w:sz w:val="16"/>
+        </w:rPr>
+        <w:t>allow_assign -&gt; audit</w:t>
+      </w:r>
+    </w:p>
+    <w:p>
+      <w:pPr>
+        <w:spacing w:after="0"/>
+        <w:ind w:left="283"/>
+      </w:pPr>
+      <w:r>
+        <w:rPr>
+          <w:rFonts w:ascii="Consolas" w:hAnsi="Consolas" w:eastAsia="Consolas"/>
+          <w:sz w:val="16"/>
+        </w:rPr>
+        <w:t>allow_work -&gt; audit</w:t>
+      </w:r>
+    </w:p>
+    <w:p>
+      <w:pPr>
+        <w:spacing w:after="0"/>
+        <w:ind w:left="283"/>
+      </w:pPr>
+      <w:r>
+        <w:rPr>
+          <w:rFonts w:ascii="Consolas" w:hAnsi="Consolas" w:eastAsia="Consolas"/>
+          <w:sz w:val="16"/>
+        </w:rPr>
+        <w:t>allow_requester_cancel -&gt; audit</w:t>
+      </w:r>
+    </w:p>
+    <w:p>
+      <w:pPr>
+        <w:spacing w:after="0"/>
+        <w:ind w:left="283"/>
+      </w:pPr>
+      <w:r>
+        <w:rPr>
+          <w:rFonts w:ascii="Consolas" w:hAnsi="Consolas" w:eastAsia="Consolas"/>
+          <w:sz w:val="16"/>
+        </w:rPr>
+        <w:t>engineer_only -&gt; response</w:t>
+      </w:r>
+    </w:p>
+    <w:p>
+      <w:pPr>
+        <w:spacing w:after="0"/>
+        <w:ind w:left="283"/>
+      </w:pPr>
+      <w:r>
+        <w:rPr>
+          <w:rFonts w:ascii="Consolas" w:hAnsi="Consolas" w:eastAsia="Consolas"/>
+          <w:sz w:val="16"/>
+        </w:rPr>
+        <w:t>admin_all -&gt; response</w:t>
+      </w:r>
+    </w:p>
+    <w:p>
+      <w:pPr>
+        <w:spacing w:after="0"/>
+        <w:ind w:left="283"/>
+      </w:pPr>
+      <w:r>
+        <w:rPr>
+          <w:rFonts w:ascii="Consolas" w:hAnsi="Consolas" w:eastAsia="Consolas"/>
+          <w:sz w:val="16"/>
+        </w:rPr>
+        <w:t>audit -&gt; response</w:t>
+      </w:r>
+    </w:p>
+    <w:p>
+      <w:pPr>
+        <w:spacing w:after="0"/>
+        <w:ind w:left="283"/>
+      </w:pPr>
+      <w:r>
+        <w:rPr>
+          <w:rFonts w:ascii="Consolas" w:hAnsi="Consolas" w:eastAsia="Consolas"/>
+          <w:sz w:val="16"/>
+        </w:rPr>
+        <w:t>deny_403 -&gt; audit</w:t>
       </w:r>
     </w:p>
     <w:p>
@@ -6950,7 +8696,7 @@
                 <w:i w:val="0"/>
                 <w:sz w:val="16"/>
               </w:rPr>
-              <w:t>Login request</w:t>
+              <w:t>Protected API request</w:t>
             </w:r>
           </w:p>
         </w:tc>
@@ -6976,7 +8722,7 @@
                 <w:i w:val="0"/>
                 <w:sz w:val="16"/>
               </w:rPr>
-              <w:t>Authentication service</w:t>
+              <w:t>Authentication decision</w:t>
             </w:r>
           </w:p>
         </w:tc>
@@ -7002,7 +8748,7 @@
                 <w:i w:val="0"/>
                 <w:sz w:val="16"/>
               </w:rPr>
-              <w:t>email and password</w:t>
+              <w:t>Bearer token and active user state</w:t>
             </w:r>
           </w:p>
         </w:tc>
@@ -7028,7 +8774,7 @@
                 <w:i w:val="0"/>
                 <w:sz w:val="16"/>
               </w:rPr>
-              <w:t>Password hash verification, dummy hash path, neutral error.</w:t>
+              <w:t>Missing/invalid/inactive user returns 401 before object logic.</w:t>
             </w:r>
           </w:p>
         </w:tc>
@@ -7082,7 +8828,7 @@
                 <w:i w:val="0"/>
                 <w:sz w:val="16"/>
               </w:rPr>
-              <w:t>Access token</w:t>
+              <w:t>Authenticated context</w:t>
             </w:r>
           </w:p>
         </w:tc>
@@ -7108,7 +8854,7 @@
                 <w:i w:val="0"/>
                 <w:sz w:val="16"/>
               </w:rPr>
-              <w:t>Current user dependency</w:t>
+              <w:t>Assign/cancel decision</w:t>
             </w:r>
           </w:p>
         </w:tc>
@@ -7134,7 +8880,7 @@
                 <w:i w:val="0"/>
                 <w:sz w:val="16"/>
               </w:rPr>
-              <w:t>Bearer token</w:t>
+              <w:t>role and requested transition</w:t>
             </w:r>
           </w:p>
         </w:tc>
@@ -7160,7 +8906,7 @@
                 <w:i w:val="0"/>
                 <w:sz w:val="16"/>
               </w:rPr>
-              <w:t>JWT validation and active user lookup.</w:t>
+              <w:t>Supervisor or technical_admin may assign/cancel; engineer cannot assign.</w:t>
             </w:r>
           </w:p>
         </w:tc>
@@ -7214,7 +8960,7 @@
                 <w:i w:val="0"/>
                 <w:sz w:val="16"/>
               </w:rPr>
-              <w:t>Supervisor</w:t>
+              <w:t>Authenticated context</w:t>
             </w:r>
           </w:p>
         </w:tc>
@@ -7240,7 +8986,7 @@
                 <w:i w:val="0"/>
                 <w:sz w:val="16"/>
               </w:rPr>
-              <w:t>Assigned request</w:t>
+              <w:t>Start/complete decision</w:t>
             </w:r>
           </w:p>
         </w:tc>
@@ -7266,7 +9012,7 @@
                 <w:i w:val="0"/>
                 <w:sz w:val="16"/>
               </w:rPr>
-              <w:t>assign engineer action</w:t>
+              <w:t>actor id and assigned_engineer_id</w:t>
             </w:r>
           </w:p>
         </w:tc>
@@ -7292,7 +9038,7 @@
                 <w:i w:val="0"/>
                 <w:sz w:val="16"/>
               </w:rPr>
-              <w:t>Privileged assign/cancel allowed by role check.</w:t>
+              <w:t>Only assigned engineer can move work to in_progress/completed.</w:t>
             </w:r>
           </w:p>
         </w:tc>
@@ -7346,7 +9092,7 @@
                 <w:i w:val="0"/>
                 <w:sz w:val="16"/>
               </w:rPr>
-              <w:t>Assigned engineer</w:t>
+              <w:t>Requester cancel path</w:t>
             </w:r>
           </w:p>
         </w:tc>
@@ -7372,7 +9118,7 @@
                 <w:i w:val="0"/>
                 <w:sz w:val="16"/>
               </w:rPr>
-              <w:t>Status transition</w:t>
+              <w:t>Cancel decision</w:t>
             </w:r>
           </w:p>
         </w:tc>
@@ -7398,7 +9144,7 @@
                 <w:i w:val="0"/>
                 <w:sz w:val="16"/>
               </w:rPr>
-              <w:t>in_progress and completed</w:t>
+              <w:t>requested_by_id, open status, assigned_engineer_id</w:t>
             </w:r>
           </w:p>
         </w:tc>
@@ -7424,7 +9170,7 @@
                 <w:i w:val="0"/>
                 <w:sz w:val="16"/>
               </w:rPr>
-              <w:t>Object-level check: actor id equals assigned_engineer_id.</w:t>
+              <w:t>Requester can cancel only own open unassigned request.</w:t>
             </w:r>
           </w:p>
         </w:tc>
@@ -7478,7 +9224,7 @@
                 <w:i w:val="0"/>
                 <w:sz w:val="16"/>
               </w:rPr>
-              <w:t>Supervisor/admin</w:t>
+              <w:t>User directory request</w:t>
             </w:r>
           </w:p>
         </w:tc>
@@ -7504,7 +9250,7 @@
                 <w:i w:val="0"/>
                 <w:sz w:val="16"/>
               </w:rPr>
-              <w:t>Forbidden status transition</w:t>
+              <w:t>Directory scope decision</w:t>
             </w:r>
           </w:p>
         </w:tc>
@@ -7530,7 +9276,7 @@
                 <w:i w:val="0"/>
                 <w:sz w:val="16"/>
               </w:rPr>
-              <w:t>start/complete attempt</w:t>
+              <w:t>current role and role filter</w:t>
             </w:r>
           </w:p>
         </w:tc>
@@ -7556,7 +9302,7 @@
                 <w:i w:val="0"/>
                 <w:sz w:val="16"/>
               </w:rPr>
-              <w:t>HTTP 403 because privileged role is not assigned engineer.</w:t>
+              <w:t>Supervisor forced to engineers; technical_admin can list all roles; invalid scope returns 403.</w:t>
             </w:r>
           </w:p>
         </w:tc>
@@ -7610,7 +9356,7 @@
                 <w:i w:val="0"/>
                 <w:sz w:val="16"/>
               </w:rPr>
-              <w:t>Directory request</w:t>
+              <w:t>Allowed or denied decision</w:t>
             </w:r>
           </w:p>
         </w:tc>
@@ -7636,7 +9382,7 @@
                 <w:i w:val="0"/>
                 <w:sz w:val="16"/>
               </w:rPr>
-              <w:t>User listing response</w:t>
+              <w:t>Audit and response</w:t>
             </w:r>
           </w:p>
         </w:tc>
@@ -7662,7 +9408,7 @@
                 <w:i w:val="0"/>
                 <w:sz w:val="16"/>
               </w:rPr>
-              <w:t>role filter</w:t>
+              <w:t>operation outcome</w:t>
             </w:r>
           </w:p>
         </w:tc>
@@ -7688,7 +9434,7 @@
                 <w:i w:val="0"/>
                 <w:sz w:val="16"/>
               </w:rPr>
-              <w:t>Supervisor forced to engineer scope; technical admin can list all roles.</w:t>
+              <w:t>Allowed changes are audited and serialized; forbidden paths return controlled 403.</w:t>
             </w:r>
           </w:p>
         </w:tc>

</xml_diff>